<commit_message>
Update БТ_Диспетчеризация_ACTUAL.docx by raz0reater_666 (309462378)
</commit_message>
<xml_diff>
--- a/docs/БТ_Диспетчеризация_ACTUAL.docx
+++ b/docs/БТ_Диспетчеризация_ACTUAL.docx
@@ -1,6 +1,6 @@
 
 <file path=word/document.xml><?xml version="1.0" encoding="utf-8"?>
-<w:document xmlns:wpc="http://schemas.microsoft.com/office/word/2010/wordprocessingCanvas" xmlns:cx="http://schemas.microsoft.com/office/drawing/2014/chartex" xmlns:cx1="http://schemas.microsoft.com/office/drawing/2015/9/8/chartex" xmlns:cx2="http://schemas.microsoft.com/office/drawing/2015/10/21/chartex" xmlns:cx3="http://schemas.microsoft.com/office/drawing/2016/5/9/chartex" xmlns:cx4="http://schemas.microsoft.com/office/drawing/2016/5/10/chartex" xmlns:cx5="http://schemas.microsoft.com/office/drawing/2016/5/11/chartex" xmlns:cx6="http://schemas.microsoft.com/office/drawing/2016/5/12/chartex" xmlns:cx7="http://schemas.microsoft.com/office/drawing/2016/5/13/chartex" xmlns:cx8="http://schemas.microsoft.com/office/drawing/2016/5/14/chartex" xmlns:mc="http://schemas.openxmlformats.org/markup-compatibility/2006" xmlns:aink="http://schemas.microsoft.com/office/drawing/2016/ink" xmlns:am3d="http://schemas.microsoft.com/office/drawing/2017/model3d" xmlns:o="urn:schemas-microsoft-com:office:office" xmlns:oel="http://schemas.microsoft.com/office/2019/extlst" xmlns:r="http://schemas.openxmlformats.org/officeDocument/2006/relationships" xmlns:m="http://schemas.openxmlformats.org/officeDocument/2006/math" xmlns:v="urn:schemas-microsoft-com:vml" xmlns:wp14="http://schemas.microsoft.com/office/word/2010/wordprocessingDrawing" xmlns:wp="http://schemas.openxmlformats.org/drawingml/2006/wordprocessingDrawing" xmlns:w10="urn:schemas-microsoft-com:office:word" xmlns:w="http://schemas.openxmlformats.org/wordprocessingml/2006/main" xmlns:w14="http://schemas.microsoft.com/office/word/2010/wordml" xmlns:w15="http://schemas.microsoft.com/office/word/2012/wordml" xmlns:w16cex="http://schemas.microsoft.com/office/word/2018/wordml/cex" xmlns:w16cid="http://schemas.microsoft.com/office/word/2016/wordml/cid" xmlns:w16="http://schemas.microsoft.com/office/word/2018/wordml" xmlns:w16sdtdh="http://schemas.microsoft.com/office/word/2020/wordml/sdtdatahash" xmlns:w16se="http://schemas.microsoft.com/office/word/2015/wordml/symex" xmlns:wpg="http://schemas.microsoft.com/office/word/2010/wordprocessingGroup" xmlns:wpi="http://schemas.microsoft.com/office/word/2010/wordprocessingInk" xmlns:wne="http://schemas.microsoft.com/office/word/2006/wordml" xmlns:wps="http://schemas.microsoft.com/office/word/2010/wordprocessingShape" mc:Ignorable="w14 w15 w16se w16cid w16 w16cex w16sdtdh wp14">
+<w:document xmlns:wpc="http://schemas.microsoft.com/office/word/2010/wordprocessingCanvas" xmlns:cx="http://schemas.microsoft.com/office/drawing/2014/chartex" xmlns:cx1="http://schemas.microsoft.com/office/drawing/2015/9/8/chartex" xmlns:cx2="http://schemas.microsoft.com/office/drawing/2015/10/21/chartex" xmlns:cx3="http://schemas.microsoft.com/office/drawing/2016/5/9/chartex" xmlns:cx4="http://schemas.microsoft.com/office/drawing/2016/5/10/chartex" xmlns:cx5="http://schemas.microsoft.com/office/drawing/2016/5/11/chartex" xmlns:cx6="http://schemas.microsoft.com/office/drawing/2016/5/12/chartex" xmlns:cx7="http://schemas.microsoft.com/office/drawing/2016/5/13/chartex" xmlns:cx8="http://schemas.microsoft.com/office/drawing/2016/5/14/chartex" xmlns:mc="http://schemas.openxmlformats.org/markup-compatibility/2006" xmlns:aink="http://schemas.microsoft.com/office/drawing/2016/ink" xmlns:am3d="http://schemas.microsoft.com/office/drawing/2017/model3d" xmlns:o="urn:schemas-microsoft-com:office:office" xmlns:r="http://schemas.openxmlformats.org/officeDocument/2006/relationships" xmlns:m="http://schemas.openxmlformats.org/officeDocument/2006/math" xmlns:v="urn:schemas-microsoft-com:vml" xmlns:wp14="http://schemas.microsoft.com/office/word/2010/wordprocessingDrawing" xmlns:wp="http://schemas.openxmlformats.org/drawingml/2006/wordprocessingDrawing" xmlns:w10="urn:schemas-microsoft-com:office:word" xmlns:w="http://schemas.openxmlformats.org/wordprocessingml/2006/main" xmlns:w14="http://schemas.microsoft.com/office/word/2010/wordml" xmlns:w15="http://schemas.microsoft.com/office/word/2012/wordml" xmlns:w16cid="http://schemas.microsoft.com/office/word/2016/wordml/cid" xmlns:w16se="http://schemas.microsoft.com/office/word/2015/wordml/symex" xmlns:wpg="http://schemas.microsoft.com/office/word/2010/wordprocessingGroup" xmlns:wpi="http://schemas.microsoft.com/office/word/2010/wordprocessingInk" xmlns:wne="http://schemas.microsoft.com/office/word/2006/wordml" xmlns:wps="http://schemas.microsoft.com/office/word/2010/wordprocessingShape" mc:Ignorable="w14 w15 w16se w16cid wp14">
   <w:body>
     <w:tbl>
       <w:tblPr>
@@ -185,6 +185,15 @@
               </w:rPr>
               <w:t xml:space="preserve"> </w:t>
             </w:r>
+            <w:r>
+              <w:rPr>
+                <w:b/>
+                <w:sz w:val="40"/>
+              </w:rPr>
+              <w:t xml:space="preserve">  аываыв</w:t>
+            </w:r>
+            <w:bookmarkStart w:id="3" w:name="_GoBack"/>
+            <w:bookmarkEnd w:id="3"/>
           </w:p>
         </w:tc>
       </w:tr>
@@ -454,27 +463,9 @@
             <w:pPr>
               <w:pStyle w:val="ATableBody"/>
             </w:pPr>
-            <w:proofErr w:type="spellStart"/>
-            <w:r>
-              <w:t>Первый</w:t>
-            </w:r>
-            <w:proofErr w:type="spellEnd"/>
-            <w:r>
-              <w:t xml:space="preserve"> </w:t>
-            </w:r>
-            <w:proofErr w:type="spellStart"/>
-            <w:r>
-              <w:t>драфт</w:t>
-            </w:r>
-            <w:proofErr w:type="spellEnd"/>
-            <w:r>
-              <w:t xml:space="preserve"> </w:t>
-            </w:r>
-            <w:proofErr w:type="spellStart"/>
-            <w:r>
-              <w:t>документа</w:t>
-            </w:r>
-            <w:proofErr w:type="spellEnd"/>
+            <w:r>
+              <w:t>Первый драфт документа</w:t>
+            </w:r>
           </w:p>
         </w:tc>
         <w:tc>
@@ -809,19 +800,9 @@
             <w:pPr>
               <w:pStyle w:val="ATableBody"/>
             </w:pPr>
-            <w:proofErr w:type="spellStart"/>
-            <w:r>
-              <w:t>Функциональное</w:t>
-            </w:r>
-            <w:proofErr w:type="spellEnd"/>
-            <w:r>
-              <w:t xml:space="preserve"> </w:t>
-            </w:r>
-            <w:proofErr w:type="spellStart"/>
-            <w:r>
-              <w:t>требование</w:t>
-            </w:r>
-            <w:proofErr w:type="spellEnd"/>
+            <w:r>
+              <w:t>Функциональное требование</w:t>
+            </w:r>
           </w:p>
         </w:tc>
       </w:tr>
@@ -847,19 +828,9 @@
             <w:pPr>
               <w:pStyle w:val="ATableBody"/>
             </w:pPr>
-            <w:proofErr w:type="spellStart"/>
-            <w:r>
-              <w:t>Роль</w:t>
-            </w:r>
-            <w:proofErr w:type="spellEnd"/>
-            <w:r>
-              <w:t xml:space="preserve"> </w:t>
-            </w:r>
-            <w:proofErr w:type="spellStart"/>
-            <w:r>
-              <w:t>реагирования</w:t>
-            </w:r>
-            <w:proofErr w:type="spellEnd"/>
+            <w:r>
+              <w:t>Роль реагирования</w:t>
+            </w:r>
           </w:p>
         </w:tc>
       </w:tr>
@@ -885,19 +856,9 @@
             <w:pPr>
               <w:pStyle w:val="ATableBody"/>
             </w:pPr>
-            <w:proofErr w:type="spellStart"/>
-            <w:r>
-              <w:t>Функциональная</w:t>
-            </w:r>
-            <w:proofErr w:type="spellEnd"/>
-            <w:r>
-              <w:t xml:space="preserve"> </w:t>
-            </w:r>
-            <w:proofErr w:type="spellStart"/>
-            <w:r>
-              <w:t>структура</w:t>
-            </w:r>
-            <w:proofErr w:type="spellEnd"/>
+            <w:r>
+              <w:t>Функциональная структура</w:t>
+            </w:r>
           </w:p>
         </w:tc>
       </w:tr>
@@ -923,19 +884,9 @@
             <w:pPr>
               <w:pStyle w:val="ATableBody"/>
             </w:pPr>
-            <w:proofErr w:type="spellStart"/>
-            <w:r>
-              <w:t>Протокол</w:t>
-            </w:r>
-            <w:proofErr w:type="spellEnd"/>
-            <w:r>
-              <w:t xml:space="preserve"> </w:t>
-            </w:r>
-            <w:proofErr w:type="spellStart"/>
-            <w:r>
-              <w:t>реагирования</w:t>
-            </w:r>
-            <w:proofErr w:type="spellEnd"/>
+            <w:r>
+              <w:t>Протокол реагирования</w:t>
+            </w:r>
           </w:p>
         </w:tc>
       </w:tr>
@@ -961,19 +912,9 @@
             <w:pPr>
               <w:pStyle w:val="ATableBody"/>
             </w:pPr>
-            <w:proofErr w:type="spellStart"/>
-            <w:r>
-              <w:t>Экранная</w:t>
-            </w:r>
-            <w:proofErr w:type="spellEnd"/>
-            <w:r>
-              <w:t xml:space="preserve"> </w:t>
-            </w:r>
-            <w:proofErr w:type="spellStart"/>
-            <w:r>
-              <w:t>форма</w:t>
-            </w:r>
-            <w:proofErr w:type="spellEnd"/>
+            <w:r>
+              <w:t>Экранная форма</w:t>
+            </w:r>
           </w:p>
         </w:tc>
       </w:tr>
@@ -999,19 +940,9 @@
             <w:pPr>
               <w:pStyle w:val="ATableBody"/>
             </w:pPr>
-            <w:proofErr w:type="spellStart"/>
-            <w:r>
-              <w:t>Техническое</w:t>
-            </w:r>
-            <w:proofErr w:type="spellEnd"/>
-            <w:r>
-              <w:t xml:space="preserve"> </w:t>
-            </w:r>
-            <w:proofErr w:type="spellStart"/>
-            <w:r>
-              <w:t>задание</w:t>
-            </w:r>
-            <w:proofErr w:type="spellEnd"/>
+            <w:r>
+              <w:t>Техническое задание</w:t>
+            </w:r>
           </w:p>
         </w:tc>
       </w:tr>
@@ -1024,19 +955,9 @@
             <w:pPr>
               <w:pStyle w:val="ATableBody"/>
             </w:pPr>
-            <w:proofErr w:type="spellStart"/>
-            <w:r>
-              <w:t>Протокол</w:t>
-            </w:r>
-            <w:proofErr w:type="spellEnd"/>
-            <w:r>
-              <w:t xml:space="preserve"> </w:t>
-            </w:r>
-            <w:proofErr w:type="spellStart"/>
-            <w:r>
-              <w:t>реагирования</w:t>
-            </w:r>
-            <w:proofErr w:type="spellEnd"/>
+            <w:r>
+              <w:t>Протокол реагирования</w:t>
+            </w:r>
           </w:p>
         </w:tc>
         <w:tc>
@@ -1104,19 +1025,9 @@
             <w:pPr>
               <w:pStyle w:val="ATableBody"/>
             </w:pPr>
-            <w:proofErr w:type="spellStart"/>
-            <w:r>
-              <w:t>Шаг</w:t>
-            </w:r>
-            <w:proofErr w:type="spellEnd"/>
-            <w:r>
-              <w:t xml:space="preserve"> </w:t>
-            </w:r>
-            <w:proofErr w:type="spellStart"/>
-            <w:r>
-              <w:t>протокола</w:t>
-            </w:r>
-            <w:proofErr w:type="spellEnd"/>
+            <w:r>
+              <w:t>Шаг протокола</w:t>
+            </w:r>
           </w:p>
         </w:tc>
         <w:tc>
@@ -1339,15 +1250,7 @@
         <w:t>правки в документе</w:t>
       </w:r>
       <w:r>
-        <w:t xml:space="preserve"> </w:t>
-      </w:r>
-      <w:proofErr w:type="gramStart"/>
-      <w:r>
-        <w:t>в по</w:t>
-      </w:r>
-      <w:proofErr w:type="gramEnd"/>
-      <w:r>
-        <w:t xml:space="preserve"> пунктам или конкретные части текста</w:t>
+        <w:t xml:space="preserve"> в по пунктам или конкретные части текста</w:t>
       </w:r>
       <w:r>
         <w:t xml:space="preserve">, которые необходимо </w:t>
@@ -2206,7 +2109,7 @@
           <w:lang w:val="ru-RU"/>
         </w:rPr>
       </w:pPr>
-      <w:bookmarkStart w:id="3" w:name="_Ref74731275"/>
+      <w:bookmarkStart w:id="4" w:name="_Ref74731275"/>
     </w:p>
     <w:p>
       <w:pPr>
@@ -2919,19 +2822,19 @@
         </w:rPr>
         <w:t xml:space="preserve">Через </w:t>
       </w:r>
-      <w:commentRangeStart w:id="4"/>
+      <w:commentRangeStart w:id="5"/>
       <w:r>
         <w:rPr>
           <w:highlight w:val="yellow"/>
         </w:rPr>
         <w:t>экранную</w:t>
       </w:r>
-      <w:commentRangeEnd w:id="4"/>
+      <w:commentRangeEnd w:id="5"/>
       <w:r>
         <w:rPr>
           <w:rStyle w:val="af4"/>
         </w:rPr>
-        <w:commentReference w:id="4"/>
+        <w:commentReference w:id="5"/>
       </w:r>
       <w:r>
         <w:rPr>
@@ -3174,21 +3077,7 @@
         <w:rPr>
           <w:highlight w:val="darkGray"/>
         </w:rPr>
-        <w:t xml:space="preserve">Через экранную форму «Администрирование </w:t>
-      </w:r>
-      <w:proofErr w:type="spellStart"/>
-      <w:r>
-        <w:rPr>
-          <w:highlight w:val="darkGray"/>
-        </w:rPr>
-        <w:t>оргстуктуры</w:t>
-      </w:r>
-      <w:proofErr w:type="spellEnd"/>
-      <w:r>
-        <w:rPr>
-          <w:highlight w:val="darkGray"/>
-        </w:rPr>
-        <w:t xml:space="preserve">» создается обособленная организационная структура. </w:t>
+        <w:t xml:space="preserve">Через экранную форму «Администрирование оргстуктуры» создается обособленная организационная структура. </w:t>
       </w:r>
     </w:p>
     <w:p>
@@ -3262,21 +3151,7 @@
         <w:rPr>
           <w:highlight w:val="darkGray"/>
         </w:rPr>
-        <w:t xml:space="preserve">Через экранную форму «Администрирование </w:t>
-      </w:r>
-      <w:proofErr w:type="spellStart"/>
-      <w:r>
-        <w:rPr>
-          <w:highlight w:val="darkGray"/>
-        </w:rPr>
-        <w:t>оргструктуры</w:t>
-      </w:r>
-      <w:proofErr w:type="spellEnd"/>
-      <w:r>
-        <w:rPr>
-          <w:highlight w:val="darkGray"/>
-        </w:rPr>
-        <w:t>» роли реагирования привязываются к элементам организационной структуры с типом «Подразделение»</w:t>
+        <w:t>Через экранную форму «Администрирование оргструктуры» роли реагирования привязываются к элементам организационной структуры с типом «Подразделение»</w:t>
       </w:r>
     </w:p>
     <w:p>
@@ -3380,35 +3255,7 @@
         <w:rPr>
           <w:highlight w:val="darkGray"/>
         </w:rPr>
-        <w:t xml:space="preserve">Эскалация шага зависит от </w:t>
-      </w:r>
-      <w:proofErr w:type="spellStart"/>
-      <w:r>
-        <w:rPr>
-          <w:highlight w:val="darkGray"/>
-        </w:rPr>
-        <w:t>оргструктуры</w:t>
-      </w:r>
-      <w:proofErr w:type="spellEnd"/>
-      <w:r>
-        <w:rPr>
-          <w:highlight w:val="darkGray"/>
-        </w:rPr>
-        <w:t xml:space="preserve">: каждое подразделение должно иметь свой блок для приёма </w:t>
-      </w:r>
-      <w:proofErr w:type="spellStart"/>
-      <w:r>
-        <w:rPr>
-          <w:highlight w:val="darkGray"/>
-        </w:rPr>
-        <w:t>эскалационных</w:t>
-      </w:r>
-      <w:proofErr w:type="spellEnd"/>
-      <w:r>
-        <w:rPr>
-          <w:highlight w:val="darkGray"/>
-        </w:rPr>
-        <w:t xml:space="preserve"> запросов. Автоматическая эскалация по уровню иерархии неприменима — в метро она может быть горизонтальной.</w:t>
+        <w:t>Эскалация шага зависит от оргструктуры: каждое подразделение должно иметь свой блок для приёма эскалационных запросов. Автоматическая эскалация по уровню иерархии неприменима — в метро она может быть горизонтальной.</w:t>
       </w:r>
     </w:p>
     <w:p>
@@ -3763,22 +3610,14 @@
         <w:rPr>
           <w:highlight w:val="darkGray"/>
         </w:rPr>
-        <w:t xml:space="preserve">Шаблон не привязан к конкретному протоколу реагирования, срабатывает </w:t>
-      </w:r>
-      <w:proofErr w:type="gramStart"/>
+        <w:t xml:space="preserve">Шаблон не привязан к конкретному протоколу реагирования, срабатывает при </w:t>
+      </w:r>
       <w:r>
         <w:rPr>
           <w:highlight w:val="darkGray"/>
         </w:rPr>
-        <w:t xml:space="preserve">при </w:t>
-      </w:r>
-      <w:r>
-        <w:rPr>
-          <w:highlight w:val="darkGray"/>
-        </w:rPr>
         <w:t>ННР</w:t>
       </w:r>
-      <w:proofErr w:type="gramEnd"/>
       <w:r>
         <w:rPr>
           <w:highlight w:val="darkGray"/>
@@ -3791,45 +3630,25 @@
         <w:pStyle w:val="affd"/>
         <w:ind w:left="1080"/>
       </w:pPr>
-      <w:bookmarkStart w:id="5" w:name="_Toc417053636"/>
-      <w:bookmarkEnd w:id="3"/>
+      <w:bookmarkStart w:id="6" w:name="_Toc417053636"/>
+      <w:bookmarkEnd w:id="4"/>
       <w:r>
         <w:rPr>
           <w:i/>
           <w:iCs/>
           <w:highlight w:val="darkGray"/>
         </w:rPr>
-        <w:t xml:space="preserve">Шаблон исключений для нестандартной инфраструктуры представляет собой специально разработанный план мероприятий, предусматривающий порядок действий в случае возникновения нештатных ситуаций с конкретным объектом. Особенность такого плана заключается в том, что он рассчитан на сценарии, не охватываемые стандартными процедурами </w:t>
-      </w:r>
-      <w:proofErr w:type="spellStart"/>
-      <w:proofErr w:type="gramStart"/>
+        <w:t>Шаблон исключений для нестандартной инфраструктуры представляет собой специально разработанный план мероприятий, предусматривающий порядок действий в случае возникновения нештатных ситуаций с конкретным объектом. Особенность такого плана заключается в том, что он рассчитан на сценарии, не охватываемые стандартными процедурами реагирования.</w:t>
+      </w:r>
       <w:r>
         <w:rPr>
           <w:i/>
           <w:iCs/>
           <w:highlight w:val="darkGray"/>
         </w:rPr>
-        <w:t>реагирования.</w:t>
-      </w:r>
-      <w:r>
-        <w:rPr>
-          <w:i/>
-          <w:iCs/>
-          <w:highlight w:val="darkGray"/>
-        </w:rPr>
-        <w:t>Требования</w:t>
-      </w:r>
-      <w:proofErr w:type="spellEnd"/>
-      <w:proofErr w:type="gramEnd"/>
-      <w:r>
-        <w:rPr>
-          <w:i/>
-          <w:iCs/>
-          <w:highlight w:val="darkGray"/>
-        </w:rPr>
-        <w:t xml:space="preserve"> к реализации</w:t>
-      </w:r>
-      <w:bookmarkEnd w:id="5"/>
+        <w:t>Требования к реализации</w:t>
+      </w:r>
+      <w:bookmarkEnd w:id="6"/>
     </w:p>
     <w:p/>
     <w:p/>
@@ -4218,13 +4037,8 @@
           </w:tcPr>
           <w:p>
             <w:r>
-              <w:t xml:space="preserve">Полный (отмена действий других пользователей, отмена статуса выполнения шагов, пропуск шагов, переназначение ролей, просмотр материалов, редактирование полученной информации, выдача приказов/ инструкций, создание/ редактирование </w:t>
-            </w:r>
-            <w:proofErr w:type="gramStart"/>
-            <w:r>
-              <w:t>протоколов )</w:t>
-            </w:r>
-            <w:proofErr w:type="gramEnd"/>
+              <w:t>Полный (отмена действий других пользователей, отмена статуса выполнения шагов, пропуск шагов, переназначение ролей, просмотр материалов, редактирование полученной информации, выдача приказов/ инструкций, создание/ редактирование протоколов )</w:t>
+            </w:r>
           </w:p>
         </w:tc>
       </w:tr>
@@ -4267,13 +4081,8 @@
           </w:tcPr>
           <w:p>
             <w:r>
-              <w:t>Частичный (редактирование информации которую пишет пользователь, выдача приказов/</w:t>
-            </w:r>
-            <w:proofErr w:type="gramStart"/>
-            <w:r>
-              <w:t>инструкций,  )</w:t>
-            </w:r>
-            <w:proofErr w:type="gramEnd"/>
+              <w:t>Частичный (редактирование информации которую пишет пользователь, выдача приказов/инструкций,  )</w:t>
+            </w:r>
           </w:p>
         </w:tc>
       </w:tr>
@@ -4315,13 +4124,8 @@
             <w:hideMark/>
           </w:tcPr>
           <w:p>
-            <w:proofErr w:type="gramStart"/>
-            <w:r>
-              <w:t>Частичный(</w:t>
-            </w:r>
-            <w:proofErr w:type="gramEnd"/>
-            <w:r>
-              <w:t>полный доступ на просмотр информации, без возможности совершать действия )</w:t>
+            <w:r>
+              <w:t>Частичный(полный доступ на просмотр информации, без возможности совершать действия )</w:t>
             </w:r>
           </w:p>
         </w:tc>
@@ -4465,25 +4269,7 @@
               <w:t xml:space="preserve"> </w:t>
             </w:r>
             <w:r>
-              <w:t xml:space="preserve">(создание/редактирование/удаление протоколов, добавление новый ролей/ пользователей/ веток </w:t>
-            </w:r>
-            <w:proofErr w:type="spellStart"/>
-            <w:proofErr w:type="gramStart"/>
-            <w:r>
-              <w:t>орг.структуры</w:t>
-            </w:r>
-            <w:proofErr w:type="spellEnd"/>
-            <w:proofErr w:type="gramEnd"/>
-            <w:r>
-              <w:t xml:space="preserve">, удаление ролей/пользователей/веток </w:t>
-            </w:r>
-            <w:proofErr w:type="spellStart"/>
-            <w:r>
-              <w:t>орг.структуры</w:t>
-            </w:r>
-            <w:proofErr w:type="spellEnd"/>
-            <w:r>
-              <w:t>,  )</w:t>
+              <w:t>(создание/редактирование/удаление протоколов, добавление новый ролей/ пользователей/ веток орг.структуры, удаление ролей/пользователей/веток орг.структуры,  )</w:t>
             </w:r>
           </w:p>
         </w:tc>
@@ -5098,25 +4884,7 @@
                 <w:sz w:val="20"/>
                 <w:szCs w:val="20"/>
               </w:rPr>
-              <w:t>шаблона протокола, старой версии присваивается статус «</w:t>
-            </w:r>
-            <w:proofErr w:type="gramStart"/>
-            <w:r>
-              <w:rPr>
-                <w:color w:val="000000"/>
-                <w:sz w:val="20"/>
-                <w:szCs w:val="20"/>
-              </w:rPr>
-              <w:t>Архив»  системой</w:t>
-            </w:r>
-            <w:proofErr w:type="gramEnd"/>
-            <w:r>
-              <w:rPr>
-                <w:color w:val="000000"/>
-                <w:sz w:val="20"/>
-                <w:szCs w:val="20"/>
-              </w:rPr>
-              <w:t xml:space="preserve"> автоматически, если новая версия переходит в статус «Активен»</w:t>
+              <w:t>шаблона протокола, старой версии присваивается статус «Архив»  системой автоматически, если новая версия переходит в статус «Активен»</w:t>
             </w:r>
             <w:r>
               <w:rPr>
@@ -5157,8 +4925,8 @@
       <w:pPr>
         <w:pStyle w:val="22"/>
       </w:pPr>
-      <w:bookmarkStart w:id="6" w:name="_Карточка_шаблона_протокола"/>
-      <w:bookmarkEnd w:id="6"/>
+      <w:bookmarkStart w:id="7" w:name="_Карточка_шаблона_протокола"/>
+      <w:bookmarkEnd w:id="7"/>
       <w:r>
         <w:t xml:space="preserve">Карточка </w:t>
       </w:r>
@@ -5231,7 +4999,7 @@
       <w:pPr>
         <w:pStyle w:val="a3"/>
         <w:sectPr>
-          <w:footerReference w:type="first" r:id="rId14"/>
+          <w:footerReference w:type="first" r:id="rId13"/>
           <w:pgSz w:w="16701" w:h="16838"/>
           <w:pgMar w:top="1134" w:right="5646" w:bottom="1134" w:left="1701" w:header="709" w:footer="709" w:gutter="0"/>
           <w:cols w:space="708"/>
@@ -5247,8 +5015,7 @@
           <w:highlight w:val="darkGray"/>
         </w:rPr>
       </w:pPr>
-      <w:bookmarkStart w:id="7" w:name="_Ref158630370"/>
-      <w:proofErr w:type="gramStart"/>
+      <w:bookmarkStart w:id="8" w:name="_Ref158630370"/>
       <w:r>
         <w:rPr>
           <w:highlight w:val="darkGray"/>
@@ -5262,7 +5029,7 @@
         </w:rPr>
         <w:t xml:space="preserve"> </w:t>
       </w:r>
-      <w:bookmarkEnd w:id="7"/>
+      <w:bookmarkEnd w:id="8"/>
       <w:r>
         <w:rPr>
           <w:highlight w:val="darkGray"/>
@@ -5273,14 +5040,7 @@
         <w:rPr>
           <w:highlight w:val="darkGray"/>
         </w:rPr>
-        <w:t>карточки</w:t>
-      </w:r>
-      <w:proofErr w:type="gramEnd"/>
-      <w:r>
-        <w:rPr>
-          <w:highlight w:val="darkGray"/>
-        </w:rPr>
-        <w:t xml:space="preserve"> шаблона протокола</w:t>
+        <w:t>карточки шаблона протокола</w:t>
       </w:r>
     </w:p>
     <w:p>
@@ -5316,25 +5076,7 @@
           <w:iCs/>
           <w:highlight w:val="darkGray"/>
         </w:rPr>
-        <w:t xml:space="preserve">Время, показываемое </w:t>
-      </w:r>
-      <w:proofErr w:type="gramStart"/>
-      <w:r>
-        <w:rPr>
-          <w:i/>
-          <w:iCs/>
-          <w:highlight w:val="darkGray"/>
-        </w:rPr>
-        <w:t>пользователю</w:t>
-      </w:r>
-      <w:proofErr w:type="gramEnd"/>
-      <w:r>
-        <w:rPr>
-          <w:i/>
-          <w:iCs/>
-          <w:highlight w:val="darkGray"/>
-        </w:rPr>
-        <w:t xml:space="preserve"> нужно форматировать с учетом часового пояса, часовой пояс определяем через браузер. </w:t>
+        <w:t xml:space="preserve">Время, показываемое пользователю нужно форматировать с учетом часового пояса, часовой пояс определяем через браузер. </w:t>
       </w:r>
     </w:p>
     <w:tbl>
@@ -5458,7 +5200,7 @@
                           <pic:cNvPicPr/>
                         </pic:nvPicPr>
                         <pic:blipFill>
-                          <a:blip r:embed="rId15"/>
+                          <a:blip r:embed="rId14"/>
                           <a:stretch>
                             <a:fillRect/>
                           </a:stretch>
@@ -5721,15 +5463,7 @@
               <w:jc w:val="center"/>
             </w:pPr>
             <w:r>
-              <w:t xml:space="preserve">Версия протокола создается автоматически, простым последовательным </w:t>
-            </w:r>
-            <w:proofErr w:type="spellStart"/>
-            <w:r>
-              <w:t>версионированием</w:t>
-            </w:r>
-            <w:proofErr w:type="spellEnd"/>
-            <w:r>
-              <w:t xml:space="preserve">. </w:t>
+              <w:t xml:space="preserve">Версия протокола создается автоматически, простым последовательным версионированием. </w:t>
             </w:r>
           </w:p>
           <w:p>
@@ -5737,15 +5471,7 @@
               <w:jc w:val="center"/>
             </w:pPr>
             <w:r>
-              <w:t xml:space="preserve">Подробные правила </w:t>
-            </w:r>
-            <w:proofErr w:type="spellStart"/>
-            <w:r>
-              <w:t>версионирования</w:t>
-            </w:r>
-            <w:proofErr w:type="spellEnd"/>
-            <w:r>
-              <w:t xml:space="preserve"> см</w:t>
+              <w:t>Подробные правила версионирования см</w:t>
             </w:r>
             <w:r>
               <w:rPr>
@@ -5966,15 +5692,7 @@
               <w:jc w:val="center"/>
             </w:pPr>
             <w:r>
-              <w:t xml:space="preserve">По умолчанию поле пустое, доступно для ввода. Допустимое число символов 50, кириллица + латиница, спец символы </w:t>
-            </w:r>
-            <w:proofErr w:type="gramStart"/>
-            <w:r>
-              <w:t>так-же</w:t>
-            </w:r>
-            <w:proofErr w:type="gramEnd"/>
-            <w:r>
-              <w:t xml:space="preserve"> допускаются. При сохранении необходимо проверка по названию (Строгое соответствие), </w:t>
+              <w:t xml:space="preserve">По умолчанию поле пустое, доступно для ввода. Допустимое число символов 50, кириллица + латиница, спец символы так-же допускаются. При сохранении необходимо проверка по названию (Строгое соответствие), </w:t>
             </w:r>
             <w:r>
               <w:rPr>
@@ -6259,13 +5977,8 @@
               <w:jc w:val="center"/>
             </w:pPr>
             <w:r>
-              <w:t xml:space="preserve">Формат: ДД.ММ.ГГГГ </w:t>
-            </w:r>
-            <w:proofErr w:type="gramStart"/>
-            <w:r>
-              <w:t>ЧЧ:ММ</w:t>
-            </w:r>
-            <w:proofErr w:type="gramEnd"/>
+              <w:t>Формат: ДД.ММ.ГГГГ ЧЧ:ММ</w:t>
+            </w:r>
           </w:p>
         </w:tc>
         <w:tc>
@@ -6364,13 +6077,8 @@
               <w:jc w:val="center"/>
             </w:pPr>
             <w:r>
-              <w:t xml:space="preserve">Формат: ДД.ММ.ГГГГ </w:t>
-            </w:r>
-            <w:proofErr w:type="gramStart"/>
-            <w:r>
-              <w:t>ЧЧ:ММ</w:t>
-            </w:r>
-            <w:proofErr w:type="gramEnd"/>
+              <w:t>Формат: ДД.ММ.ГГГГ ЧЧ:ММ</w:t>
+            </w:r>
           </w:p>
         </w:tc>
         <w:tc>
@@ -6469,13 +6177,8 @@
               <w:jc w:val="center"/>
             </w:pPr>
             <w:r>
-              <w:t xml:space="preserve">Формат: ДД.ММ.ГГГГ </w:t>
-            </w:r>
-            <w:proofErr w:type="gramStart"/>
-            <w:r>
-              <w:t>ЧЧ:ММ</w:t>
-            </w:r>
-            <w:proofErr w:type="gramEnd"/>
+              <w:t>Формат: ДД.ММ.ГГГГ ЧЧ:ММ</w:t>
+            </w:r>
           </w:p>
         </w:tc>
         <w:tc>
@@ -6957,7 +6660,7 @@
                           <pic:cNvPicPr/>
                         </pic:nvPicPr>
                         <pic:blipFill>
-                          <a:blip r:embed="rId15"/>
+                          <a:blip r:embed="rId14"/>
                           <a:stretch>
                             <a:fillRect/>
                           </a:stretch>
@@ -7515,7 +7218,7 @@
                 <w:szCs w:val="20"/>
               </w:rPr>
             </w:pPr>
-            <w:commentRangeStart w:id="8"/>
+            <w:commentRangeStart w:id="9"/>
             <w:r>
               <w:rPr>
                 <w:bCs/>
@@ -7524,14 +7227,14 @@
               </w:rPr>
               <w:t>Условие выполнения</w:t>
             </w:r>
-            <w:commentRangeEnd w:id="8"/>
+            <w:commentRangeEnd w:id="9"/>
             <w:r>
               <w:rPr>
                 <w:rStyle w:val="af4"/>
                 <w:rFonts w:eastAsiaTheme="minorHAnsi"/>
                 <w:b w:val="0"/>
               </w:rPr>
-              <w:commentReference w:id="8"/>
+              <w:commentReference w:id="9"/>
             </w:r>
           </w:p>
         </w:tc>
@@ -7739,18 +7442,8 @@
               </w:rPr>
             </w:pPr>
             <w:r>
-              <w:t xml:space="preserve">Нажатие кнопки 'Активировать' в карточке шаблона </w:t>
-            </w:r>
-            <w:proofErr w:type="gramStart"/>
-            <w:r>
-              <w:t xml:space="preserve">протокола  </w:t>
-            </w:r>
-            <w:proofErr w:type="spellStart"/>
-            <w:r>
-              <w:t>протокола</w:t>
-            </w:r>
-            <w:proofErr w:type="spellEnd"/>
-            <w:proofErr w:type="gramEnd"/>
+              <w:t>Нажатие кнопки 'Активировать' в карточке шаблона протокола  протокола</w:t>
+            </w:r>
           </w:p>
         </w:tc>
       </w:tr>
@@ -7873,11 +7566,11 @@
       <w:pPr>
         <w:pStyle w:val="22"/>
       </w:pPr>
-      <w:bookmarkStart w:id="9" w:name="_Ref213778211"/>
+      <w:bookmarkStart w:id="10" w:name="_Ref213778211"/>
       <w:r>
         <w:t>Правила формирования версий протокола</w:t>
       </w:r>
-      <w:bookmarkEnd w:id="9"/>
+      <w:bookmarkEnd w:id="10"/>
     </w:p>
     <w:p/>
     <w:p>
@@ -7960,35 +7653,9 @@
           <w:numId w:val="18"/>
         </w:numPr>
       </w:pPr>
-      <w:proofErr w:type="spellStart"/>
-      <w:r>
-        <w:t>Простое</w:t>
-      </w:r>
-      <w:proofErr w:type="spellEnd"/>
-      <w:r>
-        <w:t xml:space="preserve"> </w:t>
-      </w:r>
-      <w:proofErr w:type="spellStart"/>
-      <w:r>
-        <w:t>последовательное</w:t>
-      </w:r>
-      <w:proofErr w:type="spellEnd"/>
-      <w:r>
-        <w:t xml:space="preserve"> </w:t>
-      </w:r>
-      <w:proofErr w:type="spellStart"/>
-      <w:r>
-        <w:t>нумерование</w:t>
-      </w:r>
-      <w:proofErr w:type="spellEnd"/>
-      <w:r>
-        <w:t xml:space="preserve"> </w:t>
-      </w:r>
-      <w:proofErr w:type="spellStart"/>
-      <w:r>
-        <w:t>версий</w:t>
-      </w:r>
-      <w:proofErr w:type="spellEnd"/>
+      <w:r>
+        <w:t>Простое последовательное нумерование версий</w:t>
+      </w:r>
     </w:p>
     <w:p>
       <w:pPr>
@@ -8022,49 +7689,8 @@
           <w:b/>
           <w:bCs/>
         </w:rPr>
-        <w:t xml:space="preserve"> </w:t>
-      </w:r>
-      <w:proofErr w:type="spellStart"/>
-      <w:r>
-        <w:rPr>
-          <w:b/>
-          <w:bCs/>
-        </w:rPr>
-        <w:t>формирования</w:t>
-      </w:r>
-      <w:proofErr w:type="spellEnd"/>
-      <w:r>
-        <w:rPr>
-          <w:b/>
-          <w:bCs/>
-        </w:rPr>
-        <w:t xml:space="preserve"> </w:t>
-      </w:r>
-      <w:proofErr w:type="spellStart"/>
-      <w:r>
-        <w:rPr>
-          <w:b/>
-          <w:bCs/>
-        </w:rPr>
-        <w:t>номеров</w:t>
-      </w:r>
-      <w:proofErr w:type="spellEnd"/>
-      <w:r>
-        <w:rPr>
-          <w:b/>
-          <w:bCs/>
-        </w:rPr>
-        <w:t xml:space="preserve"> </w:t>
-      </w:r>
-      <w:proofErr w:type="spellStart"/>
-      <w:r>
-        <w:rPr>
-          <w:b/>
-          <w:bCs/>
-        </w:rPr>
-        <w:t>версий</w:t>
-      </w:r>
-      <w:proofErr w:type="spellEnd"/>
+        <w:t xml:space="preserve"> формирования номеров версий</w:t>
+      </w:r>
       <w:r>
         <w:t>:</w:t>
       </w:r>
@@ -8187,12 +7813,10 @@
             <w:tcW w:w="2605" w:type="dxa"/>
           </w:tcPr>
           <w:p>
-            <w:proofErr w:type="spellStart"/>
             <w:r>
               <w:lastRenderedPageBreak/>
               <w:t>Редактирвоание</w:t>
             </w:r>
-            <w:proofErr w:type="spellEnd"/>
           </w:p>
         </w:tc>
         <w:tc>
@@ -8381,10 +8005,7 @@
         <w:tab/>
       </w:r>
       <w:r>
-        <w:t xml:space="preserve"> </w:t>
-      </w:r>
-      <w:r>
-        <w:t>шаблон 2 версии 2</w:t>
+        <w:t xml:space="preserve"> шаблон 2 версии 2</w:t>
       </w:r>
     </w:p>
     <w:p>
@@ -8498,37 +8119,21 @@
           <w:b/>
           <w:bCs/>
         </w:rPr>
-        <w:t xml:space="preserve">Можно создать только один </w:t>
-      </w:r>
-      <w:proofErr w:type="gramStart"/>
+        <w:t>Можно создать только один черновик</w:t>
+      </w:r>
       <w:r>
         <w:rPr>
           <w:b/>
           <w:bCs/>
         </w:rPr>
-        <w:t>черновик</w:t>
+        <w:t xml:space="preserve">, </w:t>
       </w:r>
       <w:r>
         <w:rPr>
           <w:b/>
           <w:bCs/>
         </w:rPr>
-        <w:t xml:space="preserve">, </w:t>
-      </w:r>
-      <w:r>
-        <w:rPr>
-          <w:b/>
-          <w:bCs/>
-        </w:rPr>
-        <w:t xml:space="preserve"> одной</w:t>
-      </w:r>
-      <w:proofErr w:type="gramEnd"/>
-      <w:r>
-        <w:rPr>
-          <w:b/>
-          <w:bCs/>
-        </w:rPr>
-        <w:t xml:space="preserve"> активной версии протокола. </w:t>
+        <w:t xml:space="preserve"> одной активной версии протокола. </w:t>
       </w:r>
     </w:p>
     <w:p>
@@ -8662,11 +8267,9 @@
         </w:rPr>
         <w:t>Формат отображения: '</w:t>
       </w:r>
-      <w:proofErr w:type="spellStart"/>
       <w:r>
         <w:t>vX</w:t>
       </w:r>
-      <w:proofErr w:type="spellEnd"/>
       <w:r>
         <w:rPr>
           <w:lang w:val="ru-RU"/>
@@ -8808,13 +8411,8 @@
         <w:t>Описание бизнес-процесса</w:t>
       </w:r>
       <w:r>
-        <w:t xml:space="preserve"> </w:t>
-      </w:r>
-      <w:proofErr w:type="spellStart"/>
-      <w:r>
-        <w:t>версионирования</w:t>
-      </w:r>
-      <w:proofErr w:type="spellEnd"/>
+        <w:t xml:space="preserve"> версионирования</w:t>
+      </w:r>
       <w:r>
         <w:t xml:space="preserve"> пользователем</w:t>
       </w:r>
@@ -8842,43 +8440,9 @@
           <w:numId w:val="21"/>
         </w:numPr>
       </w:pPr>
-      <w:proofErr w:type="spellStart"/>
-      <w:r>
-        <w:t>Пользователь</w:t>
-      </w:r>
-      <w:proofErr w:type="spellEnd"/>
-      <w:r>
-        <w:t xml:space="preserve"> </w:t>
-      </w:r>
-      <w:proofErr w:type="spellStart"/>
-      <w:r>
-        <w:t>создает</w:t>
-      </w:r>
-      <w:proofErr w:type="spellEnd"/>
-      <w:r>
-        <w:t xml:space="preserve"> </w:t>
-      </w:r>
-      <w:proofErr w:type="spellStart"/>
-      <w:r>
-        <w:t>новый</w:t>
-      </w:r>
-      <w:proofErr w:type="spellEnd"/>
-      <w:r>
-        <w:t xml:space="preserve"> </w:t>
-      </w:r>
-      <w:proofErr w:type="spellStart"/>
-      <w:r>
-        <w:t>шаблон</w:t>
-      </w:r>
-      <w:proofErr w:type="spellEnd"/>
-      <w:r>
-        <w:t xml:space="preserve"> </w:t>
-      </w:r>
-      <w:proofErr w:type="spellStart"/>
-      <w:r>
-        <w:t>протокола</w:t>
-      </w:r>
-      <w:proofErr w:type="spellEnd"/>
+      <w:r>
+        <w:t>Пользователь создает новый шаблон протокола</w:t>
+      </w:r>
     </w:p>
     <w:p>
       <w:pPr>
@@ -8888,29 +8452,8 @@
           <w:numId w:val="21"/>
         </w:numPr>
       </w:pPr>
-      <w:proofErr w:type="spellStart"/>
-      <w:r>
-        <w:t>Система</w:t>
-      </w:r>
-      <w:proofErr w:type="spellEnd"/>
-      <w:r>
-        <w:t xml:space="preserve"> </w:t>
-      </w:r>
-      <w:proofErr w:type="spellStart"/>
-      <w:r>
-        <w:t>присваивает</w:t>
-      </w:r>
-      <w:proofErr w:type="spellEnd"/>
-      <w:r>
-        <w:t xml:space="preserve"> </w:t>
-      </w:r>
-      <w:proofErr w:type="spellStart"/>
-      <w:r>
-        <w:t>версию</w:t>
-      </w:r>
-      <w:proofErr w:type="spellEnd"/>
-      <w:r>
-        <w:t xml:space="preserve"> v1.0</w:t>
+      <w:r>
+        <w:t>Система присваивает версию v1.0</w:t>
       </w:r>
     </w:p>
     <w:p>
@@ -8921,29 +8464,8 @@
           <w:numId w:val="21"/>
         </w:numPr>
       </w:pPr>
-      <w:proofErr w:type="spellStart"/>
-      <w:r>
-        <w:t>Статус</w:t>
-      </w:r>
-      <w:proofErr w:type="spellEnd"/>
-      <w:r>
-        <w:t xml:space="preserve"> </w:t>
-      </w:r>
-      <w:proofErr w:type="spellStart"/>
-      <w:r>
-        <w:t>устанавливается</w:t>
-      </w:r>
-      <w:proofErr w:type="spellEnd"/>
-      <w:r>
-        <w:t xml:space="preserve"> '</w:t>
-      </w:r>
-      <w:proofErr w:type="spellStart"/>
-      <w:r>
-        <w:t>Черновик</w:t>
-      </w:r>
-      <w:proofErr w:type="spellEnd"/>
-      <w:r>
-        <w:t>'</w:t>
+      <w:r>
+        <w:t>Статус устанавливается 'Черновик'</w:t>
       </w:r>
     </w:p>
     <w:p/>
@@ -9145,13 +8667,8 @@
         <w:pStyle w:val="30"/>
       </w:pPr>
       <w:r>
-        <w:t xml:space="preserve">Алгоритм </w:t>
-      </w:r>
-      <w:proofErr w:type="spellStart"/>
-      <w:r>
-        <w:t>версионирования</w:t>
-      </w:r>
-      <w:proofErr w:type="spellEnd"/>
+        <w:t>Алгоритм версионирования</w:t>
+      </w:r>
     </w:p>
     <w:p>
       <w:pPr>
@@ -9231,21 +8748,8 @@
       <w:pPr>
         <w:pStyle w:val="a"/>
       </w:pPr>
-      <w:proofErr w:type="spellStart"/>
-      <w:r>
-        <w:t>При</w:t>
-      </w:r>
-      <w:proofErr w:type="spellEnd"/>
-      <w:r>
-        <w:t xml:space="preserve"> </w:t>
-      </w:r>
-      <w:proofErr w:type="spellStart"/>
-      <w:r>
-        <w:t>сохранении</w:t>
-      </w:r>
-      <w:proofErr w:type="spellEnd"/>
-      <w:r>
-        <w:t>:</w:t>
+      <w:r>
+        <w:t>При сохранении:</w:t>
       </w:r>
     </w:p>
     <w:p>
@@ -9314,11 +8818,11 @@
       <w:pPr>
         <w:pStyle w:val="22"/>
       </w:pPr>
-      <w:commentRangeStart w:id="10"/>
+      <w:commentRangeStart w:id="11"/>
       <w:r>
         <w:t>Карточка версии шаблона протокола</w:t>
       </w:r>
-      <w:commentRangeEnd w:id="10"/>
+      <w:commentRangeEnd w:id="11"/>
       <w:r>
         <w:rPr>
           <w:rStyle w:val="af4"/>
@@ -9326,7 +8830,7 @@
           <w:b w:val="0"/>
           <w:bCs w:val="0"/>
         </w:rPr>
-        <w:commentReference w:id="10"/>
+        <w:commentReference w:id="11"/>
       </w:r>
     </w:p>
     <w:p>
@@ -9386,16 +8890,16 @@
       <w:pPr>
         <w:pStyle w:val="a3"/>
       </w:pPr>
-      <w:commentRangeStart w:id="11"/>
+      <w:commentRangeStart w:id="12"/>
       <w:r>
         <w:t xml:space="preserve">Необходимо настроить связь с предыдущей версией шаблона протокола и изначальным шаблоном, с которого пошли версии. </w:t>
       </w:r>
-      <w:commentRangeEnd w:id="11"/>
+      <w:commentRangeEnd w:id="12"/>
       <w:r>
         <w:rPr>
           <w:rStyle w:val="af4"/>
         </w:rPr>
-        <w:commentReference w:id="11"/>
+        <w:commentReference w:id="12"/>
       </w:r>
       <w:r>
         <w:t xml:space="preserve">Связь уровня «Создано на основе». </w:t>
@@ -9876,15 +9380,7 @@
               <w:jc w:val="center"/>
             </w:pPr>
             <w:r>
-              <w:t xml:space="preserve">Версия протокола создается автоматически, простым последовательным </w:t>
-            </w:r>
-            <w:proofErr w:type="spellStart"/>
-            <w:r>
-              <w:t>версионированием</w:t>
-            </w:r>
-            <w:proofErr w:type="spellEnd"/>
-            <w:r>
-              <w:t xml:space="preserve">. </w:t>
+              <w:t xml:space="preserve">Версия протокола создается автоматически, простым последовательным версионированием. </w:t>
             </w:r>
           </w:p>
           <w:p>
@@ -9892,15 +9388,7 @@
               <w:jc w:val="center"/>
             </w:pPr>
             <w:r>
-              <w:t xml:space="preserve">Подробные правила </w:t>
-            </w:r>
-            <w:proofErr w:type="spellStart"/>
-            <w:r>
-              <w:t>версионирования</w:t>
-            </w:r>
-            <w:proofErr w:type="spellEnd"/>
-            <w:r>
-              <w:t xml:space="preserve"> см</w:t>
+              <w:t>Подробные правила версионирования см</w:t>
             </w:r>
             <w:r>
               <w:rPr>
@@ -10125,15 +9613,7 @@
             </w:r>
             <w:r>
               <w:lastRenderedPageBreak/>
-              <w:t xml:space="preserve">спец символы </w:t>
-            </w:r>
-            <w:proofErr w:type="gramStart"/>
-            <w:r>
-              <w:t>так-же</w:t>
-            </w:r>
-            <w:proofErr w:type="gramEnd"/>
-            <w:r>
-              <w:t xml:space="preserve"> допускаются. При сохранении необходимо проверка по названию (Строгое соответствие), </w:t>
+              <w:t xml:space="preserve">спец символы так-же допускаются. При сохранении необходимо проверка по названию (Строгое соответствие), </w:t>
             </w:r>
             <w:r>
               <w:rPr>
@@ -10414,13 +9894,8 @@
               <w:jc w:val="center"/>
             </w:pPr>
             <w:r>
-              <w:t xml:space="preserve">Формат: ДД.ММ.ГГГГ </w:t>
-            </w:r>
-            <w:proofErr w:type="gramStart"/>
-            <w:r>
-              <w:t>ЧЧ:ММ</w:t>
-            </w:r>
-            <w:proofErr w:type="gramEnd"/>
+              <w:t>Формат: ДД.ММ.ГГГГ ЧЧ:ММ</w:t>
+            </w:r>
           </w:p>
         </w:tc>
         <w:tc>
@@ -10519,13 +9994,8 @@
               <w:jc w:val="center"/>
             </w:pPr>
             <w:r>
-              <w:t xml:space="preserve">Формат: ДД.ММ.ГГГГ </w:t>
-            </w:r>
-            <w:proofErr w:type="gramStart"/>
-            <w:r>
-              <w:t>ЧЧ:ММ</w:t>
-            </w:r>
-            <w:proofErr w:type="gramEnd"/>
+              <w:t>Формат: ДД.ММ.ГГГГ ЧЧ:ММ</w:t>
+            </w:r>
           </w:p>
         </w:tc>
         <w:tc>
@@ -10624,13 +10094,8 @@
               <w:jc w:val="center"/>
             </w:pPr>
             <w:r>
-              <w:t xml:space="preserve">Формат: ДД.ММ.ГГГГ </w:t>
-            </w:r>
-            <w:proofErr w:type="gramStart"/>
-            <w:r>
-              <w:t>ЧЧ:ММ</w:t>
-            </w:r>
-            <w:proofErr w:type="gramEnd"/>
+              <w:t>Формат: ДД.ММ.ГГГГ ЧЧ:ММ</w:t>
+            </w:r>
           </w:p>
         </w:tc>
         <w:tc>
@@ -11527,25 +10992,7 @@
           <w:szCs w:val="22"/>
           <w:highlight w:val="darkGray"/>
         </w:rPr>
-        <w:t xml:space="preserve"> При этом, выполнение шагов всегда последовательно, это осознанное решение, </w:t>
-      </w:r>
-      <w:proofErr w:type="gramStart"/>
-      <w:r>
-        <w:rPr>
-          <w:rFonts w:eastAsiaTheme="minorHAnsi" w:cstheme="minorBidi"/>
-          <w:szCs w:val="22"/>
-          <w:highlight w:val="darkGray"/>
-        </w:rPr>
-        <w:t>что бы</w:t>
-      </w:r>
-      <w:proofErr w:type="gramEnd"/>
-      <w:r>
-        <w:rPr>
-          <w:rFonts w:eastAsiaTheme="minorHAnsi" w:cstheme="minorBidi"/>
-          <w:szCs w:val="22"/>
-          <w:highlight w:val="darkGray"/>
-        </w:rPr>
-        <w:t xml:space="preserve"> упростить архитектуру и избежать проблем при использовании параллельной схемы. </w:t>
+        <w:t xml:space="preserve"> При этом, выполнение шагов всегда последовательно, это осознанное решение, что бы упростить архитектуру и избежать проблем при использовании параллельной схемы. </w:t>
       </w:r>
       <w:r>
         <w:rPr>
@@ -11843,27 +11290,7 @@
           <w:szCs w:val="22"/>
           <w:highlight w:val="darkGray"/>
         </w:rPr>
-        <w:t xml:space="preserve">исполнителями по протоколу являются подразделения в </w:t>
-      </w:r>
-      <w:proofErr w:type="spellStart"/>
-      <w:proofErr w:type="gramStart"/>
-      <w:r>
-        <w:rPr>
-          <w:rFonts w:eastAsiaTheme="minorHAnsi" w:cstheme="minorBidi"/>
-          <w:szCs w:val="22"/>
-          <w:highlight w:val="darkGray"/>
-        </w:rPr>
-        <w:t>орг.структуре</w:t>
-      </w:r>
-      <w:proofErr w:type="spellEnd"/>
-      <w:proofErr w:type="gramEnd"/>
-      <w:r>
-        <w:rPr>
-          <w:rFonts w:eastAsiaTheme="minorHAnsi" w:cstheme="minorBidi"/>
-          <w:szCs w:val="22"/>
-          <w:highlight w:val="darkGray"/>
-        </w:rPr>
-        <w:t xml:space="preserve">, назначение этих подразделений идет через сущность «Роль реагирования»  </w:t>
+        <w:t xml:space="preserve">исполнителями по протоколу являются подразделения в орг.структуре, назначение этих подразделений идет через сущность «Роль реагирования»  </w:t>
       </w:r>
     </w:p>
     <w:p>
@@ -12623,25 +12050,7 @@
                 <w:sz w:val="20"/>
                 <w:szCs w:val="20"/>
               </w:rPr>
-              <w:t xml:space="preserve">Статус меняется </w:t>
-            </w:r>
-            <w:proofErr w:type="gramStart"/>
-            <w:r>
-              <w:rPr>
-                <w:color w:val="000000"/>
-                <w:sz w:val="20"/>
-                <w:szCs w:val="20"/>
-              </w:rPr>
-              <w:t>автоматически, после того, как</w:t>
-            </w:r>
-            <w:proofErr w:type="gramEnd"/>
-            <w:r>
-              <w:rPr>
-                <w:color w:val="000000"/>
-                <w:sz w:val="20"/>
-                <w:szCs w:val="20"/>
-              </w:rPr>
-              <w:t xml:space="preserve"> исполнитель взял выполнение шага по кнопке «Взять в работу»</w:t>
+              <w:t>Статус меняется автоматически, после того, как исполнитель взял выполнение шага по кнопке «Взять в работу»</w:t>
             </w:r>
           </w:p>
         </w:tc>
@@ -13030,7 +12439,7 @@
           <w:highlight w:val="darkGray"/>
         </w:rPr>
       </w:pPr>
-      <w:bookmarkStart w:id="12" w:name="_Ref214792638"/>
+      <w:bookmarkStart w:id="13" w:name="_Ref214792638"/>
       <w:r>
         <w:rPr>
           <w:highlight w:val="darkGray"/>
@@ -13043,7 +12452,7 @@
         </w:rPr>
         <w:t xml:space="preserve"> карточки шаблона шагов протокола</w:t>
       </w:r>
-      <w:bookmarkEnd w:id="12"/>
+      <w:bookmarkEnd w:id="13"/>
       <w:r>
         <w:rPr>
           <w:highlight w:val="darkGray"/>
@@ -13550,15 +12959,7 @@
               <w:jc w:val="center"/>
             </w:pPr>
             <w:r>
-              <w:t xml:space="preserve">Взаимосвязанный </w:t>
-            </w:r>
-            <w:proofErr w:type="gramStart"/>
-            <w:r>
-              <w:t>список  выпадающих</w:t>
-            </w:r>
-            <w:proofErr w:type="gramEnd"/>
-            <w:r>
-              <w:t xml:space="preserve"> значений согласно справочнику. </w:t>
+              <w:t xml:space="preserve">Взаимосвязанный список  выпадающих значений согласно справочнику. </w:t>
             </w:r>
           </w:p>
         </w:tc>
@@ -13756,8 +13157,8 @@
           <w:highlight w:val="darkGray"/>
         </w:rPr>
       </w:pPr>
-      <w:bookmarkStart w:id="13" w:name="_Ref214818707"/>
-      <w:bookmarkStart w:id="14" w:name="_Ref215615909"/>
+      <w:bookmarkStart w:id="14" w:name="_Ref214818707"/>
+      <w:bookmarkStart w:id="15" w:name="_Ref215615909"/>
       <w:r>
         <w:rPr>
           <w:highlight w:val="darkGray"/>
@@ -13782,14 +13183,14 @@
         </w:rPr>
         <w:t>ипов действий</w:t>
       </w:r>
-      <w:bookmarkEnd w:id="13"/>
+      <w:bookmarkEnd w:id="14"/>
       <w:r>
         <w:rPr>
           <w:highlight w:val="darkGray"/>
         </w:rPr>
         <w:t>»</w:t>
       </w:r>
-      <w:bookmarkEnd w:id="14"/>
+      <w:bookmarkEnd w:id="15"/>
       <w:r>
         <w:rPr>
           <w:highlight w:val="darkGray"/>
@@ -15126,19 +14527,11 @@
                 <w:color w:val="000000"/>
               </w:rPr>
             </w:pPr>
-            <w:proofErr w:type="gramStart"/>
-            <w:r>
-              <w:rPr>
-                <w:color w:val="000000"/>
-              </w:rPr>
-              <w:t>Действия</w:t>
-            </w:r>
-            <w:proofErr w:type="gramEnd"/>
-            <w:r>
-              <w:rPr>
-                <w:color w:val="000000"/>
-              </w:rPr>
-              <w:t xml:space="preserve"> направленные на помощь пассажирам или сотрудникам</w:t>
+            <w:r>
+              <w:rPr>
+                <w:color w:val="000000"/>
+              </w:rPr>
+              <w:t>Действия направленные на помощь пассажирам или сотрудникам</w:t>
             </w:r>
           </w:p>
         </w:tc>
@@ -15232,23 +14625,7 @@
           <w:rFonts w:eastAsiaTheme="minorHAnsi" w:cstheme="minorBidi"/>
           <w:szCs w:val="22"/>
         </w:rPr>
-        <w:t>— это конкретный шаг, который отображается в протоколе (последовательности шагов). У каждого действия есть связь с «</w:t>
-      </w:r>
-      <w:proofErr w:type="spellStart"/>
-      <w:r>
-        <w:rPr>
-          <w:rFonts w:eastAsiaTheme="minorHAnsi" w:cstheme="minorBidi"/>
-          <w:szCs w:val="22"/>
-        </w:rPr>
-        <w:t>Чеклистом</w:t>
-      </w:r>
-      <w:proofErr w:type="spellEnd"/>
-      <w:r>
-        <w:rPr>
-          <w:rFonts w:eastAsiaTheme="minorHAnsi" w:cstheme="minorBidi"/>
-          <w:szCs w:val="22"/>
-        </w:rPr>
-        <w:t>» — специальным справочником, где подробно расписано, как именно нужно выполнить это действие (какая процедура требуется).</w:t>
+        <w:t>— это конкретный шаг, который отображается в протоколе (последовательности шагов). У каждого действия есть связь с «Чеклистом» — специальным справочником, где подробно расписано, как именно нужно выполнить это действие (какая процедура требуется).</w:t>
       </w:r>
     </w:p>
     <w:p>
@@ -15337,7 +14714,7 @@
           <w:highlight w:val="darkGray"/>
         </w:rPr>
       </w:pPr>
-      <w:bookmarkStart w:id="15" w:name="_Ref215615585"/>
+      <w:bookmarkStart w:id="16" w:name="_Ref215615585"/>
       <w:r>
         <w:rPr>
           <w:highlight w:val="darkGray"/>
@@ -15356,7 +14733,7 @@
         </w:rPr>
         <w:t>»</w:t>
       </w:r>
-      <w:bookmarkEnd w:id="15"/>
+      <w:bookmarkEnd w:id="16"/>
       <w:r>
         <w:rPr>
           <w:highlight w:val="darkGray"/>
@@ -18401,9 +17778,8 @@
           <w:bCs/>
           <w:szCs w:val="22"/>
         </w:rPr>
-        <w:t xml:space="preserve">Категория </w:t>
-      </w:r>
-      <w:proofErr w:type="gramStart"/>
+        <w:t>Категория действий</w:t>
+      </w:r>
       <w:r>
         <w:rPr>
           <w:rFonts w:eastAsiaTheme="minorHAnsi" w:cstheme="minorBidi"/>
@@ -18411,7 +17787,7 @@
           <w:bCs/>
           <w:szCs w:val="22"/>
         </w:rPr>
-        <w:t>действий</w:t>
+        <w:t xml:space="preserve"> </w:t>
       </w:r>
       <w:r>
         <w:rPr>
@@ -18420,15 +17796,6 @@
           <w:bCs/>
           <w:szCs w:val="22"/>
         </w:rPr>
-        <w:t xml:space="preserve"> </w:t>
-      </w:r>
-      <w:r>
-        <w:rPr>
-          <w:rFonts w:eastAsiaTheme="minorHAnsi" w:cstheme="minorBidi"/>
-          <w:b/>
-          <w:bCs/>
-          <w:szCs w:val="22"/>
-        </w:rPr>
         <w:t> </w:t>
       </w:r>
       <w:r>
@@ -18436,15 +17803,7 @@
           <w:rFonts w:eastAsiaTheme="minorHAnsi" w:cstheme="minorBidi"/>
           <w:szCs w:val="22"/>
         </w:rPr>
-        <w:t>—</w:t>
-      </w:r>
-      <w:proofErr w:type="gramEnd"/>
-      <w:r>
-        <w:rPr>
-          <w:rFonts w:eastAsiaTheme="minorHAnsi" w:cstheme="minorBidi"/>
-          <w:szCs w:val="22"/>
-        </w:rPr>
-        <w:t xml:space="preserve"> </w:t>
+        <w:t xml:space="preserve">— </w:t>
       </w:r>
       <w:r>
         <w:rPr>
@@ -18512,9 +17871,8 @@
           <w:bCs/>
           <w:szCs w:val="22"/>
         </w:rPr>
-        <w:t xml:space="preserve">Список </w:t>
-      </w:r>
-      <w:proofErr w:type="gramStart"/>
+        <w:t>Список действий</w:t>
+      </w:r>
       <w:r>
         <w:rPr>
           <w:rFonts w:eastAsiaTheme="minorHAnsi" w:cstheme="minorBidi"/>
@@ -18522,15 +17880,6 @@
           <w:bCs/>
           <w:szCs w:val="22"/>
         </w:rPr>
-        <w:t>действий</w:t>
-      </w:r>
-      <w:r>
-        <w:rPr>
-          <w:rFonts w:eastAsiaTheme="minorHAnsi" w:cstheme="minorBidi"/>
-          <w:b/>
-          <w:bCs/>
-          <w:szCs w:val="22"/>
-        </w:rPr>
         <w:t xml:space="preserve">  </w:t>
       </w:r>
       <w:r>
@@ -18538,15 +17887,7 @@
           <w:rFonts w:eastAsiaTheme="minorHAnsi" w:cstheme="minorBidi"/>
           <w:szCs w:val="22"/>
         </w:rPr>
-        <w:t>—</w:t>
-      </w:r>
-      <w:proofErr w:type="gramEnd"/>
-      <w:r>
-        <w:rPr>
-          <w:rFonts w:eastAsiaTheme="minorHAnsi" w:cstheme="minorBidi"/>
-          <w:szCs w:val="22"/>
-        </w:rPr>
-        <w:t xml:space="preserve"> это конкретное описание в чек-листе для пользователя, </w:t>
+        <w:t xml:space="preserve">— это конкретное описание в чек-листе для пользователя, </w:t>
       </w:r>
       <w:r>
         <w:rPr>
@@ -19234,25 +18575,7 @@
                 <w:sz w:val="20"/>
                 <w:szCs w:val="20"/>
               </w:rPr>
-              <w:t>ЕСЛИ создали новую версию шаблона, старой версии присваивается статус «</w:t>
-            </w:r>
-            <w:proofErr w:type="gramStart"/>
-            <w:r>
-              <w:rPr>
-                <w:color w:val="000000"/>
-                <w:sz w:val="20"/>
-                <w:szCs w:val="20"/>
-              </w:rPr>
-              <w:t>Архив»  системой</w:t>
-            </w:r>
-            <w:proofErr w:type="gramEnd"/>
-            <w:r>
-              <w:rPr>
-                <w:color w:val="000000"/>
-                <w:sz w:val="20"/>
-                <w:szCs w:val="20"/>
-              </w:rPr>
-              <w:t xml:space="preserve"> автоматически, если новая версия переходит в статус «Активен». </w:t>
+              <w:t xml:space="preserve">ЕСЛИ создали новую версию шаблона, старой версии присваивается статус «Архив»  системой автоматически, если новая версия переходит в статус «Активен». </w:t>
             </w:r>
           </w:p>
         </w:tc>
@@ -19389,7 +18712,7 @@
       <w:pPr>
         <w:pStyle w:val="30"/>
       </w:pPr>
-      <w:bookmarkStart w:id="16" w:name="_Ref214876729"/>
+      <w:bookmarkStart w:id="17" w:name="_Ref214876729"/>
       <w:r>
         <w:lastRenderedPageBreak/>
         <w:t>Эскиз экрана</w:t>
@@ -19550,14 +18873,14 @@
           <w:highlight w:val="darkGray"/>
         </w:rPr>
       </w:pPr>
-      <w:bookmarkStart w:id="17" w:name="_Ref215072124"/>
+      <w:bookmarkStart w:id="18" w:name="_Ref215072124"/>
       <w:r>
         <w:rPr>
           <w:highlight w:val="darkGray"/>
         </w:rPr>
         <w:t>Атрибуты карточки администрирования особенностей инфраструктуры при ННР</w:t>
       </w:r>
-      <w:bookmarkEnd w:id="17"/>
+      <w:bookmarkEnd w:id="18"/>
     </w:p>
     <w:tbl>
       <w:tblPr>
@@ -20590,21 +19913,7 @@
         <w:rPr>
           <w:highlight w:val="darkGray"/>
         </w:rPr>
-        <w:t xml:space="preserve">Алгоритм </w:t>
-      </w:r>
-      <w:proofErr w:type="spellStart"/>
-      <w:r>
-        <w:rPr>
-          <w:highlight w:val="darkGray"/>
-        </w:rPr>
-        <w:t>версионирования</w:t>
-      </w:r>
-      <w:proofErr w:type="spellEnd"/>
-      <w:r>
-        <w:rPr>
-          <w:highlight w:val="darkGray"/>
-        </w:rPr>
-        <w:t xml:space="preserve"> шаблона особенностей инфраструктуры при ННР</w:t>
+        <w:t>Алгоритм версионирования шаблона особенностей инфраструктуры при ННР</w:t>
       </w:r>
     </w:p>
     <w:p>
@@ -20693,21 +20002,8 @@
       <w:pPr>
         <w:pStyle w:val="a"/>
       </w:pPr>
-      <w:proofErr w:type="spellStart"/>
-      <w:r>
-        <w:t>При</w:t>
-      </w:r>
-      <w:proofErr w:type="spellEnd"/>
-      <w:r>
-        <w:t xml:space="preserve"> </w:t>
-      </w:r>
-      <w:proofErr w:type="spellStart"/>
-      <w:r>
-        <w:t>сохранении</w:t>
-      </w:r>
-      <w:proofErr w:type="spellEnd"/>
-      <w:r>
-        <w:t>:</w:t>
+      <w:r>
+        <w:t>При сохранении:</w:t>
       </w:r>
     </w:p>
     <w:p>
@@ -20766,7 +20062,7 @@
         </w:rPr>
         <w:t>- Связь между версиями сохраняется в системе</w:t>
       </w:r>
-      <w:bookmarkEnd w:id="16"/>
+      <w:bookmarkEnd w:id="17"/>
       <w:r>
         <w:rPr>
           <w:lang w:val="ru-RU"/>
@@ -20826,7 +20122,7 @@
           <w:highlight w:val="darkGray"/>
         </w:rPr>
       </w:pPr>
-      <w:bookmarkStart w:id="18" w:name="_Ref215616401"/>
+      <w:bookmarkStart w:id="19" w:name="_Ref215616401"/>
       <w:r>
         <w:rPr>
           <w:highlight w:val="darkGray"/>
@@ -20834,7 +20130,7 @@
         <w:lastRenderedPageBreak/>
         <w:t>Справочник типов ННР</w:t>
       </w:r>
-      <w:bookmarkEnd w:id="18"/>
+      <w:bookmarkEnd w:id="19"/>
     </w:p>
     <w:tbl>
       <w:tblPr>
@@ -21037,23 +20333,13 @@
                 <w:szCs w:val="20"/>
               </w:rPr>
             </w:pPr>
-            <w:proofErr w:type="spellStart"/>
             <w:r>
               <w:rPr>
                 <w:rFonts w:ascii="Arial" w:hAnsi="Arial" w:cs="Arial"/>
                 <w:sz w:val="20"/>
                 <w:szCs w:val="20"/>
               </w:rPr>
-              <w:t>Невысадка</w:t>
-            </w:r>
-            <w:proofErr w:type="spellEnd"/>
-            <w:r>
-              <w:rPr>
-                <w:rFonts w:ascii="Arial" w:hAnsi="Arial" w:cs="Arial"/>
-                <w:sz w:val="20"/>
-                <w:szCs w:val="20"/>
-              </w:rPr>
-              <w:t xml:space="preserve"> пассажиров на станции, проезд станции без остановки</w:t>
+              <w:t>Невысадка пассажиров на станции, проезд станции без остановки</w:t>
             </w:r>
           </w:p>
         </w:tc>
@@ -21372,23 +20658,13 @@
                 <w:szCs w:val="20"/>
               </w:rPr>
             </w:pPr>
-            <w:proofErr w:type="spellStart"/>
             <w:r>
               <w:rPr>
                 <w:rFonts w:ascii="Arial" w:hAnsi="Arial" w:cs="Arial"/>
                 <w:sz w:val="20"/>
                 <w:szCs w:val="20"/>
               </w:rPr>
-              <w:t>Незакрепление</w:t>
-            </w:r>
-            <w:proofErr w:type="spellEnd"/>
-            <w:r>
-              <w:rPr>
-                <w:rFonts w:ascii="Arial" w:hAnsi="Arial" w:cs="Arial"/>
-                <w:sz w:val="20"/>
-                <w:szCs w:val="20"/>
-              </w:rPr>
-              <w:t xml:space="preserve"> подвижного состава затормаживающими устройствами</w:t>
+              <w:t>Незакрепление подвижного состава затормаживающими устройствами</w:t>
             </w:r>
           </w:p>
         </w:tc>
@@ -21447,41 +20723,13 @@
                 <w:szCs w:val="20"/>
               </w:rPr>
             </w:pPr>
-            <w:proofErr w:type="spellStart"/>
             <w:r>
               <w:rPr>
                 <w:rFonts w:ascii="Arial" w:hAnsi="Arial" w:cs="Arial"/>
                 <w:sz w:val="20"/>
                 <w:szCs w:val="22"/>
               </w:rPr>
-              <w:t>Неограждение</w:t>
-            </w:r>
-            <w:proofErr w:type="spellEnd"/>
-            <w:r>
-              <w:rPr>
-                <w:rFonts w:ascii="Arial" w:hAnsi="Arial" w:cs="Arial"/>
-                <w:sz w:val="20"/>
-                <w:szCs w:val="22"/>
-              </w:rPr>
-              <w:t xml:space="preserve"> сигналами остановки места производства работ, несанкционированная или неправильная установка переносных сигналов остановки или уменьшения скорости, </w:t>
-            </w:r>
-            <w:proofErr w:type="spellStart"/>
-            <w:r>
-              <w:rPr>
-                <w:rFonts w:ascii="Arial" w:hAnsi="Arial" w:cs="Arial"/>
-                <w:sz w:val="20"/>
-                <w:szCs w:val="22"/>
-              </w:rPr>
-              <w:t>неограждение</w:t>
-            </w:r>
-            <w:proofErr w:type="spellEnd"/>
-            <w:r>
-              <w:rPr>
-                <w:rFonts w:ascii="Arial" w:hAnsi="Arial" w:cs="Arial"/>
-                <w:sz w:val="20"/>
-                <w:szCs w:val="22"/>
-              </w:rPr>
-              <w:t xml:space="preserve"> съемной подвижной единицы красным мигающим огнем</w:t>
+              <w:t>Неограждение сигналами остановки места производства работ, несанкционированная или неправильная установка переносных сигналов остановки или уменьшения скорости, неограждение съемной подвижной единицы красным мигающим огнем</w:t>
             </w:r>
           </w:p>
         </w:tc>
@@ -21871,25 +21119,7 @@
                 <w:sz w:val="20"/>
                 <w:szCs w:val="20"/>
               </w:rPr>
-              <w:t>Неисправность стрелки (</w:t>
-            </w:r>
-            <w:proofErr w:type="spellStart"/>
-            <w:r>
-              <w:rPr>
-                <w:rFonts w:ascii="Arial" w:hAnsi="Arial" w:cs="Arial"/>
-                <w:sz w:val="20"/>
-                <w:szCs w:val="20"/>
-              </w:rPr>
-              <w:t>неперевод</w:t>
-            </w:r>
-            <w:proofErr w:type="spellEnd"/>
-            <w:r>
-              <w:rPr>
-                <w:rFonts w:ascii="Arial" w:hAnsi="Arial" w:cs="Arial"/>
-                <w:sz w:val="20"/>
-                <w:szCs w:val="20"/>
-              </w:rPr>
-              <w:t>, длительный перевод, потеря контроля положения)</w:t>
+              <w:t>Неисправность стрелки (неперевод, длительный перевод, потеря контроля положения)</w:t>
             </w:r>
           </w:p>
         </w:tc>
@@ -24484,23 +23714,13 @@
                 <w:szCs w:val="20"/>
               </w:rPr>
             </w:pPr>
-            <w:proofErr w:type="spellStart"/>
             <w:r>
               <w:rPr>
                 <w:rFonts w:ascii="Arial" w:hAnsi="Arial" w:cs="Arial"/>
                 <w:sz w:val="20"/>
                 <w:szCs w:val="20"/>
               </w:rPr>
-              <w:t>Саморасцеп</w:t>
-            </w:r>
-            <w:proofErr w:type="spellEnd"/>
-            <w:r>
-              <w:rPr>
-                <w:rFonts w:ascii="Arial" w:hAnsi="Arial" w:cs="Arial"/>
-                <w:sz w:val="20"/>
-                <w:szCs w:val="20"/>
-              </w:rPr>
-              <w:t xml:space="preserve"> поезда (состава)</w:t>
+              <w:t>Саморасцеп поезда (состава)</w:t>
             </w:r>
           </w:p>
         </w:tc>
@@ -26515,25 +25735,7 @@
                 <w:sz w:val="20"/>
                 <w:szCs w:val="20"/>
               </w:rPr>
-              <w:t>Засыпание водителя, срабатывание системы «</w:t>
-            </w:r>
-            <w:proofErr w:type="spellStart"/>
-            <w:r>
-              <w:rPr>
-                <w:rFonts w:ascii="Arial" w:hAnsi="Arial" w:cs="Arial"/>
-                <w:sz w:val="20"/>
-                <w:szCs w:val="20"/>
-              </w:rPr>
-              <w:t>Антисон</w:t>
-            </w:r>
-            <w:proofErr w:type="spellEnd"/>
-            <w:r>
-              <w:rPr>
-                <w:rFonts w:ascii="Arial" w:hAnsi="Arial" w:cs="Arial"/>
-                <w:sz w:val="20"/>
-                <w:szCs w:val="20"/>
-              </w:rPr>
-              <w:t>»</w:t>
+              <w:t>Засыпание водителя, срабатывание системы «Антисон»</w:t>
             </w:r>
           </w:p>
         </w:tc>
@@ -27444,25 +26646,7 @@
                 <w:sz w:val="20"/>
                 <w:szCs w:val="20"/>
               </w:rPr>
-              <w:t xml:space="preserve">Неисправность стрелочного перевода, </w:t>
-            </w:r>
-            <w:proofErr w:type="spellStart"/>
-            <w:r>
-              <w:rPr>
-                <w:rFonts w:ascii="Arial" w:hAnsi="Arial" w:cs="Arial"/>
-                <w:sz w:val="20"/>
-                <w:szCs w:val="20"/>
-              </w:rPr>
-              <w:t>неперевод</w:t>
-            </w:r>
-            <w:proofErr w:type="spellEnd"/>
-            <w:r>
-              <w:rPr>
-                <w:rFonts w:ascii="Arial" w:hAnsi="Arial" w:cs="Arial"/>
-                <w:sz w:val="20"/>
-                <w:szCs w:val="20"/>
-              </w:rPr>
-              <w:t xml:space="preserve"> стрелки</w:t>
+              <w:t>Неисправность стрелочного перевода, неперевод стрелки</w:t>
             </w:r>
           </w:p>
         </w:tc>
@@ -28206,7 +27390,7 @@
           <w:highlight w:val="darkGray"/>
         </w:rPr>
       </w:pPr>
-      <w:bookmarkStart w:id="19" w:name="_Ref215616638"/>
+      <w:bookmarkStart w:id="20" w:name="_Ref215616638"/>
       <w:r>
         <w:rPr>
           <w:highlight w:val="darkGray"/>
@@ -28225,7 +27409,7 @@
         </w:rPr>
         <w:t xml:space="preserve"> ННР</w:t>
       </w:r>
-      <w:bookmarkEnd w:id="19"/>
+      <w:bookmarkEnd w:id="20"/>
     </w:p>
     <w:p>
       <w:pPr>
@@ -28814,7 +27998,6 @@
                 <w:szCs w:val="22"/>
               </w:rPr>
             </w:pPr>
-            <w:proofErr w:type="gramStart"/>
             <w:r>
               <w:rPr>
                 <w:color w:val="000000"/>
@@ -28836,7 +28019,6 @@
               </w:rPr>
               <w:t xml:space="preserve"> Кунцевская</w:t>
             </w:r>
-            <w:proofErr w:type="gramEnd"/>
           </w:p>
         </w:tc>
         <w:tc>
@@ -29012,7 +28194,6 @@
                 <w:szCs w:val="22"/>
               </w:rPr>
             </w:pPr>
-            <w:proofErr w:type="gramStart"/>
             <w:r>
               <w:rPr>
                 <w:color w:val="000000"/>
@@ -29027,7 +28208,6 @@
               </w:rPr>
               <w:t xml:space="preserve"> Бауманская</w:t>
             </w:r>
-            <w:proofErr w:type="gramEnd"/>
           </w:p>
         </w:tc>
         <w:tc>
@@ -29068,23 +28248,7 @@
                 <w:color w:val="000000"/>
                 <w:szCs w:val="22"/>
               </w:rPr>
-              <w:t xml:space="preserve">При остановке и невозможности </w:t>
-            </w:r>
-            <w:proofErr w:type="spellStart"/>
-            <w:r>
-              <w:rPr>
-                <w:color w:val="000000"/>
-                <w:szCs w:val="22"/>
-              </w:rPr>
-              <w:t>реверсации</w:t>
-            </w:r>
-            <w:proofErr w:type="spellEnd"/>
-            <w:r>
-              <w:rPr>
-                <w:color w:val="000000"/>
-                <w:szCs w:val="22"/>
-              </w:rPr>
-              <w:t xml:space="preserve"> эскалаторов изменить режим работы станции</w:t>
+              <w:t>При остановке и невозможности реверсации эскалаторов изменить режим работы станции</w:t>
             </w:r>
           </w:p>
         </w:tc>
@@ -29157,9 +28321,8 @@
           <w:bCs/>
           <w:szCs w:val="22"/>
         </w:rPr>
-        <w:t xml:space="preserve">Код </w:t>
-      </w:r>
-      <w:proofErr w:type="gramStart"/>
+        <w:t xml:space="preserve">Код ННР </w:t>
+      </w:r>
       <w:r>
         <w:rPr>
           <w:rFonts w:eastAsiaTheme="minorHAnsi" w:cstheme="minorBidi"/>
@@ -29167,15 +28330,6 @@
           <w:bCs/>
           <w:szCs w:val="22"/>
         </w:rPr>
-        <w:t xml:space="preserve">ННР </w:t>
-      </w:r>
-      <w:r>
-        <w:rPr>
-          <w:rFonts w:eastAsiaTheme="minorHAnsi" w:cstheme="minorBidi"/>
-          <w:b/>
-          <w:bCs/>
-          <w:szCs w:val="22"/>
-        </w:rPr>
         <w:t> </w:t>
       </w:r>
       <w:r>
@@ -29183,15 +28337,7 @@
           <w:rFonts w:eastAsiaTheme="minorHAnsi" w:cstheme="minorBidi"/>
           <w:szCs w:val="22"/>
         </w:rPr>
-        <w:t>—</w:t>
-      </w:r>
-      <w:proofErr w:type="gramEnd"/>
-      <w:r>
-        <w:rPr>
-          <w:rFonts w:eastAsiaTheme="minorHAnsi" w:cstheme="minorBidi"/>
-          <w:szCs w:val="22"/>
-        </w:rPr>
-        <w:t xml:space="preserve"> </w:t>
+        <w:t xml:space="preserve">— </w:t>
       </w:r>
       <w:r>
         <w:rPr>
@@ -29252,7 +28398,6 @@
         <w:shd w:val="clear" w:color="auto" w:fill="FFFFFF"/>
         <w:spacing w:before="120" w:beforeAutospacing="0" w:after="120" w:afterAutospacing="0" w:line="420" w:lineRule="atLeast"/>
       </w:pPr>
-      <w:proofErr w:type="gramStart"/>
       <w:r>
         <w:rPr>
           <w:rFonts w:eastAsiaTheme="minorHAnsi" w:cstheme="minorBidi"/>
@@ -29276,15 +28421,7 @@
           <w:rFonts w:eastAsiaTheme="minorHAnsi" w:cstheme="minorBidi"/>
           <w:szCs w:val="22"/>
         </w:rPr>
-        <w:t>—</w:t>
-      </w:r>
-      <w:proofErr w:type="gramEnd"/>
-      <w:r>
-        <w:rPr>
-          <w:rFonts w:eastAsiaTheme="minorHAnsi" w:cstheme="minorBidi"/>
-          <w:szCs w:val="22"/>
-        </w:rPr>
-        <w:t xml:space="preserve"> </w:t>
+        <w:t xml:space="preserve">— </w:t>
       </w:r>
       <w:r>
         <w:rPr>
@@ -29439,7 +28576,7 @@
           <w:szCs w:val="22"/>
         </w:rPr>
       </w:pPr>
-      <w:commentRangeStart w:id="20"/>
+      <w:commentRangeStart w:id="21"/>
       <w:r>
         <w:rPr>
           <w:rFonts w:eastAsiaTheme="minorHAnsi" w:cstheme="minorBidi"/>
@@ -29463,12 +28600,12 @@
         </w:rPr>
         <w:t xml:space="preserve"> название объекта уровня 1 согласно справочнику уровней инфраструктуры. </w:t>
       </w:r>
-      <w:commentRangeEnd w:id="20"/>
+      <w:commentRangeEnd w:id="21"/>
       <w:r>
         <w:rPr>
           <w:rStyle w:val="af4"/>
         </w:rPr>
-        <w:commentReference w:id="20"/>
+        <w:commentReference w:id="21"/>
       </w:r>
     </w:p>
     <w:p>
@@ -29726,26 +28863,13 @@
           <w:bCs/>
           <w:color w:val="5B9BD5" w:themeColor="accent1"/>
         </w:rPr>
-        <w:t>дерева (</w:t>
-      </w:r>
-      <w:proofErr w:type="gramStart"/>
-      <w:r>
-        <w:rPr>
-          <w:b/>
-          <w:bCs/>
-          <w:color w:val="5B9BD5" w:themeColor="accent1"/>
-        </w:rPr>
-        <w:t xml:space="preserve">домена) </w:t>
+        <w:t xml:space="preserve">дерева (домена) </w:t>
       </w:r>
       <w:r>
         <w:t> </w:t>
       </w:r>
       <w:r>
-        <w:t xml:space="preserve"> </w:t>
-      </w:r>
-      <w:proofErr w:type="gramEnd"/>
-      <w:r>
-        <w:t xml:space="preserve">уровни 2-5 </w:t>
+        <w:t xml:space="preserve"> уровни 2-5 </w:t>
       </w:r>
       <w:r>
         <w:t>с автоматическим обновлением связей;</w:t>
@@ -29797,11 +28921,7 @@
         <w:t> (</w:t>
       </w:r>
       <w:r>
-        <w:t xml:space="preserve">добавление </w:t>
-      </w:r>
-      <w:proofErr w:type="gramStart"/>
-      <w:r>
-        <w:t xml:space="preserve">на </w:t>
+        <w:t xml:space="preserve">добавление на </w:t>
       </w:r>
       <w:r>
         <w:t xml:space="preserve"> </w:t>
@@ -29809,7 +28929,6 @@
       <w:r>
         <w:t>позицию</w:t>
       </w:r>
-      <w:proofErr w:type="gramEnd"/>
       <w:r>
         <w:t xml:space="preserve">, перемещение между </w:t>
       </w:r>
@@ -29971,19 +29090,11 @@
           <w:highlight w:val="darkGray"/>
         </w:rPr>
       </w:pPr>
-      <w:proofErr w:type="gramStart"/>
       <w:r>
         <w:rPr>
           <w:highlight w:val="darkGray"/>
         </w:rPr>
-        <w:t>Макет  организационной</w:t>
-      </w:r>
-      <w:proofErr w:type="gramEnd"/>
-      <w:r>
-        <w:rPr>
-          <w:highlight w:val="darkGray"/>
-        </w:rPr>
-        <w:t xml:space="preserve"> структуры функционального подчинения</w:t>
+        <w:t>Макет  организационной структуры функционального подчинения</w:t>
       </w:r>
     </w:p>
     <w:p>
@@ -29992,11 +29103,7 @@
         <w:shd w:val="clear" w:color="auto" w:fill="FFFFFF"/>
       </w:pPr>
       <w:r>
-        <w:t xml:space="preserve">Уровни </w:t>
-      </w:r>
-      <w:proofErr w:type="spellStart"/>
-      <w:r>
-        <w:t>о</w:t>
+        <w:t>Уровни о</w:t>
       </w:r>
       <w:r>
         <w:t>рганизационна</w:t>
@@ -30004,7 +29111,6 @@
       <w:r>
         <w:t>й</w:t>
       </w:r>
-      <w:proofErr w:type="spellEnd"/>
       <w:r>
         <w:t xml:space="preserve"> структура</w:t>
       </w:r>
@@ -30172,13 +29278,8 @@
             <w:pPr>
               <w:pStyle w:val="affd"/>
             </w:pPr>
-            <w:proofErr w:type="spellStart"/>
-            <w:r>
-              <w:t>Подведы</w:t>
-            </w:r>
-            <w:proofErr w:type="spellEnd"/>
-            <w:r>
-              <w:t xml:space="preserve"> или отдельные частные организации</w:t>
+            <w:r>
+              <w:t>Подведы или отдельные частные организации</w:t>
             </w:r>
           </w:p>
         </w:tc>
@@ -30281,15 +29382,7 @@
               <w:t xml:space="preserve"> </w:t>
             </w:r>
             <w:r>
-              <w:t xml:space="preserve">Крупные блоки внутри </w:t>
-            </w:r>
-            <w:proofErr w:type="spellStart"/>
-            <w:r>
-              <w:t>подведа</w:t>
-            </w:r>
-            <w:proofErr w:type="spellEnd"/>
-            <w:r>
-              <w:t xml:space="preserve">, департаменты, Дирекции, аппараты. </w:t>
+              <w:t xml:space="preserve">Крупные блоки внутри подведа, департаменты, Дирекции, аппараты. </w:t>
             </w:r>
           </w:p>
         </w:tc>
@@ -30316,7 +29409,6 @@
             <w:pPr>
               <w:pStyle w:val="affd"/>
             </w:pPr>
-            <w:proofErr w:type="spellStart"/>
             <w:r>
               <w:rPr>
                 <w:b/>
@@ -30325,7 +29417,6 @@
               </w:rPr>
               <w:t>Подветви</w:t>
             </w:r>
-            <w:proofErr w:type="spellEnd"/>
           </w:p>
         </w:tc>
         <w:tc>
@@ -30423,11 +29514,7 @@
         <w:pStyle w:val="affd"/>
       </w:pPr>
       <w:r>
-        <w:t>├─</w:t>
-      </w:r>
-      <w:proofErr w:type="gramStart"/>
-      <w:r>
-        <w:t xml:space="preserve">─  </w:t>
+        <w:t xml:space="preserve">├──  </w:t>
       </w:r>
       <w:r>
         <w:rPr>
@@ -30435,16 +29522,595 @@
           <w:bCs/>
           <w:color w:val="2E74B5" w:themeColor="accent1" w:themeShade="BF"/>
         </w:rPr>
-        <w:t>ГУП</w:t>
-      </w:r>
-      <w:proofErr w:type="gramEnd"/>
+        <w:t xml:space="preserve">ГУП </w:t>
+      </w:r>
       <w:r>
         <w:rPr>
           <w:b/>
           <w:bCs/>
           <w:color w:val="2E74B5" w:themeColor="accent1" w:themeShade="BF"/>
         </w:rPr>
+        <w:t>Метрополитен</w:t>
+      </w:r>
+    </w:p>
+    <w:p>
+      <w:pPr>
+        <w:pStyle w:val="affd"/>
+        <w:rPr>
+          <w:b/>
+          <w:bCs/>
+          <w:color w:val="FF0000"/>
+        </w:rPr>
+      </w:pPr>
+      <w:r>
+        <w:t xml:space="preserve">│   ├── </w:t>
+      </w:r>
+      <w:r>
+        <w:rPr>
+          <w:b/>
+          <w:bCs/>
+          <w:color w:val="FF0000"/>
+        </w:rPr>
+        <w:t>Начальник метрополитена</w:t>
+      </w:r>
+    </w:p>
+    <w:p>
+      <w:pPr>
+        <w:pStyle w:val="affd"/>
+        <w:rPr>
+          <w:b/>
+          <w:bCs/>
+          <w:color w:val="BF8F00" w:themeColor="accent4" w:themeShade="BF"/>
+        </w:rPr>
+      </w:pPr>
+      <w:r>
+        <w:t xml:space="preserve">│             ├── </w:t>
+      </w:r>
+      <w:r>
+        <w:rPr>
+          <w:b/>
+          <w:bCs/>
+          <w:color w:val="FF0000"/>
+        </w:rPr>
+        <w:t>Начальник Дирекции инфраструктуры</w:t>
+      </w:r>
+    </w:p>
+    <w:p>
+      <w:pPr>
+        <w:pStyle w:val="affd"/>
+      </w:pPr>
+      <w:r>
+        <w:t xml:space="preserve">│                       ├── </w:t>
+      </w:r>
+      <w:r>
+        <w:rPr>
+          <w:b/>
+          <w:bCs/>
+          <w:color w:val="C45911" w:themeColor="accent2" w:themeShade="BF"/>
+        </w:rPr>
+        <w:t>ЕДЦ</w:t>
+      </w:r>
+    </w:p>
+    <w:p>
+      <w:pPr>
+        <w:pStyle w:val="affd"/>
+        <w:rPr>
+          <w:b/>
+          <w:bCs/>
+          <w:color w:val="FF0000"/>
+        </w:rPr>
+      </w:pPr>
+      <w:r>
+        <w:t xml:space="preserve">│                                ├── </w:t>
+      </w:r>
+      <w:r>
+        <w:rPr>
+          <w:b/>
+          <w:bCs/>
+          <w:color w:val="FF0000"/>
+        </w:rPr>
+        <w:t>Дежурный по ММ</w:t>
+      </w:r>
+    </w:p>
+    <w:p>
+      <w:pPr>
+        <w:pStyle w:val="affd"/>
+        <w:rPr>
+          <w:b/>
+          <w:bCs/>
+          <w:color w:val="BF8F00" w:themeColor="accent4" w:themeShade="BF"/>
+        </w:rPr>
+      </w:pPr>
+      <w:r>
+        <w:t xml:space="preserve">│                                         ├── </w:t>
+      </w:r>
+      <w:r>
+        <w:rPr>
+          <w:b/>
+          <w:bCs/>
+          <w:color w:val="BF8F00" w:themeColor="accent4" w:themeShade="BF"/>
+        </w:rPr>
+        <w:t>Служба внешних связей</w:t>
+      </w:r>
+    </w:p>
+    <w:p>
+      <w:pPr>
+        <w:pStyle w:val="affd"/>
+      </w:pPr>
+      <w:r>
+        <w:t xml:space="preserve">│                                         ├── </w:t>
+      </w:r>
+      <w:r>
+        <w:rPr>
+          <w:b/>
+          <w:bCs/>
+          <w:color w:val="BF8F00" w:themeColor="accent4" w:themeShade="BF"/>
+        </w:rPr>
+        <w:t>Служба безопасности</w:t>
+      </w:r>
+    </w:p>
+    <w:p>
+      <w:pPr>
+        <w:pStyle w:val="affd"/>
+        <w:rPr>
+          <w:b/>
+          <w:bCs/>
+          <w:color w:val="C45911" w:themeColor="accent2" w:themeShade="BF"/>
+        </w:rPr>
+      </w:pPr>
+      <w:r>
+        <w:t xml:space="preserve">│                                         ├── </w:t>
+      </w:r>
+      <w:r>
+        <w:rPr>
+          <w:b/>
+          <w:bCs/>
+          <w:color w:val="C45911" w:themeColor="accent2" w:themeShade="BF"/>
+        </w:rPr>
+        <w:t>Дирекция информационно-технологических систем</w:t>
+      </w:r>
+    </w:p>
+    <w:p>
+      <w:pPr>
+        <w:pStyle w:val="affd"/>
+        <w:rPr>
+          <w:b/>
+          <w:bCs/>
+          <w:color w:val="BF8F00" w:themeColor="accent4" w:themeShade="BF"/>
+        </w:rPr>
+      </w:pPr>
+      <w:r>
+        <w:t>│</w:t>
+      </w:r>
+      <w:r>
+        <w:t xml:space="preserve">                                         </w:t>
+      </w:r>
+      <w:r>
+        <w:t xml:space="preserve">├── </w:t>
+      </w:r>
+      <w:r>
+        <w:rPr>
+          <w:b/>
+          <w:bCs/>
+          <w:color w:val="BF8F00" w:themeColor="accent4" w:themeShade="BF"/>
+        </w:rPr>
+        <w:t>Служба подвижного состава</w:t>
+      </w:r>
+    </w:p>
+    <w:p>
+      <w:pPr>
+        <w:pStyle w:val="affd"/>
+        <w:rPr>
+          <w:b/>
+          <w:bCs/>
+          <w:color w:val="BF8F00" w:themeColor="accent4" w:themeShade="BF"/>
+        </w:rPr>
+      </w:pPr>
+      <w:r>
+        <w:t>│</w:t>
+      </w:r>
+      <w:r>
+        <w:t xml:space="preserve">                                         </w:t>
+      </w:r>
+      <w:r>
+        <w:t xml:space="preserve">├── </w:t>
+      </w:r>
+      <w:r>
+        <w:rPr>
+          <w:b/>
+          <w:bCs/>
+          <w:color w:val="BF8F00" w:themeColor="accent4" w:themeShade="BF"/>
+        </w:rPr>
+        <w:t>Служба движения</w:t>
+      </w:r>
+    </w:p>
+    <w:p>
+      <w:pPr>
+        <w:pStyle w:val="affd"/>
+        <w:rPr>
+          <w:b/>
+          <w:bCs/>
+          <w:color w:val="BF8F00" w:themeColor="accent4" w:themeShade="BF"/>
+        </w:rPr>
+      </w:pPr>
+      <w:r>
+        <w:t>│</w:t>
+      </w:r>
+      <w:r>
+        <w:t xml:space="preserve">                                         </w:t>
+      </w:r>
+      <w:r>
+        <w:t xml:space="preserve">├── </w:t>
+      </w:r>
+      <w:r>
+        <w:rPr>
+          <w:b/>
+          <w:bCs/>
+          <w:color w:val="BF8F00" w:themeColor="accent4" w:themeShade="BF"/>
+        </w:rPr>
+        <w:t>Отдел пожарной охраны</w:t>
+      </w:r>
+    </w:p>
+    <w:p>
+      <w:pPr>
+        <w:pStyle w:val="affd"/>
+        <w:rPr>
+          <w:b/>
+          <w:bCs/>
+          <w:color w:val="C45911" w:themeColor="accent2" w:themeShade="BF"/>
+        </w:rPr>
+      </w:pPr>
+      <w:r>
+        <w:t>│</w:t>
+      </w:r>
+      <w:r>
+        <w:t xml:space="preserve">                                         </w:t>
+      </w:r>
+      <w:r>
+        <w:t xml:space="preserve">├── </w:t>
+      </w:r>
+      <w:r>
+        <w:rPr>
+          <w:b/>
+          <w:bCs/>
+          <w:color w:val="C45911" w:themeColor="accent2" w:themeShade="BF"/>
+        </w:rPr>
+        <w:t>Аппарат главного ревизора по безопасности движения поездов</w:t>
+      </w:r>
+    </w:p>
+    <w:p>
+      <w:pPr>
+        <w:pStyle w:val="affd"/>
+        <w:rPr>
+          <w:b/>
+          <w:bCs/>
+          <w:color w:val="BF8F00" w:themeColor="accent4" w:themeShade="BF"/>
+        </w:rPr>
+      </w:pPr>
+      <w:r>
+        <w:t>│</w:t>
+      </w:r>
+      <w:r>
+        <w:t xml:space="preserve">                                         </w:t>
+      </w:r>
+      <w:r>
+        <w:t xml:space="preserve">├── </w:t>
+      </w:r>
+      <w:r>
+        <w:rPr>
+          <w:b/>
+          <w:bCs/>
+          <w:color w:val="BF8F00" w:themeColor="accent4" w:themeShade="BF"/>
+        </w:rPr>
+        <w:t>Представитель</w:t>
+      </w:r>
+      <w:r>
+        <w:rPr>
+          <w:b/>
+          <w:bCs/>
+          <w:color w:val="BF8F00" w:themeColor="accent4" w:themeShade="BF"/>
+        </w:rPr>
+        <w:t xml:space="preserve">: </w:t>
+      </w:r>
+      <w:r>
+        <w:rPr>
+          <w:b/>
+          <w:bCs/>
+          <w:color w:val="BF8F00" w:themeColor="accent4" w:themeShade="BF"/>
+        </w:rPr>
+        <w:t>ООО «Метровагонмаш-Сервис»</w:t>
+      </w:r>
+    </w:p>
+    <w:p>
+      <w:pPr>
+        <w:pStyle w:val="affd"/>
+        <w:rPr>
+          <w:b/>
+          <w:bCs/>
+          <w:color w:val="BF8F00" w:themeColor="accent4" w:themeShade="BF"/>
+        </w:rPr>
+      </w:pPr>
+      <w:r>
+        <w:t>│</w:t>
+      </w:r>
+      <w:r>
+        <w:t xml:space="preserve">                                         </w:t>
+      </w:r>
+      <w:r>
+        <w:t xml:space="preserve">├── </w:t>
+      </w:r>
+      <w:r>
+        <w:rPr>
+          <w:b/>
+          <w:bCs/>
+          <w:color w:val="BF8F00" w:themeColor="accent4" w:themeShade="BF"/>
+        </w:rPr>
+        <w:t>Представитель</w:t>
+      </w:r>
+      <w:r>
+        <w:rPr>
+          <w:b/>
+          <w:bCs/>
+          <w:color w:val="BF8F00" w:themeColor="accent4" w:themeShade="BF"/>
+        </w:rPr>
+        <w:t xml:space="preserve">: </w:t>
+      </w:r>
+      <w:r>
+        <w:rPr>
+          <w:b/>
+          <w:bCs/>
+          <w:color w:val="BF8F00" w:themeColor="accent4" w:themeShade="BF"/>
+        </w:rPr>
+        <w:t>ЦОДД</w:t>
+      </w:r>
+    </w:p>
+    <w:p>
+      <w:pPr>
+        <w:pStyle w:val="affd"/>
+        <w:rPr>
+          <w:b/>
+          <w:bCs/>
+          <w:color w:val="BF8F00" w:themeColor="accent4" w:themeShade="BF"/>
+        </w:rPr>
+      </w:pPr>
+      <w:r>
+        <w:t>│</w:t>
+      </w:r>
+      <w:r>
+        <w:t xml:space="preserve">                                         </w:t>
+      </w:r>
+      <w:r>
+        <w:t xml:space="preserve">├── </w:t>
+      </w:r>
+      <w:r>
+        <w:rPr>
+          <w:b/>
+          <w:bCs/>
+          <w:color w:val="BF8F00" w:themeColor="accent4" w:themeShade="BF"/>
+        </w:rPr>
+        <w:t>Отдел управления содержанием инфраструктуры</w:t>
+      </w:r>
+    </w:p>
+    <w:p>
+      <w:pPr>
+        <w:pStyle w:val="affd"/>
+        <w:rPr>
+          <w:b/>
+          <w:bCs/>
+          <w:color w:val="BF8F00" w:themeColor="accent4" w:themeShade="BF"/>
+        </w:rPr>
+      </w:pPr>
+      <w:r>
+        <w:t>│</w:t>
+      </w:r>
+      <w:r>
+        <w:t xml:space="preserve">                                         </w:t>
+      </w:r>
+      <w:r>
+        <w:t xml:space="preserve">├── </w:t>
+      </w:r>
+      <w:r>
+        <w:rPr>
+          <w:b/>
+          <w:bCs/>
+          <w:color w:val="BF8F00" w:themeColor="accent4" w:themeShade="BF"/>
+        </w:rPr>
+        <w:t xml:space="preserve">Служба сигнализации, централизации и блокировки </w:t>
+      </w:r>
+    </w:p>
+    <w:p>
+      <w:pPr>
+        <w:pStyle w:val="affd"/>
+        <w:rPr>
+          <w:b/>
+          <w:bCs/>
+          <w:color w:val="BF8F00" w:themeColor="accent4" w:themeShade="BF"/>
+        </w:rPr>
+      </w:pPr>
+      <w:r>
+        <w:lastRenderedPageBreak/>
+        <w:t>│</w:t>
+      </w:r>
+      <w:r>
+        <w:t xml:space="preserve">                                         </w:t>
+      </w:r>
+      <w:r>
+        <w:t xml:space="preserve">├── </w:t>
+      </w:r>
+      <w:r>
+        <w:rPr>
+          <w:b/>
+          <w:bCs/>
+          <w:color w:val="BF8F00" w:themeColor="accent4" w:themeShade="BF"/>
+        </w:rPr>
+        <w:t>Служба пути и искусственных сооружений</w:t>
+      </w:r>
+      <w:r>
+        <w:rPr>
+          <w:b/>
+          <w:bCs/>
+          <w:color w:val="BF8F00" w:themeColor="accent4" w:themeShade="BF"/>
+        </w:rPr>
         <w:t xml:space="preserve"> </w:t>
+      </w:r>
+    </w:p>
+    <w:p>
+      <w:pPr>
+        <w:pStyle w:val="affd"/>
+        <w:rPr>
+          <w:b/>
+          <w:bCs/>
+          <w:color w:val="BF8F00" w:themeColor="accent4" w:themeShade="BF"/>
+        </w:rPr>
+      </w:pPr>
+      <w:r>
+        <w:t>│</w:t>
+      </w:r>
+      <w:r>
+        <w:t xml:space="preserve">                                         </w:t>
+      </w:r>
+      <w:r>
+        <w:t xml:space="preserve">├── </w:t>
+      </w:r>
+      <w:r>
+        <w:rPr>
+          <w:b/>
+          <w:bCs/>
+          <w:color w:val="BF8F00" w:themeColor="accent4" w:themeShade="BF"/>
+        </w:rPr>
+        <w:t>Служба пассажирских обсустройств</w:t>
+      </w:r>
+      <w:r>
+        <w:rPr>
+          <w:b/>
+          <w:bCs/>
+          <w:color w:val="BF8F00" w:themeColor="accent4" w:themeShade="BF"/>
+        </w:rPr>
+        <w:t xml:space="preserve"> </w:t>
+      </w:r>
+    </w:p>
+    <w:p>
+      <w:pPr>
+        <w:pStyle w:val="affd"/>
+        <w:rPr>
+          <w:b/>
+          <w:bCs/>
+          <w:color w:val="BF8F00" w:themeColor="accent4" w:themeShade="BF"/>
+        </w:rPr>
+      </w:pPr>
+      <w:r>
+        <w:t>│</w:t>
+      </w:r>
+      <w:r>
+        <w:t xml:space="preserve">                                         </w:t>
+      </w:r>
+      <w:r>
+        <w:t xml:space="preserve">├── </w:t>
+      </w:r>
+      <w:r>
+        <w:rPr>
+          <w:b/>
+          <w:bCs/>
+          <w:color w:val="BF8F00" w:themeColor="accent4" w:themeShade="BF"/>
+        </w:rPr>
+        <w:t>Служба электроснабжения</w:t>
+      </w:r>
+      <w:r>
+        <w:rPr>
+          <w:b/>
+          <w:bCs/>
+          <w:color w:val="BF8F00" w:themeColor="accent4" w:themeShade="BF"/>
+        </w:rPr>
+        <w:t xml:space="preserve"> </w:t>
+      </w:r>
+    </w:p>
+    <w:p>
+      <w:pPr>
+        <w:pStyle w:val="affd"/>
+        <w:rPr>
+          <w:b/>
+          <w:bCs/>
+          <w:color w:val="BF8F00" w:themeColor="accent4" w:themeShade="BF"/>
+        </w:rPr>
+      </w:pPr>
+      <w:r>
+        <w:t>│</w:t>
+      </w:r>
+      <w:r>
+        <w:t xml:space="preserve">                                         </w:t>
+      </w:r>
+      <w:r>
+        <w:t xml:space="preserve">├── </w:t>
+      </w:r>
+      <w:r>
+        <w:rPr>
+          <w:b/>
+          <w:bCs/>
+          <w:color w:val="BF8F00" w:themeColor="accent4" w:themeShade="BF"/>
+        </w:rPr>
+        <w:t>Электромеханическая служба</w:t>
+      </w:r>
+    </w:p>
+    <w:p>
+      <w:pPr>
+        <w:pStyle w:val="affd"/>
+        <w:rPr>
+          <w:b/>
+          <w:bCs/>
+          <w:color w:val="BF8F00" w:themeColor="accent4" w:themeShade="BF"/>
+        </w:rPr>
+      </w:pPr>
+      <w:r>
+        <w:t>│</w:t>
+      </w:r>
+      <w:r>
+        <w:t xml:space="preserve">                                         </w:t>
+      </w:r>
+      <w:r>
+        <w:t xml:space="preserve">├── </w:t>
+      </w:r>
+      <w:r>
+        <w:rPr>
+          <w:b/>
+          <w:bCs/>
+          <w:color w:val="BF8F00" w:themeColor="accent4" w:themeShade="BF"/>
+        </w:rPr>
+        <w:t>Эскалаторная служба</w:t>
+      </w:r>
+    </w:p>
+    <w:p>
+      <w:pPr>
+        <w:pStyle w:val="affd"/>
+        <w:rPr>
+          <w:b/>
+          <w:bCs/>
+          <w:color w:val="BF8F00" w:themeColor="accent4" w:themeShade="BF"/>
+        </w:rPr>
+      </w:pPr>
+      <w:r>
+        <w:t>│</w:t>
+      </w:r>
+      <w:r>
+        <w:t xml:space="preserve">                                         </w:t>
+      </w:r>
+      <w:r>
+        <w:t xml:space="preserve">├── </w:t>
+      </w:r>
+      <w:r>
+        <w:rPr>
+          <w:b/>
+          <w:bCs/>
+          <w:color w:val="BF8F00" w:themeColor="accent4" w:themeShade="BF"/>
+        </w:rPr>
+        <w:t xml:space="preserve">Отдел управления наземным транспортом </w:t>
+      </w:r>
+    </w:p>
+    <w:p>
+      <w:pPr>
+        <w:pStyle w:val="affd"/>
+      </w:pPr>
+      <w:r>
+        <w:t xml:space="preserve">├──  </w:t>
       </w:r>
       <w:r>
         <w:rPr>
@@ -30452,601 +30118,7 @@
           <w:bCs/>
           <w:color w:val="2E74B5" w:themeColor="accent1" w:themeShade="BF"/>
         </w:rPr>
-        <w:t>Метрополитен</w:t>
-      </w:r>
-    </w:p>
-    <w:p>
-      <w:pPr>
-        <w:pStyle w:val="affd"/>
-        <w:rPr>
-          <w:b/>
-          <w:bCs/>
-          <w:color w:val="FF0000"/>
-        </w:rPr>
-      </w:pPr>
-      <w:r>
-        <w:t xml:space="preserve">│   ├── </w:t>
-      </w:r>
-      <w:r>
-        <w:rPr>
-          <w:b/>
-          <w:bCs/>
-          <w:color w:val="FF0000"/>
-        </w:rPr>
-        <w:t>Начальник метрополитена</w:t>
-      </w:r>
-    </w:p>
-    <w:p>
-      <w:pPr>
-        <w:pStyle w:val="affd"/>
-        <w:rPr>
-          <w:b/>
-          <w:bCs/>
-          <w:color w:val="BF8F00" w:themeColor="accent4" w:themeShade="BF"/>
-        </w:rPr>
-      </w:pPr>
-      <w:r>
-        <w:t xml:space="preserve">│             ├── </w:t>
-      </w:r>
-      <w:r>
-        <w:rPr>
-          <w:b/>
-          <w:bCs/>
-          <w:color w:val="FF0000"/>
-        </w:rPr>
-        <w:t>Начальник Дирекции инфраструктуры</w:t>
-      </w:r>
-    </w:p>
-    <w:p>
-      <w:pPr>
-        <w:pStyle w:val="affd"/>
-      </w:pPr>
-      <w:r>
-        <w:t xml:space="preserve">│                       ├── </w:t>
-      </w:r>
-      <w:r>
-        <w:rPr>
-          <w:b/>
-          <w:bCs/>
-          <w:color w:val="C45911" w:themeColor="accent2" w:themeShade="BF"/>
-        </w:rPr>
-        <w:t>ЕДЦ</w:t>
-      </w:r>
-    </w:p>
-    <w:p>
-      <w:pPr>
-        <w:pStyle w:val="affd"/>
-        <w:rPr>
-          <w:b/>
-          <w:bCs/>
-          <w:color w:val="FF0000"/>
-        </w:rPr>
-      </w:pPr>
-      <w:r>
-        <w:t xml:space="preserve">│                                ├── </w:t>
-      </w:r>
-      <w:r>
-        <w:rPr>
-          <w:b/>
-          <w:bCs/>
-          <w:color w:val="FF0000"/>
-        </w:rPr>
-        <w:t>Дежурный по ММ</w:t>
-      </w:r>
-    </w:p>
-    <w:p>
-      <w:pPr>
-        <w:pStyle w:val="affd"/>
-        <w:rPr>
-          <w:b/>
-          <w:bCs/>
-          <w:color w:val="BF8F00" w:themeColor="accent4" w:themeShade="BF"/>
-        </w:rPr>
-      </w:pPr>
-      <w:r>
-        <w:t xml:space="preserve">│                                         ├── </w:t>
-      </w:r>
-      <w:r>
-        <w:rPr>
-          <w:b/>
-          <w:bCs/>
-          <w:color w:val="BF8F00" w:themeColor="accent4" w:themeShade="BF"/>
-        </w:rPr>
-        <w:t>Служба внешних связей</w:t>
-      </w:r>
-    </w:p>
-    <w:p>
-      <w:pPr>
-        <w:pStyle w:val="affd"/>
-      </w:pPr>
-      <w:r>
-        <w:t xml:space="preserve">│                                         ├── </w:t>
-      </w:r>
-      <w:r>
-        <w:rPr>
-          <w:b/>
-          <w:bCs/>
-          <w:color w:val="BF8F00" w:themeColor="accent4" w:themeShade="BF"/>
-        </w:rPr>
-        <w:t>Служба безопасности</w:t>
-      </w:r>
-    </w:p>
-    <w:p>
-      <w:pPr>
-        <w:pStyle w:val="affd"/>
-        <w:rPr>
-          <w:b/>
-          <w:bCs/>
-          <w:color w:val="C45911" w:themeColor="accent2" w:themeShade="BF"/>
-        </w:rPr>
-      </w:pPr>
-      <w:r>
-        <w:t xml:space="preserve">│                                         ├── </w:t>
-      </w:r>
-      <w:r>
-        <w:rPr>
-          <w:b/>
-          <w:bCs/>
-          <w:color w:val="C45911" w:themeColor="accent2" w:themeShade="BF"/>
-        </w:rPr>
-        <w:t>Дирекция информационно-технологических систем</w:t>
-      </w:r>
-    </w:p>
-    <w:p>
-      <w:pPr>
-        <w:pStyle w:val="affd"/>
-        <w:rPr>
-          <w:b/>
-          <w:bCs/>
-          <w:color w:val="BF8F00" w:themeColor="accent4" w:themeShade="BF"/>
-        </w:rPr>
-      </w:pPr>
-      <w:r>
-        <w:t>│</w:t>
-      </w:r>
-      <w:r>
-        <w:t xml:space="preserve">                                         </w:t>
-      </w:r>
-      <w:r>
-        <w:t xml:space="preserve">├── </w:t>
-      </w:r>
-      <w:r>
-        <w:rPr>
-          <w:b/>
-          <w:bCs/>
-          <w:color w:val="BF8F00" w:themeColor="accent4" w:themeShade="BF"/>
-        </w:rPr>
-        <w:t>Служба подвижного состава</w:t>
-      </w:r>
-    </w:p>
-    <w:p>
-      <w:pPr>
-        <w:pStyle w:val="affd"/>
-        <w:rPr>
-          <w:b/>
-          <w:bCs/>
-          <w:color w:val="BF8F00" w:themeColor="accent4" w:themeShade="BF"/>
-        </w:rPr>
-      </w:pPr>
-      <w:r>
-        <w:t>│</w:t>
-      </w:r>
-      <w:r>
-        <w:t xml:space="preserve">                                         </w:t>
-      </w:r>
-      <w:r>
-        <w:t xml:space="preserve">├── </w:t>
-      </w:r>
-      <w:r>
-        <w:rPr>
-          <w:b/>
-          <w:bCs/>
-          <w:color w:val="BF8F00" w:themeColor="accent4" w:themeShade="BF"/>
-        </w:rPr>
-        <w:t>Служба движения</w:t>
-      </w:r>
-    </w:p>
-    <w:p>
-      <w:pPr>
-        <w:pStyle w:val="affd"/>
-        <w:rPr>
-          <w:b/>
-          <w:bCs/>
-          <w:color w:val="BF8F00" w:themeColor="accent4" w:themeShade="BF"/>
-        </w:rPr>
-      </w:pPr>
-      <w:r>
-        <w:t>│</w:t>
-      </w:r>
-      <w:r>
-        <w:t xml:space="preserve">                                         </w:t>
-      </w:r>
-      <w:r>
-        <w:t xml:space="preserve">├── </w:t>
-      </w:r>
-      <w:r>
-        <w:rPr>
-          <w:b/>
-          <w:bCs/>
-          <w:color w:val="BF8F00" w:themeColor="accent4" w:themeShade="BF"/>
-        </w:rPr>
-        <w:t>Отдел пожарной охраны</w:t>
-      </w:r>
-    </w:p>
-    <w:p>
-      <w:pPr>
-        <w:pStyle w:val="affd"/>
-        <w:rPr>
-          <w:b/>
-          <w:bCs/>
-          <w:color w:val="C45911" w:themeColor="accent2" w:themeShade="BF"/>
-        </w:rPr>
-      </w:pPr>
-      <w:r>
-        <w:t>│</w:t>
-      </w:r>
-      <w:r>
-        <w:t xml:space="preserve">                                         </w:t>
-      </w:r>
-      <w:r>
-        <w:t xml:space="preserve">├── </w:t>
-      </w:r>
-      <w:r>
-        <w:rPr>
-          <w:b/>
-          <w:bCs/>
-          <w:color w:val="C45911" w:themeColor="accent2" w:themeShade="BF"/>
-        </w:rPr>
-        <w:t>Аппарат главного ревизора по безопасности движения поездов</w:t>
-      </w:r>
-    </w:p>
-    <w:p>
-      <w:pPr>
-        <w:pStyle w:val="affd"/>
-        <w:rPr>
-          <w:b/>
-          <w:bCs/>
-          <w:color w:val="BF8F00" w:themeColor="accent4" w:themeShade="BF"/>
-        </w:rPr>
-      </w:pPr>
-      <w:r>
-        <w:t>│</w:t>
-      </w:r>
-      <w:r>
-        <w:t xml:space="preserve">                                         </w:t>
-      </w:r>
-      <w:r>
-        <w:t xml:space="preserve">├── </w:t>
-      </w:r>
-      <w:r>
-        <w:rPr>
-          <w:b/>
-          <w:bCs/>
-          <w:color w:val="BF8F00" w:themeColor="accent4" w:themeShade="BF"/>
-        </w:rPr>
-        <w:t>Представитель</w:t>
-      </w:r>
-      <w:r>
-        <w:rPr>
-          <w:b/>
-          <w:bCs/>
-          <w:color w:val="BF8F00" w:themeColor="accent4" w:themeShade="BF"/>
-        </w:rPr>
-        <w:t xml:space="preserve">: </w:t>
-      </w:r>
-      <w:r>
-        <w:rPr>
-          <w:b/>
-          <w:bCs/>
-          <w:color w:val="BF8F00" w:themeColor="accent4" w:themeShade="BF"/>
-        </w:rPr>
-        <w:t>ООО «Метровагонмаш-Сервис»</w:t>
-      </w:r>
-    </w:p>
-    <w:p>
-      <w:pPr>
-        <w:pStyle w:val="affd"/>
-        <w:rPr>
-          <w:b/>
-          <w:bCs/>
-          <w:color w:val="BF8F00" w:themeColor="accent4" w:themeShade="BF"/>
-        </w:rPr>
-      </w:pPr>
-      <w:r>
-        <w:t>│</w:t>
-      </w:r>
-      <w:r>
-        <w:t xml:space="preserve">                                         </w:t>
-      </w:r>
-      <w:r>
-        <w:t xml:space="preserve">├── </w:t>
-      </w:r>
-      <w:r>
-        <w:rPr>
-          <w:b/>
-          <w:bCs/>
-          <w:color w:val="BF8F00" w:themeColor="accent4" w:themeShade="BF"/>
-        </w:rPr>
-        <w:t>Представитель</w:t>
-      </w:r>
-      <w:r>
-        <w:rPr>
-          <w:b/>
-          <w:bCs/>
-          <w:color w:val="BF8F00" w:themeColor="accent4" w:themeShade="BF"/>
-        </w:rPr>
-        <w:t xml:space="preserve">: </w:t>
-      </w:r>
-      <w:r>
-        <w:rPr>
-          <w:b/>
-          <w:bCs/>
-          <w:color w:val="BF8F00" w:themeColor="accent4" w:themeShade="BF"/>
-        </w:rPr>
-        <w:t>ЦОДД</w:t>
-      </w:r>
-    </w:p>
-    <w:p>
-      <w:pPr>
-        <w:pStyle w:val="affd"/>
-        <w:rPr>
-          <w:b/>
-          <w:bCs/>
-          <w:color w:val="BF8F00" w:themeColor="accent4" w:themeShade="BF"/>
-        </w:rPr>
-      </w:pPr>
-      <w:r>
-        <w:t>│</w:t>
-      </w:r>
-      <w:r>
-        <w:t xml:space="preserve">                                         </w:t>
-      </w:r>
-      <w:r>
-        <w:t xml:space="preserve">├── </w:t>
-      </w:r>
-      <w:r>
-        <w:rPr>
-          <w:b/>
-          <w:bCs/>
-          <w:color w:val="BF8F00" w:themeColor="accent4" w:themeShade="BF"/>
-        </w:rPr>
-        <w:t>Отдел управления содержанием инфраструктуры</w:t>
-      </w:r>
-    </w:p>
-    <w:p>
-      <w:pPr>
-        <w:pStyle w:val="affd"/>
-        <w:rPr>
-          <w:b/>
-          <w:bCs/>
-          <w:color w:val="BF8F00" w:themeColor="accent4" w:themeShade="BF"/>
-        </w:rPr>
-      </w:pPr>
-      <w:r>
-        <w:t>│</w:t>
-      </w:r>
-      <w:r>
-        <w:t xml:space="preserve">                                         </w:t>
-      </w:r>
-      <w:r>
-        <w:t xml:space="preserve">├── </w:t>
-      </w:r>
-      <w:r>
-        <w:rPr>
-          <w:b/>
-          <w:bCs/>
-          <w:color w:val="BF8F00" w:themeColor="accent4" w:themeShade="BF"/>
-        </w:rPr>
-        <w:t xml:space="preserve">Служба сигнализации, централизации и блокировки </w:t>
-      </w:r>
-    </w:p>
-    <w:p>
-      <w:pPr>
-        <w:pStyle w:val="affd"/>
-        <w:rPr>
-          <w:b/>
-          <w:bCs/>
-          <w:color w:val="BF8F00" w:themeColor="accent4" w:themeShade="BF"/>
-        </w:rPr>
-      </w:pPr>
-      <w:r>
-        <w:lastRenderedPageBreak/>
-        <w:t>│</w:t>
-      </w:r>
-      <w:r>
-        <w:t xml:space="preserve">                                         </w:t>
-      </w:r>
-      <w:r>
-        <w:t xml:space="preserve">├── </w:t>
-      </w:r>
-      <w:r>
-        <w:rPr>
-          <w:b/>
-          <w:bCs/>
-          <w:color w:val="BF8F00" w:themeColor="accent4" w:themeShade="BF"/>
-        </w:rPr>
-        <w:t>Служба пути и искусственных сооружений</w:t>
-      </w:r>
-      <w:r>
-        <w:rPr>
-          <w:b/>
-          <w:bCs/>
-          <w:color w:val="BF8F00" w:themeColor="accent4" w:themeShade="BF"/>
-        </w:rPr>
-        <w:t xml:space="preserve"> </w:t>
-      </w:r>
-    </w:p>
-    <w:p>
-      <w:pPr>
-        <w:pStyle w:val="affd"/>
-        <w:rPr>
-          <w:b/>
-          <w:bCs/>
-          <w:color w:val="BF8F00" w:themeColor="accent4" w:themeShade="BF"/>
-        </w:rPr>
-      </w:pPr>
-      <w:r>
-        <w:t>│</w:t>
-      </w:r>
-      <w:r>
-        <w:t xml:space="preserve">                                         </w:t>
-      </w:r>
-      <w:r>
-        <w:t xml:space="preserve">├── </w:t>
-      </w:r>
-      <w:r>
-        <w:rPr>
-          <w:b/>
-          <w:bCs/>
-          <w:color w:val="BF8F00" w:themeColor="accent4" w:themeShade="BF"/>
-        </w:rPr>
-        <w:t xml:space="preserve">Служба пассажирских </w:t>
-      </w:r>
-      <w:proofErr w:type="spellStart"/>
-      <w:r>
-        <w:rPr>
-          <w:b/>
-          <w:bCs/>
-          <w:color w:val="BF8F00" w:themeColor="accent4" w:themeShade="BF"/>
-        </w:rPr>
-        <w:t>обсустройств</w:t>
-      </w:r>
-      <w:proofErr w:type="spellEnd"/>
-      <w:r>
-        <w:rPr>
-          <w:b/>
-          <w:bCs/>
-          <w:color w:val="BF8F00" w:themeColor="accent4" w:themeShade="BF"/>
-        </w:rPr>
-        <w:t xml:space="preserve"> </w:t>
-      </w:r>
-    </w:p>
-    <w:p>
-      <w:pPr>
-        <w:pStyle w:val="affd"/>
-        <w:rPr>
-          <w:b/>
-          <w:bCs/>
-          <w:color w:val="BF8F00" w:themeColor="accent4" w:themeShade="BF"/>
-        </w:rPr>
-      </w:pPr>
-      <w:r>
-        <w:t>│</w:t>
-      </w:r>
-      <w:r>
-        <w:t xml:space="preserve">                                         </w:t>
-      </w:r>
-      <w:r>
-        <w:t xml:space="preserve">├── </w:t>
-      </w:r>
-      <w:r>
-        <w:rPr>
-          <w:b/>
-          <w:bCs/>
-          <w:color w:val="BF8F00" w:themeColor="accent4" w:themeShade="BF"/>
-        </w:rPr>
-        <w:t>Служба электроснабжения</w:t>
-      </w:r>
-      <w:r>
-        <w:rPr>
-          <w:b/>
-          <w:bCs/>
-          <w:color w:val="BF8F00" w:themeColor="accent4" w:themeShade="BF"/>
-        </w:rPr>
-        <w:t xml:space="preserve"> </w:t>
-      </w:r>
-    </w:p>
-    <w:p>
-      <w:pPr>
-        <w:pStyle w:val="affd"/>
-        <w:rPr>
-          <w:b/>
-          <w:bCs/>
-          <w:color w:val="BF8F00" w:themeColor="accent4" w:themeShade="BF"/>
-        </w:rPr>
-      </w:pPr>
-      <w:r>
-        <w:t>│</w:t>
-      </w:r>
-      <w:r>
-        <w:t xml:space="preserve">                                         </w:t>
-      </w:r>
-      <w:r>
-        <w:t xml:space="preserve">├── </w:t>
-      </w:r>
-      <w:r>
-        <w:rPr>
-          <w:b/>
-          <w:bCs/>
-          <w:color w:val="BF8F00" w:themeColor="accent4" w:themeShade="BF"/>
-        </w:rPr>
-        <w:t>Электромеханическая служба</w:t>
-      </w:r>
-    </w:p>
-    <w:p>
-      <w:pPr>
-        <w:pStyle w:val="affd"/>
-        <w:rPr>
-          <w:b/>
-          <w:bCs/>
-          <w:color w:val="BF8F00" w:themeColor="accent4" w:themeShade="BF"/>
-        </w:rPr>
-      </w:pPr>
-      <w:r>
-        <w:t>│</w:t>
-      </w:r>
-      <w:r>
-        <w:t xml:space="preserve">                                         </w:t>
-      </w:r>
-      <w:r>
-        <w:t xml:space="preserve">├── </w:t>
-      </w:r>
-      <w:r>
-        <w:rPr>
-          <w:b/>
-          <w:bCs/>
-          <w:color w:val="BF8F00" w:themeColor="accent4" w:themeShade="BF"/>
-        </w:rPr>
-        <w:t>Эскалаторная служба</w:t>
-      </w:r>
-    </w:p>
-    <w:p>
-      <w:pPr>
-        <w:pStyle w:val="affd"/>
-        <w:rPr>
-          <w:b/>
-          <w:bCs/>
-          <w:color w:val="BF8F00" w:themeColor="accent4" w:themeShade="BF"/>
-        </w:rPr>
-      </w:pPr>
-      <w:r>
-        <w:t>│</w:t>
-      </w:r>
-      <w:r>
-        <w:t xml:space="preserve">                                         </w:t>
-      </w:r>
-      <w:r>
-        <w:t xml:space="preserve">├── </w:t>
-      </w:r>
-      <w:r>
-        <w:rPr>
-          <w:b/>
-          <w:bCs/>
-          <w:color w:val="BF8F00" w:themeColor="accent4" w:themeShade="BF"/>
-        </w:rPr>
-        <w:t xml:space="preserve">Отдел управления наземным транспортом </w:t>
-      </w:r>
-    </w:p>
-    <w:p>
-      <w:pPr>
-        <w:pStyle w:val="affd"/>
-      </w:pPr>
-      <w:r>
-        <w:t>├─</w:t>
-      </w:r>
-      <w:proofErr w:type="gramStart"/>
-      <w:r>
-        <w:t xml:space="preserve">─  </w:t>
+        <w:t xml:space="preserve">ГУП </w:t>
       </w:r>
       <w:r>
         <w:rPr>
@@ -31054,16 +30126,20 @@
           <w:bCs/>
           <w:color w:val="2E74B5" w:themeColor="accent1" w:themeShade="BF"/>
         </w:rPr>
-        <w:t>ГУП</w:t>
-      </w:r>
-      <w:proofErr w:type="gramEnd"/>
-      <w:r>
+        <w:t>Мосгортранс</w:t>
+      </w:r>
+    </w:p>
+    <w:p>
+      <w:pPr>
+        <w:pStyle w:val="affd"/>
         <w:rPr>
           <w:b/>
           <w:bCs/>
           <w:color w:val="2E74B5" w:themeColor="accent1" w:themeShade="BF"/>
         </w:rPr>
-        <w:t xml:space="preserve"> </w:t>
+      </w:pPr>
+      <w:r>
+        <w:t xml:space="preserve">├──  </w:t>
       </w:r>
       <w:r>
         <w:rPr>
@@ -31071,24 +30147,15 @@
           <w:bCs/>
           <w:color w:val="2E74B5" w:themeColor="accent1" w:themeShade="BF"/>
         </w:rPr>
-        <w:t>Мосгортранс</w:t>
-      </w:r>
-    </w:p>
-    <w:p>
-      <w:pPr>
-        <w:pStyle w:val="affd"/>
+        <w:t>Г</w:t>
+      </w:r>
+      <w:r>
         <w:rPr>
           <w:b/>
           <w:bCs/>
           <w:color w:val="2E74B5" w:themeColor="accent1" w:themeShade="BF"/>
         </w:rPr>
-      </w:pPr>
-      <w:r>
-        <w:t>├─</w:t>
-      </w:r>
-      <w:proofErr w:type="gramStart"/>
-      <w:r>
-        <w:t xml:space="preserve">─  </w:t>
+        <w:t>КУ</w:t>
       </w:r>
       <w:r>
         <w:rPr>
@@ -31096,7 +30163,7 @@
           <w:bCs/>
           <w:color w:val="2E74B5" w:themeColor="accent1" w:themeShade="BF"/>
         </w:rPr>
-        <w:t>Г</w:t>
+        <w:t xml:space="preserve"> </w:t>
       </w:r>
       <w:r>
         <w:rPr>
@@ -31104,16 +30171,20 @@
           <w:bCs/>
           <w:color w:val="2E74B5" w:themeColor="accent1" w:themeShade="BF"/>
         </w:rPr>
-        <w:t>КУ</w:t>
-      </w:r>
-      <w:proofErr w:type="gramEnd"/>
-      <w:r>
+        <w:t>Организатор перевозок</w:t>
+      </w:r>
+    </w:p>
+    <w:p>
+      <w:pPr>
+        <w:pStyle w:val="affd"/>
         <w:rPr>
           <w:b/>
           <w:bCs/>
           <w:color w:val="2E74B5" w:themeColor="accent1" w:themeShade="BF"/>
         </w:rPr>
-        <w:t xml:space="preserve"> </w:t>
+      </w:pPr>
+      <w:r>
+        <w:t xml:space="preserve">├──  </w:t>
       </w:r>
       <w:r>
         <w:rPr>
@@ -31121,24 +30192,15 @@
           <w:bCs/>
           <w:color w:val="2E74B5" w:themeColor="accent1" w:themeShade="BF"/>
         </w:rPr>
-        <w:t>Организатор перевозок</w:t>
-      </w:r>
-    </w:p>
-    <w:p>
-      <w:pPr>
-        <w:pStyle w:val="affd"/>
+        <w:t>Г</w:t>
+      </w:r>
+      <w:r>
         <w:rPr>
           <w:b/>
           <w:bCs/>
           <w:color w:val="2E74B5" w:themeColor="accent1" w:themeShade="BF"/>
         </w:rPr>
-      </w:pPr>
-      <w:r>
-        <w:t>├─</w:t>
-      </w:r>
-      <w:proofErr w:type="gramStart"/>
-      <w:r>
-        <w:t xml:space="preserve">─  </w:t>
+        <w:t>КУ</w:t>
       </w:r>
       <w:r>
         <w:rPr>
@@ -31146,7 +30208,7 @@
           <w:bCs/>
           <w:color w:val="2E74B5" w:themeColor="accent1" w:themeShade="BF"/>
         </w:rPr>
-        <w:t>Г</w:t>
+        <w:t xml:space="preserve"> </w:t>
       </w:r>
       <w:r>
         <w:rPr>
@@ -31154,16 +30216,20 @@
           <w:bCs/>
           <w:color w:val="2E74B5" w:themeColor="accent1" w:themeShade="BF"/>
         </w:rPr>
-        <w:t>КУ</w:t>
-      </w:r>
-      <w:proofErr w:type="gramEnd"/>
-      <w:r>
+        <w:t xml:space="preserve">АМПП </w:t>
+      </w:r>
+    </w:p>
+    <w:p>
+      <w:pPr>
+        <w:pStyle w:val="affd"/>
         <w:rPr>
           <w:b/>
           <w:bCs/>
           <w:color w:val="2E74B5" w:themeColor="accent1" w:themeShade="BF"/>
         </w:rPr>
-        <w:t xml:space="preserve"> </w:t>
+      </w:pPr>
+      <w:r>
+        <w:t xml:space="preserve">├──  </w:t>
       </w:r>
       <w:r>
         <w:rPr>
@@ -31171,42 +30237,16 @@
           <w:bCs/>
           <w:color w:val="2E74B5" w:themeColor="accent1" w:themeShade="BF"/>
         </w:rPr>
-        <w:t xml:space="preserve">АМПП </w:t>
-      </w:r>
-    </w:p>
-    <w:p>
-      <w:pPr>
-        <w:pStyle w:val="affd"/>
+        <w:t>Г</w:t>
+      </w:r>
+      <w:r>
         <w:rPr>
           <w:b/>
           <w:bCs/>
           <w:color w:val="2E74B5" w:themeColor="accent1" w:themeShade="BF"/>
         </w:rPr>
-      </w:pPr>
-      <w:r>
-        <w:t>├─</w:t>
-      </w:r>
-      <w:proofErr w:type="gramStart"/>
-      <w:r>
-        <w:t xml:space="preserve">─  </w:t>
-      </w:r>
-      <w:r>
-        <w:rPr>
-          <w:b/>
-          <w:bCs/>
-          <w:color w:val="2E74B5" w:themeColor="accent1" w:themeShade="BF"/>
-        </w:rPr>
-        <w:t>Г</w:t>
-      </w:r>
-      <w:r>
-        <w:rPr>
-          <w:b/>
-          <w:bCs/>
-          <w:color w:val="2E74B5" w:themeColor="accent1" w:themeShade="BF"/>
-        </w:rPr>
         <w:t>КУ</w:t>
       </w:r>
-      <w:proofErr w:type="gramEnd"/>
       <w:r>
         <w:rPr>
           <w:b/>
@@ -31603,7 +30643,7 @@
                           <pic:cNvPicPr/>
                         </pic:nvPicPr>
                         <pic:blipFill>
-                          <a:blip r:embed="rId15"/>
+                          <a:blip r:embed="rId14"/>
                           <a:stretch>
                             <a:fillRect/>
                           </a:stretch>
@@ -32230,15 +31270,7 @@
         <w:t>экрана</w:t>
       </w:r>
       <w:r>
-        <w:t xml:space="preserve"> «</w:t>
-      </w:r>
-      <w:proofErr w:type="gramStart"/>
-      <w:r>
-        <w:t>Карточка  организации</w:t>
-      </w:r>
-      <w:proofErr w:type="gramEnd"/>
-      <w:r>
-        <w:t>»</w:t>
+        <w:t xml:space="preserve"> «Карточка  организации»</w:t>
       </w:r>
     </w:p>
     <w:p>
@@ -32343,7 +31375,7 @@
           <w:highlight w:val="darkGray"/>
         </w:rPr>
       </w:pPr>
-      <w:bookmarkStart w:id="21" w:name="_Ref215158504"/>
+      <w:bookmarkStart w:id="22" w:name="_Ref215158504"/>
       <w:r>
         <w:rPr>
           <w:highlight w:val="darkGray"/>
@@ -32351,7 +31383,7 @@
         <w:lastRenderedPageBreak/>
         <w:t>Справочник «ОПФ»</w:t>
       </w:r>
-      <w:bookmarkEnd w:id="21"/>
+      <w:bookmarkEnd w:id="22"/>
     </w:p>
     <w:p>
       <w:pPr>
@@ -38086,21 +37118,7 @@
         <w:rPr>
           <w:highlight w:val="darkGray"/>
         </w:rPr>
-        <w:t xml:space="preserve">Статусная модель домена (организации 1-го </w:t>
-      </w:r>
-      <w:proofErr w:type="gramStart"/>
-      <w:r>
-        <w:rPr>
-          <w:highlight w:val="darkGray"/>
-        </w:rPr>
-        <w:t>уровня)  блока</w:t>
-      </w:r>
-      <w:proofErr w:type="gramEnd"/>
-      <w:r>
-        <w:rPr>
-          <w:highlight w:val="darkGray"/>
-        </w:rPr>
-        <w:t xml:space="preserve"> администрирования организационной структуры функционального подчинения</w:t>
+        <w:t>Статусная модель домена (организации 1-го уровня)  блока администрирования организационной структуры функционального подчинения</w:t>
       </w:r>
     </w:p>
     <w:p>
@@ -38399,33 +37417,15 @@
                 <w:sz w:val="20"/>
                 <w:szCs w:val="20"/>
               </w:rPr>
-              <w:t xml:space="preserve">.  Выпадающий </w:t>
-            </w:r>
-            <w:proofErr w:type="gramStart"/>
-            <w:r>
-              <w:rPr>
-                <w:color w:val="000000"/>
-                <w:sz w:val="20"/>
-                <w:szCs w:val="20"/>
-              </w:rPr>
-              <w:t xml:space="preserve">список, </w:t>
-            </w:r>
-            <w:r>
-              <w:rPr>
-                <w:color w:val="000000"/>
-                <w:sz w:val="20"/>
-                <w:szCs w:val="20"/>
-              </w:rPr>
-              <w:t xml:space="preserve">  </w:t>
-            </w:r>
-            <w:proofErr w:type="gramEnd"/>
-            <w:r>
-              <w:rPr>
-                <w:color w:val="000000"/>
-                <w:sz w:val="20"/>
-                <w:szCs w:val="20"/>
-              </w:rPr>
-              <w:t xml:space="preserve">При выборе «Архив» в выпадающем списке проверить наличие </w:t>
+              <w:t xml:space="preserve">.  Выпадающий список, </w:t>
+            </w:r>
+            <w:r>
+              <w:rPr>
+                <w:color w:val="000000"/>
+                <w:sz w:val="20"/>
+                <w:szCs w:val="20"/>
+              </w:rPr>
+              <w:t xml:space="preserve">  При выборе «Архив» в выпадающем списке проверить наличие </w:t>
             </w:r>
             <w:r>
               <w:rPr>
@@ -39521,8 +38521,8 @@
 </file>
 
 <file path=word/comments.xml><?xml version="1.0" encoding="utf-8"?>
-<w:comments xmlns:wpc="http://schemas.microsoft.com/office/word/2010/wordprocessingCanvas" xmlns:cx="http://schemas.microsoft.com/office/drawing/2014/chartex" xmlns:cx1="http://schemas.microsoft.com/office/drawing/2015/9/8/chartex" xmlns:cx2="http://schemas.microsoft.com/office/drawing/2015/10/21/chartex" xmlns:cx3="http://schemas.microsoft.com/office/drawing/2016/5/9/chartex" xmlns:cx4="http://schemas.microsoft.com/office/drawing/2016/5/10/chartex" xmlns:cx5="http://schemas.microsoft.com/office/drawing/2016/5/11/chartex" xmlns:cx6="http://schemas.microsoft.com/office/drawing/2016/5/12/chartex" xmlns:cx7="http://schemas.microsoft.com/office/drawing/2016/5/13/chartex" xmlns:cx8="http://schemas.microsoft.com/office/drawing/2016/5/14/chartex" xmlns:mc="http://schemas.openxmlformats.org/markup-compatibility/2006" xmlns:aink="http://schemas.microsoft.com/office/drawing/2016/ink" xmlns:am3d="http://schemas.microsoft.com/office/drawing/2017/model3d" xmlns:o="urn:schemas-microsoft-com:office:office" xmlns:oel="http://schemas.microsoft.com/office/2019/extlst" xmlns:r="http://schemas.openxmlformats.org/officeDocument/2006/relationships" xmlns:m="http://schemas.openxmlformats.org/officeDocument/2006/math" xmlns:v="urn:schemas-microsoft-com:vml" xmlns:wp14="http://schemas.microsoft.com/office/word/2010/wordprocessingDrawing" xmlns:wp="http://schemas.openxmlformats.org/drawingml/2006/wordprocessingDrawing" xmlns:w10="urn:schemas-microsoft-com:office:word" xmlns:w="http://schemas.openxmlformats.org/wordprocessingml/2006/main" xmlns:w14="http://schemas.microsoft.com/office/word/2010/wordml" xmlns:w15="http://schemas.microsoft.com/office/word/2012/wordml" xmlns:w16cex="http://schemas.microsoft.com/office/word/2018/wordml/cex" xmlns:w16cid="http://schemas.microsoft.com/office/word/2016/wordml/cid" xmlns:w16="http://schemas.microsoft.com/office/word/2018/wordml" xmlns:w16sdtdh="http://schemas.microsoft.com/office/word/2020/wordml/sdtdatahash" xmlns:w16se="http://schemas.microsoft.com/office/word/2015/wordml/symex" xmlns:wpg="http://schemas.microsoft.com/office/word/2010/wordprocessingGroup" xmlns:wpi="http://schemas.microsoft.com/office/word/2010/wordprocessingInk" xmlns:wne="http://schemas.microsoft.com/office/word/2006/wordml" xmlns:wps="http://schemas.microsoft.com/office/word/2010/wordprocessingShape" mc:Ignorable="w14 w15 w16se w16cid w16 w16cex w16sdtdh wp14">
-  <w:comment w:id="4" w:author="Игорь Трусов" w:date="2025-12-03T00:44:00Z" w:initials="ИТ">
+<w:comments xmlns:wpc="http://schemas.microsoft.com/office/word/2010/wordprocessingCanvas" xmlns:cx="http://schemas.microsoft.com/office/drawing/2014/chartex" xmlns:cx1="http://schemas.microsoft.com/office/drawing/2015/9/8/chartex" xmlns:cx2="http://schemas.microsoft.com/office/drawing/2015/10/21/chartex" xmlns:cx3="http://schemas.microsoft.com/office/drawing/2016/5/9/chartex" xmlns:cx4="http://schemas.microsoft.com/office/drawing/2016/5/10/chartex" xmlns:cx5="http://schemas.microsoft.com/office/drawing/2016/5/11/chartex" xmlns:cx6="http://schemas.microsoft.com/office/drawing/2016/5/12/chartex" xmlns:cx7="http://schemas.microsoft.com/office/drawing/2016/5/13/chartex" xmlns:cx8="http://schemas.microsoft.com/office/drawing/2016/5/14/chartex" xmlns:mc="http://schemas.openxmlformats.org/markup-compatibility/2006" xmlns:aink="http://schemas.microsoft.com/office/drawing/2016/ink" xmlns:am3d="http://schemas.microsoft.com/office/drawing/2017/model3d" xmlns:o="urn:schemas-microsoft-com:office:office" xmlns:r="http://schemas.openxmlformats.org/officeDocument/2006/relationships" xmlns:m="http://schemas.openxmlformats.org/officeDocument/2006/math" xmlns:v="urn:schemas-microsoft-com:vml" xmlns:wp14="http://schemas.microsoft.com/office/word/2010/wordprocessingDrawing" xmlns:wp="http://schemas.openxmlformats.org/drawingml/2006/wordprocessingDrawing" xmlns:w10="urn:schemas-microsoft-com:office:word" xmlns:w="http://schemas.openxmlformats.org/wordprocessingml/2006/main" xmlns:w14="http://schemas.microsoft.com/office/word/2010/wordml" xmlns:w15="http://schemas.microsoft.com/office/word/2012/wordml" xmlns:w16cid="http://schemas.microsoft.com/office/word/2016/wordml/cid" xmlns:w16se="http://schemas.microsoft.com/office/word/2015/wordml/symex" xmlns:wpg="http://schemas.microsoft.com/office/word/2010/wordprocessingGroup" xmlns:wpi="http://schemas.microsoft.com/office/word/2010/wordprocessingInk" xmlns:wne="http://schemas.microsoft.com/office/word/2006/wordml" xmlns:wps="http://schemas.microsoft.com/office/word/2010/wordprocessingShape" mc:Ignorable="w14 w15 w16se w16cid wp14">
+  <w:comment w:id="5" w:author="Игорь Трусов" w:date="2025-12-03T00:44:00Z" w:initials="ИТ">
     <w:p>
       <w:pPr>
         <w:pStyle w:val="afb"/>
@@ -39538,7 +38538,7 @@
       </w:r>
     </w:p>
   </w:comment>
-  <w:comment w:id="8" w:author="Alexey Ivakhin" w:date="2025-11-12T18:02:00Z" w:initials="AI">
+  <w:comment w:id="9" w:author="Alexey Ivakhin" w:date="2025-11-12T18:02:00Z" w:initials="AI">
     <w:p>
       <w:pPr>
         <w:pStyle w:val="afb"/>
@@ -39554,7 +38554,7 @@
       </w:r>
     </w:p>
   </w:comment>
-  <w:comment w:id="10" w:author="Alexey Ivakhin" w:date="2025-11-12T18:17:00Z" w:initials="AI">
+  <w:comment w:id="11" w:author="Alexey Ivakhin" w:date="2025-11-12T18:17:00Z" w:initials="AI">
     <w:p>
       <w:pPr>
         <w:pStyle w:val="afb"/>
@@ -39566,19 +38566,11 @@
         <w:annotationRef/>
       </w:r>
       <w:r>
-        <w:t xml:space="preserve">Не </w:t>
-      </w:r>
-      <w:proofErr w:type="gramStart"/>
-      <w:r>
-        <w:t>понял</w:t>
-      </w:r>
-      <w:proofErr w:type="gramEnd"/>
-      <w:r>
-        <w:t xml:space="preserve"> чем отличается от Шаблона. Это же одна и та же сущность будет.</w:t>
+        <w:t>Не понял чем отличается от Шаблона. Это же одна и та же сущность будет.</w:t>
       </w:r>
     </w:p>
   </w:comment>
-  <w:comment w:id="11" w:author="Игорь Трусов" w:date="2025-11-05T00:40:00Z" w:initials="ИТ">
+  <w:comment w:id="12" w:author="Игорь Трусов" w:date="2025-11-05T00:40:00Z" w:initials="ИТ">
     <w:p>
       <w:pPr>
         <w:pStyle w:val="afb"/>
@@ -39608,7 +38600,7 @@
       </w:r>
     </w:p>
   </w:comment>
-  <w:comment w:id="20" w:author="Игорь Трусов" w:date="2025-12-07T04:29:00Z" w:initials="ИТ">
+  <w:comment w:id="21" w:author="Игорь Трусов" w:date="2025-12-07T04:29:00Z" w:initials="ИТ">
     <w:p>
       <w:pPr>
         <w:pStyle w:val="afb"/>
@@ -39620,20 +38612,15 @@
         <w:annotationRef/>
       </w:r>
       <w:r>
-        <w:t xml:space="preserve">Справочник уровней объектов должен сделать Алексей </w:t>
-      </w:r>
-      <w:proofErr w:type="spellStart"/>
-      <w:r>
-        <w:t>булычев</w:t>
-      </w:r>
-      <w:proofErr w:type="spellEnd"/>
+        <w:t>Справочник уровней объектов должен сделать Алексей булычев</w:t>
+      </w:r>
     </w:p>
   </w:comment>
 </w:comments>
 </file>
 
 <file path=word/commentsExtended.xml><?xml version="1.0" encoding="utf-8"?>
-<w15:commentsEx xmlns:wpc="http://schemas.microsoft.com/office/word/2010/wordprocessingCanvas" xmlns:cx="http://schemas.microsoft.com/office/drawing/2014/chartex" xmlns:cx1="http://schemas.microsoft.com/office/drawing/2015/9/8/chartex" xmlns:cx2="http://schemas.microsoft.com/office/drawing/2015/10/21/chartex" xmlns:cx3="http://schemas.microsoft.com/office/drawing/2016/5/9/chartex" xmlns:cx4="http://schemas.microsoft.com/office/drawing/2016/5/10/chartex" xmlns:cx5="http://schemas.microsoft.com/office/drawing/2016/5/11/chartex" xmlns:cx6="http://schemas.microsoft.com/office/drawing/2016/5/12/chartex" xmlns:cx7="http://schemas.microsoft.com/office/drawing/2016/5/13/chartex" xmlns:cx8="http://schemas.microsoft.com/office/drawing/2016/5/14/chartex" xmlns:mc="http://schemas.openxmlformats.org/markup-compatibility/2006" xmlns:aink="http://schemas.microsoft.com/office/drawing/2016/ink" xmlns:am3d="http://schemas.microsoft.com/office/drawing/2017/model3d" xmlns:o="urn:schemas-microsoft-com:office:office" xmlns:oel="http://schemas.microsoft.com/office/2019/extlst" xmlns:r="http://schemas.openxmlformats.org/officeDocument/2006/relationships" xmlns:m="http://schemas.openxmlformats.org/officeDocument/2006/math" xmlns:v="urn:schemas-microsoft-com:vml" xmlns:wp14="http://schemas.microsoft.com/office/word/2010/wordprocessingDrawing" xmlns:wp="http://schemas.openxmlformats.org/drawingml/2006/wordprocessingDrawing" xmlns:w10="urn:schemas-microsoft-com:office:word" xmlns:w="http://schemas.openxmlformats.org/wordprocessingml/2006/main" xmlns:w14="http://schemas.microsoft.com/office/word/2010/wordml" xmlns:w15="http://schemas.microsoft.com/office/word/2012/wordml" xmlns:w16cex="http://schemas.microsoft.com/office/word/2018/wordml/cex" xmlns:w16cid="http://schemas.microsoft.com/office/word/2016/wordml/cid" xmlns:w16="http://schemas.microsoft.com/office/word/2018/wordml" xmlns:w16sdtdh="http://schemas.microsoft.com/office/word/2020/wordml/sdtdatahash" xmlns:w16se="http://schemas.microsoft.com/office/word/2015/wordml/symex" xmlns:wpg="http://schemas.microsoft.com/office/word/2010/wordprocessingGroup" xmlns:wpi="http://schemas.microsoft.com/office/word/2010/wordprocessingInk" xmlns:wne="http://schemas.microsoft.com/office/word/2006/wordml" xmlns:wps="http://schemas.microsoft.com/office/word/2010/wordprocessingShape" mc:Ignorable="w14 w15 w16se w16cid w16 w16cex w16sdtdh wp14">
+<w15:commentsEx xmlns:wpc="http://schemas.microsoft.com/office/word/2010/wordprocessingCanvas" xmlns:cx="http://schemas.microsoft.com/office/drawing/2014/chartex" xmlns:cx1="http://schemas.microsoft.com/office/drawing/2015/9/8/chartex" xmlns:cx2="http://schemas.microsoft.com/office/drawing/2015/10/21/chartex" xmlns:cx3="http://schemas.microsoft.com/office/drawing/2016/5/9/chartex" xmlns:cx4="http://schemas.microsoft.com/office/drawing/2016/5/10/chartex" xmlns:cx5="http://schemas.microsoft.com/office/drawing/2016/5/11/chartex" xmlns:cx6="http://schemas.microsoft.com/office/drawing/2016/5/12/chartex" xmlns:cx7="http://schemas.microsoft.com/office/drawing/2016/5/13/chartex" xmlns:cx8="http://schemas.microsoft.com/office/drawing/2016/5/14/chartex" xmlns:mc="http://schemas.openxmlformats.org/markup-compatibility/2006" xmlns:aink="http://schemas.microsoft.com/office/drawing/2016/ink" xmlns:am3d="http://schemas.microsoft.com/office/drawing/2017/model3d" xmlns:o="urn:schemas-microsoft-com:office:office" xmlns:r="http://schemas.openxmlformats.org/officeDocument/2006/relationships" xmlns:m="http://schemas.openxmlformats.org/officeDocument/2006/math" xmlns:v="urn:schemas-microsoft-com:vml" xmlns:wp14="http://schemas.microsoft.com/office/word/2010/wordprocessingDrawing" xmlns:wp="http://schemas.openxmlformats.org/drawingml/2006/wordprocessingDrawing" xmlns:w10="urn:schemas-microsoft-com:office:word" xmlns:w="http://schemas.openxmlformats.org/wordprocessingml/2006/main" xmlns:w14="http://schemas.microsoft.com/office/word/2010/wordml" xmlns:w15="http://schemas.microsoft.com/office/word/2012/wordml" xmlns:w16cid="http://schemas.microsoft.com/office/word/2016/wordml/cid" xmlns:w16se="http://schemas.microsoft.com/office/word/2015/wordml/symex" xmlns:wpg="http://schemas.microsoft.com/office/word/2010/wordprocessingGroup" xmlns:wpi="http://schemas.microsoft.com/office/word/2010/wordprocessingInk" xmlns:wne="http://schemas.microsoft.com/office/word/2006/wordml" xmlns:wps="http://schemas.microsoft.com/office/word/2010/wordprocessingShape" mc:Ignorable="w14 w15 w16se w16cid wp14">
   <w15:commentEx w15:paraId="5702E993" w15:done="0"/>
   <w15:commentEx w15:paraId="5A30AF7E" w15:done="0"/>
   <w15:commentEx w15:paraId="093A1822" w15:done="0"/>
@@ -39642,17 +38629,8 @@
 </w15:commentsEx>
 </file>
 
-<file path=word/commentsExtensible.xml><?xml version="1.0" encoding="utf-8"?>
-<w16cex:commentsExtensible xmlns:wpc="http://schemas.microsoft.com/office/word/2010/wordprocessingCanvas" xmlns:cx="http://schemas.microsoft.com/office/drawing/2014/chartex" xmlns:cx1="http://schemas.microsoft.com/office/drawing/2015/9/8/chartex" xmlns:cx2="http://schemas.microsoft.com/office/drawing/2015/10/21/chartex" xmlns:cx3="http://schemas.microsoft.com/office/drawing/2016/5/9/chartex" xmlns:cx4="http://schemas.microsoft.com/office/drawing/2016/5/10/chartex" xmlns:cx5="http://schemas.microsoft.com/office/drawing/2016/5/11/chartex" xmlns:cx6="http://schemas.microsoft.com/office/drawing/2016/5/12/chartex" xmlns:cx7="http://schemas.microsoft.com/office/drawing/2016/5/13/chartex" xmlns:cx8="http://schemas.microsoft.com/office/drawing/2016/5/14/chartex" xmlns:mc="http://schemas.openxmlformats.org/markup-compatibility/2006" xmlns:aink="http://schemas.microsoft.com/office/drawing/2016/ink" xmlns:am3d="http://schemas.microsoft.com/office/drawing/2017/model3d" xmlns:o="urn:schemas-microsoft-com:office:office" xmlns:oel="http://schemas.microsoft.com/office/2019/extlst" xmlns:r="http://schemas.openxmlformats.org/officeDocument/2006/relationships" xmlns:m="http://schemas.openxmlformats.org/officeDocument/2006/math" xmlns:v="urn:schemas-microsoft-com:vml" xmlns:wp14="http://schemas.microsoft.com/office/word/2010/wordprocessingDrawing" xmlns:wp="http://schemas.openxmlformats.org/drawingml/2006/wordprocessingDrawing" xmlns:w10="urn:schemas-microsoft-com:office:word" xmlns:w="http://schemas.openxmlformats.org/wordprocessingml/2006/main" xmlns:w14="http://schemas.microsoft.com/office/word/2010/wordml" xmlns:w15="http://schemas.microsoft.com/office/word/2012/wordml" xmlns:w16cex="http://schemas.microsoft.com/office/word/2018/wordml/cex" xmlns:w16cid="http://schemas.microsoft.com/office/word/2016/wordml/cid" xmlns:w16="http://schemas.microsoft.com/office/word/2018/wordml" xmlns:w16sdtdh="http://schemas.microsoft.com/office/word/2020/wordml/sdtdatahash" xmlns:w16se="http://schemas.microsoft.com/office/word/2015/wordml/symex" xmlns:wpg="http://schemas.microsoft.com/office/word/2010/wordprocessingGroup" xmlns:wpi="http://schemas.microsoft.com/office/word/2010/wordprocessingInk" xmlns:wne="http://schemas.microsoft.com/office/word/2006/wordml" xmlns:wps="http://schemas.microsoft.com/office/word/2010/wordprocessingShape" mc:Ignorable="w14 w15 w16se w16cid w16 w16cex w16sdtdh wp14">
-  <w16cex:commentExtensible w16cex:durableId="05CF9F81" w16cex:dateUtc="2025-12-02T21:44:00Z"/>
-  <w16cex:commentExtensible w16cex:durableId="71BA8FA2" w16cex:dateUtc="2025-11-12T15:02:00Z"/>
-  <w16cex:commentExtensible w16cex:durableId="50888A36" w16cex:dateUtc="2025-11-12T15:17:00Z"/>
-  <w16cex:commentExtensible w16cex:durableId="2D191856" w16cex:dateUtc="2025-12-07T01:29:00Z"/>
-</w16cex:commentsExtensible>
-</file>
-
 <file path=word/commentsIds.xml><?xml version="1.0" encoding="utf-8"?>
-<w16cid:commentsIds xmlns:wpc="http://schemas.microsoft.com/office/word/2010/wordprocessingCanvas" xmlns:cx="http://schemas.microsoft.com/office/drawing/2014/chartex" xmlns:cx1="http://schemas.microsoft.com/office/drawing/2015/9/8/chartex" xmlns:cx2="http://schemas.microsoft.com/office/drawing/2015/10/21/chartex" xmlns:cx3="http://schemas.microsoft.com/office/drawing/2016/5/9/chartex" xmlns:cx4="http://schemas.microsoft.com/office/drawing/2016/5/10/chartex" xmlns:cx5="http://schemas.microsoft.com/office/drawing/2016/5/11/chartex" xmlns:cx6="http://schemas.microsoft.com/office/drawing/2016/5/12/chartex" xmlns:cx7="http://schemas.microsoft.com/office/drawing/2016/5/13/chartex" xmlns:cx8="http://schemas.microsoft.com/office/drawing/2016/5/14/chartex" xmlns:mc="http://schemas.openxmlformats.org/markup-compatibility/2006" xmlns:aink="http://schemas.microsoft.com/office/drawing/2016/ink" xmlns:am3d="http://schemas.microsoft.com/office/drawing/2017/model3d" xmlns:o="urn:schemas-microsoft-com:office:office" xmlns:oel="http://schemas.microsoft.com/office/2019/extlst" xmlns:r="http://schemas.openxmlformats.org/officeDocument/2006/relationships" xmlns:m="http://schemas.openxmlformats.org/officeDocument/2006/math" xmlns:v="urn:schemas-microsoft-com:vml" xmlns:wp14="http://schemas.microsoft.com/office/word/2010/wordprocessingDrawing" xmlns:wp="http://schemas.openxmlformats.org/drawingml/2006/wordprocessingDrawing" xmlns:w10="urn:schemas-microsoft-com:office:word" xmlns:w="http://schemas.openxmlformats.org/wordprocessingml/2006/main" xmlns:w14="http://schemas.microsoft.com/office/word/2010/wordml" xmlns:w15="http://schemas.microsoft.com/office/word/2012/wordml" xmlns:w16cex="http://schemas.microsoft.com/office/word/2018/wordml/cex" xmlns:w16cid="http://schemas.microsoft.com/office/word/2016/wordml/cid" xmlns:w16="http://schemas.microsoft.com/office/word/2018/wordml" xmlns:w16sdtdh="http://schemas.microsoft.com/office/word/2020/wordml/sdtdatahash" xmlns:w16se="http://schemas.microsoft.com/office/word/2015/wordml/symex" xmlns:wpg="http://schemas.microsoft.com/office/word/2010/wordprocessingGroup" xmlns:wpi="http://schemas.microsoft.com/office/word/2010/wordprocessingInk" xmlns:wne="http://schemas.microsoft.com/office/word/2006/wordml" xmlns:wps="http://schemas.microsoft.com/office/word/2010/wordprocessingShape" mc:Ignorable="w14 w15 w16se w16cid w16 w16cex w16sdtdh wp14">
+<w16cid:commentsIds xmlns:wpc="http://schemas.microsoft.com/office/word/2010/wordprocessingCanvas" xmlns:cx="http://schemas.microsoft.com/office/drawing/2014/chartex" xmlns:cx1="http://schemas.microsoft.com/office/drawing/2015/9/8/chartex" xmlns:cx2="http://schemas.microsoft.com/office/drawing/2015/10/21/chartex" xmlns:cx3="http://schemas.microsoft.com/office/drawing/2016/5/9/chartex" xmlns:cx4="http://schemas.microsoft.com/office/drawing/2016/5/10/chartex" xmlns:cx5="http://schemas.microsoft.com/office/drawing/2016/5/11/chartex" xmlns:cx6="http://schemas.microsoft.com/office/drawing/2016/5/12/chartex" xmlns:cx7="http://schemas.microsoft.com/office/drawing/2016/5/13/chartex" xmlns:cx8="http://schemas.microsoft.com/office/drawing/2016/5/14/chartex" xmlns:mc="http://schemas.openxmlformats.org/markup-compatibility/2006" xmlns:aink="http://schemas.microsoft.com/office/drawing/2016/ink" xmlns:am3d="http://schemas.microsoft.com/office/drawing/2017/model3d" xmlns:o="urn:schemas-microsoft-com:office:office" xmlns:r="http://schemas.openxmlformats.org/officeDocument/2006/relationships" xmlns:m="http://schemas.openxmlformats.org/officeDocument/2006/math" xmlns:v="urn:schemas-microsoft-com:vml" xmlns:wp14="http://schemas.microsoft.com/office/word/2010/wordprocessingDrawing" xmlns:wp="http://schemas.openxmlformats.org/drawingml/2006/wordprocessingDrawing" xmlns:w10="urn:schemas-microsoft-com:office:word" xmlns:w="http://schemas.openxmlformats.org/wordprocessingml/2006/main" xmlns:w14="http://schemas.microsoft.com/office/word/2010/wordml" xmlns:w15="http://schemas.microsoft.com/office/word/2012/wordml" xmlns:w16cid="http://schemas.microsoft.com/office/word/2016/wordml/cid" xmlns:w16se="http://schemas.microsoft.com/office/word/2015/wordml/symex" xmlns:wpg="http://schemas.microsoft.com/office/word/2010/wordprocessingGroup" xmlns:wpi="http://schemas.microsoft.com/office/word/2010/wordprocessingInk" xmlns:wne="http://schemas.microsoft.com/office/word/2006/wordml" xmlns:wps="http://schemas.microsoft.com/office/word/2010/wordprocessingShape" mc:Ignorable="w14 w15 w16se w16cid wp14">
   <w16cid:commentId w16cid:paraId="5702E993" w16cid:durableId="05CF9F81"/>
   <w16cid:commentId w16cid:paraId="5A30AF7E" w16cid:durableId="71BA8FA2"/>
   <w16cid:commentId w16cid:paraId="093A1822" w16cid:durableId="50888A36"/>
@@ -39662,7 +38640,7 @@
 </file>
 
 <file path=word/endnotes.xml><?xml version="1.0" encoding="utf-8"?>
-<w:endnotes xmlns:wpc="http://schemas.microsoft.com/office/word/2010/wordprocessingCanvas" xmlns:cx="http://schemas.microsoft.com/office/drawing/2014/chartex" xmlns:cx1="http://schemas.microsoft.com/office/drawing/2015/9/8/chartex" xmlns:cx2="http://schemas.microsoft.com/office/drawing/2015/10/21/chartex" xmlns:cx3="http://schemas.microsoft.com/office/drawing/2016/5/9/chartex" xmlns:cx4="http://schemas.microsoft.com/office/drawing/2016/5/10/chartex" xmlns:cx5="http://schemas.microsoft.com/office/drawing/2016/5/11/chartex" xmlns:cx6="http://schemas.microsoft.com/office/drawing/2016/5/12/chartex" xmlns:cx7="http://schemas.microsoft.com/office/drawing/2016/5/13/chartex" xmlns:cx8="http://schemas.microsoft.com/office/drawing/2016/5/14/chartex" xmlns:mc="http://schemas.openxmlformats.org/markup-compatibility/2006" xmlns:aink="http://schemas.microsoft.com/office/drawing/2016/ink" xmlns:am3d="http://schemas.microsoft.com/office/drawing/2017/model3d" xmlns:o="urn:schemas-microsoft-com:office:office" xmlns:oel="http://schemas.microsoft.com/office/2019/extlst" xmlns:r="http://schemas.openxmlformats.org/officeDocument/2006/relationships" xmlns:m="http://schemas.openxmlformats.org/officeDocument/2006/math" xmlns:v="urn:schemas-microsoft-com:vml" xmlns:wp14="http://schemas.microsoft.com/office/word/2010/wordprocessingDrawing" xmlns:wp="http://schemas.openxmlformats.org/drawingml/2006/wordprocessingDrawing" xmlns:w10="urn:schemas-microsoft-com:office:word" xmlns:w="http://schemas.openxmlformats.org/wordprocessingml/2006/main" xmlns:w14="http://schemas.microsoft.com/office/word/2010/wordml" xmlns:w15="http://schemas.microsoft.com/office/word/2012/wordml" xmlns:w16cex="http://schemas.microsoft.com/office/word/2018/wordml/cex" xmlns:w16cid="http://schemas.microsoft.com/office/word/2016/wordml/cid" xmlns:w16="http://schemas.microsoft.com/office/word/2018/wordml" xmlns:w16sdtdh="http://schemas.microsoft.com/office/word/2020/wordml/sdtdatahash" xmlns:w16se="http://schemas.microsoft.com/office/word/2015/wordml/symex" xmlns:wpg="http://schemas.microsoft.com/office/word/2010/wordprocessingGroup" xmlns:wpi="http://schemas.microsoft.com/office/word/2010/wordprocessingInk" xmlns:wne="http://schemas.microsoft.com/office/word/2006/wordml" xmlns:wps="http://schemas.microsoft.com/office/word/2010/wordprocessingShape" mc:Ignorable="w14 w15 w16se w16cid w16 w16cex w16sdtdh wp14">
+<w:endnotes xmlns:wpc="http://schemas.microsoft.com/office/word/2010/wordprocessingCanvas" xmlns:cx="http://schemas.microsoft.com/office/drawing/2014/chartex" xmlns:cx1="http://schemas.microsoft.com/office/drawing/2015/9/8/chartex" xmlns:cx2="http://schemas.microsoft.com/office/drawing/2015/10/21/chartex" xmlns:cx3="http://schemas.microsoft.com/office/drawing/2016/5/9/chartex" xmlns:cx4="http://schemas.microsoft.com/office/drawing/2016/5/10/chartex" xmlns:cx5="http://schemas.microsoft.com/office/drawing/2016/5/11/chartex" xmlns:cx6="http://schemas.microsoft.com/office/drawing/2016/5/12/chartex" xmlns:cx7="http://schemas.microsoft.com/office/drawing/2016/5/13/chartex" xmlns:cx8="http://schemas.microsoft.com/office/drawing/2016/5/14/chartex" xmlns:mc="http://schemas.openxmlformats.org/markup-compatibility/2006" xmlns:aink="http://schemas.microsoft.com/office/drawing/2016/ink" xmlns:am3d="http://schemas.microsoft.com/office/drawing/2017/model3d" xmlns:o="urn:schemas-microsoft-com:office:office" xmlns:r="http://schemas.openxmlformats.org/officeDocument/2006/relationships" xmlns:m="http://schemas.openxmlformats.org/officeDocument/2006/math" xmlns:v="urn:schemas-microsoft-com:vml" xmlns:wp14="http://schemas.microsoft.com/office/word/2010/wordprocessingDrawing" xmlns:wp="http://schemas.openxmlformats.org/drawingml/2006/wordprocessingDrawing" xmlns:w10="urn:schemas-microsoft-com:office:word" xmlns:w="http://schemas.openxmlformats.org/wordprocessingml/2006/main" xmlns:w14="http://schemas.microsoft.com/office/word/2010/wordml" xmlns:w15="http://schemas.microsoft.com/office/word/2012/wordml" xmlns:w16cid="http://schemas.microsoft.com/office/word/2016/wordml/cid" xmlns:w16se="http://schemas.microsoft.com/office/word/2015/wordml/symex" xmlns:wpg="http://schemas.microsoft.com/office/word/2010/wordprocessingGroup" xmlns:wpi="http://schemas.microsoft.com/office/word/2010/wordprocessingInk" xmlns:wne="http://schemas.microsoft.com/office/word/2006/wordml" xmlns:wps="http://schemas.microsoft.com/office/word/2010/wordprocessingShape" mc:Ignorable="w14 w15 w16se w16cid wp14">
   <w:endnote w:type="separator" w:id="-1">
     <w:p>
       <w:r>
@@ -39681,7 +38659,7 @@
 </file>
 
 <file path=word/footer1.xml><?xml version="1.0" encoding="utf-8"?>
-<w:ftr xmlns:wpc="http://schemas.microsoft.com/office/word/2010/wordprocessingCanvas" xmlns:cx="http://schemas.microsoft.com/office/drawing/2014/chartex" xmlns:cx1="http://schemas.microsoft.com/office/drawing/2015/9/8/chartex" xmlns:cx2="http://schemas.microsoft.com/office/drawing/2015/10/21/chartex" xmlns:cx3="http://schemas.microsoft.com/office/drawing/2016/5/9/chartex" xmlns:cx4="http://schemas.microsoft.com/office/drawing/2016/5/10/chartex" xmlns:cx5="http://schemas.microsoft.com/office/drawing/2016/5/11/chartex" xmlns:cx6="http://schemas.microsoft.com/office/drawing/2016/5/12/chartex" xmlns:cx7="http://schemas.microsoft.com/office/drawing/2016/5/13/chartex" xmlns:cx8="http://schemas.microsoft.com/office/drawing/2016/5/14/chartex" xmlns:mc="http://schemas.openxmlformats.org/markup-compatibility/2006" xmlns:aink="http://schemas.microsoft.com/office/drawing/2016/ink" xmlns:am3d="http://schemas.microsoft.com/office/drawing/2017/model3d" xmlns:o="urn:schemas-microsoft-com:office:office" xmlns:oel="http://schemas.microsoft.com/office/2019/extlst" xmlns:r="http://schemas.openxmlformats.org/officeDocument/2006/relationships" xmlns:m="http://schemas.openxmlformats.org/officeDocument/2006/math" xmlns:v="urn:schemas-microsoft-com:vml" xmlns:wp14="http://schemas.microsoft.com/office/word/2010/wordprocessingDrawing" xmlns:wp="http://schemas.openxmlformats.org/drawingml/2006/wordprocessingDrawing" xmlns:w10="urn:schemas-microsoft-com:office:word" xmlns:w="http://schemas.openxmlformats.org/wordprocessingml/2006/main" xmlns:w14="http://schemas.microsoft.com/office/word/2010/wordml" xmlns:w15="http://schemas.microsoft.com/office/word/2012/wordml" xmlns:w16cex="http://schemas.microsoft.com/office/word/2018/wordml/cex" xmlns:w16cid="http://schemas.microsoft.com/office/word/2016/wordml/cid" xmlns:w16="http://schemas.microsoft.com/office/word/2018/wordml" xmlns:w16sdtdh="http://schemas.microsoft.com/office/word/2020/wordml/sdtdatahash" xmlns:w16se="http://schemas.microsoft.com/office/word/2015/wordml/symex" xmlns:wpg="http://schemas.microsoft.com/office/word/2010/wordprocessingGroup" xmlns:wpi="http://schemas.microsoft.com/office/word/2010/wordprocessingInk" xmlns:wne="http://schemas.microsoft.com/office/word/2006/wordml" xmlns:wps="http://schemas.microsoft.com/office/word/2010/wordprocessingShape" mc:Ignorable="w14 w15 w16se w16cid w16 w16cex w16sdtdh wp14">
+<w:ftr xmlns:wpc="http://schemas.microsoft.com/office/word/2010/wordprocessingCanvas" xmlns:cx="http://schemas.microsoft.com/office/drawing/2014/chartex" xmlns:cx1="http://schemas.microsoft.com/office/drawing/2015/9/8/chartex" xmlns:cx2="http://schemas.microsoft.com/office/drawing/2015/10/21/chartex" xmlns:cx3="http://schemas.microsoft.com/office/drawing/2016/5/9/chartex" xmlns:cx4="http://schemas.microsoft.com/office/drawing/2016/5/10/chartex" xmlns:cx5="http://schemas.microsoft.com/office/drawing/2016/5/11/chartex" xmlns:cx6="http://schemas.microsoft.com/office/drawing/2016/5/12/chartex" xmlns:cx7="http://schemas.microsoft.com/office/drawing/2016/5/13/chartex" xmlns:cx8="http://schemas.microsoft.com/office/drawing/2016/5/14/chartex" xmlns:mc="http://schemas.openxmlformats.org/markup-compatibility/2006" xmlns:aink="http://schemas.microsoft.com/office/drawing/2016/ink" xmlns:am3d="http://schemas.microsoft.com/office/drawing/2017/model3d" xmlns:o="urn:schemas-microsoft-com:office:office" xmlns:r="http://schemas.openxmlformats.org/officeDocument/2006/relationships" xmlns:m="http://schemas.openxmlformats.org/officeDocument/2006/math" xmlns:v="urn:schemas-microsoft-com:vml" xmlns:wp14="http://schemas.microsoft.com/office/word/2010/wordprocessingDrawing" xmlns:wp="http://schemas.openxmlformats.org/drawingml/2006/wordprocessingDrawing" xmlns:w10="urn:schemas-microsoft-com:office:word" xmlns:w="http://schemas.openxmlformats.org/wordprocessingml/2006/main" xmlns:w14="http://schemas.microsoft.com/office/word/2010/wordml" xmlns:w15="http://schemas.microsoft.com/office/word/2012/wordml" xmlns:w16cid="http://schemas.microsoft.com/office/word/2016/wordml/cid" xmlns:w16se="http://schemas.microsoft.com/office/word/2015/wordml/symex" xmlns:wpg="http://schemas.microsoft.com/office/word/2010/wordprocessingGroup" xmlns:wpi="http://schemas.microsoft.com/office/word/2010/wordprocessingInk" xmlns:wne="http://schemas.microsoft.com/office/word/2006/wordml" xmlns:wps="http://schemas.microsoft.com/office/word/2010/wordprocessingShape" mc:Ignorable="w14 w15 w16se w16cid wp14">
   <w:p>
     <w:pPr>
       <w:pStyle w:val="aff1"/>
@@ -39704,7 +38682,7 @@
 </file>
 
 <file path=word/footnotes.xml><?xml version="1.0" encoding="utf-8"?>
-<w:footnotes xmlns:wpc="http://schemas.microsoft.com/office/word/2010/wordprocessingCanvas" xmlns:cx="http://schemas.microsoft.com/office/drawing/2014/chartex" xmlns:cx1="http://schemas.microsoft.com/office/drawing/2015/9/8/chartex" xmlns:cx2="http://schemas.microsoft.com/office/drawing/2015/10/21/chartex" xmlns:cx3="http://schemas.microsoft.com/office/drawing/2016/5/9/chartex" xmlns:cx4="http://schemas.microsoft.com/office/drawing/2016/5/10/chartex" xmlns:cx5="http://schemas.microsoft.com/office/drawing/2016/5/11/chartex" xmlns:cx6="http://schemas.microsoft.com/office/drawing/2016/5/12/chartex" xmlns:cx7="http://schemas.microsoft.com/office/drawing/2016/5/13/chartex" xmlns:cx8="http://schemas.microsoft.com/office/drawing/2016/5/14/chartex" xmlns:mc="http://schemas.openxmlformats.org/markup-compatibility/2006" xmlns:aink="http://schemas.microsoft.com/office/drawing/2016/ink" xmlns:am3d="http://schemas.microsoft.com/office/drawing/2017/model3d" xmlns:o="urn:schemas-microsoft-com:office:office" xmlns:oel="http://schemas.microsoft.com/office/2019/extlst" xmlns:r="http://schemas.openxmlformats.org/officeDocument/2006/relationships" xmlns:m="http://schemas.openxmlformats.org/officeDocument/2006/math" xmlns:v="urn:schemas-microsoft-com:vml" xmlns:wp14="http://schemas.microsoft.com/office/word/2010/wordprocessingDrawing" xmlns:wp="http://schemas.openxmlformats.org/drawingml/2006/wordprocessingDrawing" xmlns:w10="urn:schemas-microsoft-com:office:word" xmlns:w="http://schemas.openxmlformats.org/wordprocessingml/2006/main" xmlns:w14="http://schemas.microsoft.com/office/word/2010/wordml" xmlns:w15="http://schemas.microsoft.com/office/word/2012/wordml" xmlns:w16cex="http://schemas.microsoft.com/office/word/2018/wordml/cex" xmlns:w16cid="http://schemas.microsoft.com/office/word/2016/wordml/cid" xmlns:w16="http://schemas.microsoft.com/office/word/2018/wordml" xmlns:w16sdtdh="http://schemas.microsoft.com/office/word/2020/wordml/sdtdatahash" xmlns:w16se="http://schemas.microsoft.com/office/word/2015/wordml/symex" xmlns:wpg="http://schemas.microsoft.com/office/word/2010/wordprocessingGroup" xmlns:wpi="http://schemas.microsoft.com/office/word/2010/wordprocessingInk" xmlns:wne="http://schemas.microsoft.com/office/word/2006/wordml" xmlns:wps="http://schemas.microsoft.com/office/word/2010/wordprocessingShape" mc:Ignorable="w14 w15 w16se w16cid w16 w16cex w16sdtdh wp14">
+<w:footnotes xmlns:wpc="http://schemas.microsoft.com/office/word/2010/wordprocessingCanvas" xmlns:cx="http://schemas.microsoft.com/office/drawing/2014/chartex" xmlns:cx1="http://schemas.microsoft.com/office/drawing/2015/9/8/chartex" xmlns:cx2="http://schemas.microsoft.com/office/drawing/2015/10/21/chartex" xmlns:cx3="http://schemas.microsoft.com/office/drawing/2016/5/9/chartex" xmlns:cx4="http://schemas.microsoft.com/office/drawing/2016/5/10/chartex" xmlns:cx5="http://schemas.microsoft.com/office/drawing/2016/5/11/chartex" xmlns:cx6="http://schemas.microsoft.com/office/drawing/2016/5/12/chartex" xmlns:cx7="http://schemas.microsoft.com/office/drawing/2016/5/13/chartex" xmlns:cx8="http://schemas.microsoft.com/office/drawing/2016/5/14/chartex" xmlns:mc="http://schemas.openxmlformats.org/markup-compatibility/2006" xmlns:aink="http://schemas.microsoft.com/office/drawing/2016/ink" xmlns:am3d="http://schemas.microsoft.com/office/drawing/2017/model3d" xmlns:o="urn:schemas-microsoft-com:office:office" xmlns:r="http://schemas.openxmlformats.org/officeDocument/2006/relationships" xmlns:m="http://schemas.openxmlformats.org/officeDocument/2006/math" xmlns:v="urn:schemas-microsoft-com:vml" xmlns:wp14="http://schemas.microsoft.com/office/word/2010/wordprocessingDrawing" xmlns:wp="http://schemas.openxmlformats.org/drawingml/2006/wordprocessingDrawing" xmlns:w10="urn:schemas-microsoft-com:office:word" xmlns:w="http://schemas.openxmlformats.org/wordprocessingml/2006/main" xmlns:w14="http://schemas.microsoft.com/office/word/2010/wordml" xmlns:w15="http://schemas.microsoft.com/office/word/2012/wordml" xmlns:w16cid="http://schemas.microsoft.com/office/word/2016/wordml/cid" xmlns:w16se="http://schemas.microsoft.com/office/word/2015/wordml/symex" xmlns:wpg="http://schemas.microsoft.com/office/word/2010/wordprocessingGroup" xmlns:wpi="http://schemas.microsoft.com/office/word/2010/wordprocessingInk" xmlns:wne="http://schemas.microsoft.com/office/word/2006/wordml" xmlns:wps="http://schemas.microsoft.com/office/word/2010/wordprocessingShape" mc:Ignorable="w14 w15 w16se w16cid wp14">
   <w:footnote w:type="separator" w:id="-1">
     <w:p>
       <w:r>
@@ -39723,7 +38701,7 @@
 </file>
 
 <file path=word/numbering.xml><?xml version="1.0" encoding="utf-8"?>
-<w:numbering xmlns:wpc="http://schemas.microsoft.com/office/word/2010/wordprocessingCanvas" xmlns:cx="http://schemas.microsoft.com/office/drawing/2014/chartex" xmlns:cx1="http://schemas.microsoft.com/office/drawing/2015/9/8/chartex" xmlns:cx2="http://schemas.microsoft.com/office/drawing/2015/10/21/chartex" xmlns:cx3="http://schemas.microsoft.com/office/drawing/2016/5/9/chartex" xmlns:cx4="http://schemas.microsoft.com/office/drawing/2016/5/10/chartex" xmlns:cx5="http://schemas.microsoft.com/office/drawing/2016/5/11/chartex" xmlns:cx6="http://schemas.microsoft.com/office/drawing/2016/5/12/chartex" xmlns:cx7="http://schemas.microsoft.com/office/drawing/2016/5/13/chartex" xmlns:cx8="http://schemas.microsoft.com/office/drawing/2016/5/14/chartex" xmlns:mc="http://schemas.openxmlformats.org/markup-compatibility/2006" xmlns:aink="http://schemas.microsoft.com/office/drawing/2016/ink" xmlns:am3d="http://schemas.microsoft.com/office/drawing/2017/model3d" xmlns:o="urn:schemas-microsoft-com:office:office" xmlns:oel="http://schemas.microsoft.com/office/2019/extlst" xmlns:r="http://schemas.openxmlformats.org/officeDocument/2006/relationships" xmlns:m="http://schemas.openxmlformats.org/officeDocument/2006/math" xmlns:v="urn:schemas-microsoft-com:vml" xmlns:wp14="http://schemas.microsoft.com/office/word/2010/wordprocessingDrawing" xmlns:wp="http://schemas.openxmlformats.org/drawingml/2006/wordprocessingDrawing" xmlns:w10="urn:schemas-microsoft-com:office:word" xmlns:w="http://schemas.openxmlformats.org/wordprocessingml/2006/main" xmlns:w14="http://schemas.microsoft.com/office/word/2010/wordml" xmlns:w15="http://schemas.microsoft.com/office/word/2012/wordml" xmlns:w16cex="http://schemas.microsoft.com/office/word/2018/wordml/cex" xmlns:w16cid="http://schemas.microsoft.com/office/word/2016/wordml/cid" xmlns:w16="http://schemas.microsoft.com/office/word/2018/wordml" xmlns:w16sdtdh="http://schemas.microsoft.com/office/word/2020/wordml/sdtdatahash" xmlns:w16se="http://schemas.microsoft.com/office/word/2015/wordml/symex" xmlns:wpg="http://schemas.microsoft.com/office/word/2010/wordprocessingGroup" xmlns:wpi="http://schemas.microsoft.com/office/word/2010/wordprocessingInk" xmlns:wne="http://schemas.microsoft.com/office/word/2006/wordml" xmlns:wps="http://schemas.microsoft.com/office/word/2010/wordprocessingShape" mc:Ignorable="w14 w15 w16se w16cid w16 w16cex w16sdtdh wp14">
+<w:numbering xmlns:wpc="http://schemas.microsoft.com/office/word/2010/wordprocessingCanvas" xmlns:cx="http://schemas.microsoft.com/office/drawing/2014/chartex" xmlns:cx1="http://schemas.microsoft.com/office/drawing/2015/9/8/chartex" xmlns:cx2="http://schemas.microsoft.com/office/drawing/2015/10/21/chartex" xmlns:cx3="http://schemas.microsoft.com/office/drawing/2016/5/9/chartex" xmlns:cx4="http://schemas.microsoft.com/office/drawing/2016/5/10/chartex" xmlns:cx5="http://schemas.microsoft.com/office/drawing/2016/5/11/chartex" xmlns:cx6="http://schemas.microsoft.com/office/drawing/2016/5/12/chartex" xmlns:cx7="http://schemas.microsoft.com/office/drawing/2016/5/13/chartex" xmlns:cx8="http://schemas.microsoft.com/office/drawing/2016/5/14/chartex" xmlns:mc="http://schemas.openxmlformats.org/markup-compatibility/2006" xmlns:aink="http://schemas.microsoft.com/office/drawing/2016/ink" xmlns:am3d="http://schemas.microsoft.com/office/drawing/2017/model3d" xmlns:o="urn:schemas-microsoft-com:office:office" xmlns:r="http://schemas.openxmlformats.org/officeDocument/2006/relationships" xmlns:m="http://schemas.openxmlformats.org/officeDocument/2006/math" xmlns:v="urn:schemas-microsoft-com:vml" xmlns:wp14="http://schemas.microsoft.com/office/word/2010/wordprocessingDrawing" xmlns:wp="http://schemas.openxmlformats.org/drawingml/2006/wordprocessingDrawing" xmlns:w10="urn:schemas-microsoft-com:office:word" xmlns:w="http://schemas.openxmlformats.org/wordprocessingml/2006/main" xmlns:w14="http://schemas.microsoft.com/office/word/2010/wordml" xmlns:w15="http://schemas.microsoft.com/office/word/2012/wordml" xmlns:w16cid="http://schemas.microsoft.com/office/word/2016/wordml/cid" xmlns:w16se="http://schemas.microsoft.com/office/word/2015/wordml/symex" xmlns:wpg="http://schemas.microsoft.com/office/word/2010/wordprocessingGroup" xmlns:wpi="http://schemas.microsoft.com/office/word/2010/wordprocessingInk" xmlns:wne="http://schemas.microsoft.com/office/word/2006/wordml" xmlns:wps="http://schemas.microsoft.com/office/word/2010/wordprocessingShape" mc:Ignorable="w14 w15 w16se w16cid wp14">
   <w:abstractNum w:abstractNumId="0" w15:restartNumberingAfterBreak="0">
     <w:nsid w:val="FFFFFF7F"/>
     <w:multiLevelType w:val="singleLevel"/>
@@ -43171,25 +42149,25 @@
       </w:rPr>
     </w:lvl>
   </w:abstractNum>
-  <w:num w:numId="1" w16cid:durableId="1795513655">
+  <w:num w:numId="1">
     <w:abstractNumId w:val="18"/>
   </w:num>
-  <w:num w:numId="2" w16cid:durableId="1157963784">
+  <w:num w:numId="2">
     <w:abstractNumId w:val="26"/>
   </w:num>
-  <w:num w:numId="3" w16cid:durableId="1662811864">
+  <w:num w:numId="3">
     <w:abstractNumId w:val="6"/>
   </w:num>
-  <w:num w:numId="4" w16cid:durableId="1885748422">
+  <w:num w:numId="4">
     <w:abstractNumId w:val="13"/>
   </w:num>
-  <w:num w:numId="5" w16cid:durableId="1234926264">
+  <w:num w:numId="5">
     <w:abstractNumId w:val="22"/>
   </w:num>
-  <w:num w:numId="6" w16cid:durableId="1411266523">
+  <w:num w:numId="6">
     <w:abstractNumId w:val="10"/>
   </w:num>
-  <w:num w:numId="7" w16cid:durableId="682171098">
+  <w:num w:numId="7">
     <w:abstractNumId w:val="10"/>
     <w:lvlOverride w:ilvl="0">
       <w:startOverride w:val="1"/>
@@ -43219,16 +42197,16 @@
       <w:startOverride w:val="1"/>
     </w:lvlOverride>
   </w:num>
-  <w:num w:numId="8" w16cid:durableId="814880121">
+  <w:num w:numId="8">
     <w:abstractNumId w:val="5"/>
   </w:num>
-  <w:num w:numId="9" w16cid:durableId="1548563162">
+  <w:num w:numId="9">
     <w:abstractNumId w:val="9"/>
   </w:num>
-  <w:num w:numId="10" w16cid:durableId="47414736">
+  <w:num w:numId="10">
     <w:abstractNumId w:val="17"/>
   </w:num>
-  <w:num w:numId="11" w16cid:durableId="1632785537">
+  <w:num w:numId="11">
     <w:abstractNumId w:val="10"/>
     <w:lvlOverride w:ilvl="0">
       <w:startOverride w:val="1"/>
@@ -43258,13 +42236,13 @@
       <w:startOverride w:val="1"/>
     </w:lvlOverride>
   </w:num>
-  <w:num w:numId="12" w16cid:durableId="1262183630">
+  <w:num w:numId="12">
     <w:abstractNumId w:val="7"/>
   </w:num>
-  <w:num w:numId="13" w16cid:durableId="959871307">
+  <w:num w:numId="13">
     <w:abstractNumId w:val="14"/>
   </w:num>
-  <w:num w:numId="14" w16cid:durableId="1711302209">
+  <w:num w:numId="14">
     <w:abstractNumId w:val="10"/>
     <w:lvlOverride w:ilvl="0">
       <w:startOverride w:val="1"/>
@@ -43294,28 +42272,28 @@
       <w:startOverride w:val="1"/>
     </w:lvlOverride>
   </w:num>
-  <w:num w:numId="15" w16cid:durableId="801926101">
+  <w:num w:numId="15">
     <w:abstractNumId w:val="2"/>
   </w:num>
-  <w:num w:numId="16" w16cid:durableId="992442279">
+  <w:num w:numId="16">
     <w:abstractNumId w:val="0"/>
   </w:num>
-  <w:num w:numId="17" w16cid:durableId="87235751">
+  <w:num w:numId="17">
     <w:abstractNumId w:val="1"/>
   </w:num>
-  <w:num w:numId="18" w16cid:durableId="938875585">
+  <w:num w:numId="18">
     <w:abstractNumId w:val="24"/>
   </w:num>
-  <w:num w:numId="19" w16cid:durableId="307830984">
+  <w:num w:numId="19">
     <w:abstractNumId w:val="20"/>
   </w:num>
-  <w:num w:numId="20" w16cid:durableId="389423445">
+  <w:num w:numId="20">
     <w:abstractNumId w:val="30"/>
   </w:num>
-  <w:num w:numId="21" w16cid:durableId="284317619">
+  <w:num w:numId="21">
     <w:abstractNumId w:val="8"/>
   </w:num>
-  <w:num w:numId="22" w16cid:durableId="1805853905">
+  <w:num w:numId="22">
     <w:abstractNumId w:val="10"/>
     <w:lvlOverride w:ilvl="0">
       <w:startOverride w:val="1"/>
@@ -43345,34 +42323,34 @@
       <w:startOverride w:val="1"/>
     </w:lvlOverride>
   </w:num>
-  <w:num w:numId="23" w16cid:durableId="1248228802">
+  <w:num w:numId="23">
     <w:abstractNumId w:val="29"/>
   </w:num>
-  <w:num w:numId="24" w16cid:durableId="1155610839">
+  <w:num w:numId="24">
     <w:abstractNumId w:val="21"/>
   </w:num>
-  <w:num w:numId="25" w16cid:durableId="1742754214">
+  <w:num w:numId="25">
     <w:abstractNumId w:val="25"/>
   </w:num>
-  <w:num w:numId="26" w16cid:durableId="1530990297">
+  <w:num w:numId="26">
     <w:abstractNumId w:val="12"/>
   </w:num>
-  <w:num w:numId="27" w16cid:durableId="854344602">
+  <w:num w:numId="27">
     <w:abstractNumId w:val="15"/>
   </w:num>
-  <w:num w:numId="28" w16cid:durableId="1217204397">
+  <w:num w:numId="28">
     <w:abstractNumId w:val="27"/>
   </w:num>
-  <w:num w:numId="29" w16cid:durableId="1427460161">
+  <w:num w:numId="29">
     <w:abstractNumId w:val="4"/>
   </w:num>
-  <w:num w:numId="30" w16cid:durableId="839545049">
+  <w:num w:numId="30">
     <w:abstractNumId w:val="3"/>
   </w:num>
-  <w:num w:numId="31" w16cid:durableId="1296107687">
+  <w:num w:numId="31">
     <w:abstractNumId w:val="19"/>
   </w:num>
-  <w:num w:numId="32" w16cid:durableId="1866359336">
+  <w:num w:numId="32">
     <w:abstractNumId w:val="10"/>
     <w:lvlOverride w:ilvl="0">
       <w:startOverride w:val="1"/>
@@ -43402,7 +42380,7 @@
       <w:startOverride w:val="1"/>
     </w:lvlOverride>
   </w:num>
-  <w:num w:numId="33" w16cid:durableId="921454869">
+  <w:num w:numId="33">
     <w:abstractNumId w:val="10"/>
     <w:lvlOverride w:ilvl="0">
       <w:startOverride w:val="1"/>
@@ -43432,10 +42410,10 @@
       <w:startOverride w:val="1"/>
     </w:lvlOverride>
   </w:num>
-  <w:num w:numId="34" w16cid:durableId="1330868082">
+  <w:num w:numId="34">
     <w:abstractNumId w:val="32"/>
   </w:num>
-  <w:num w:numId="35" w16cid:durableId="2034452960">
+  <w:num w:numId="35">
     <w:abstractNumId w:val="10"/>
     <w:lvlOverride w:ilvl="0">
       <w:startOverride w:val="1"/>
@@ -43465,7 +42443,7 @@
       <w:startOverride w:val="1"/>
     </w:lvlOverride>
   </w:num>
-  <w:num w:numId="36" w16cid:durableId="1716270818">
+  <w:num w:numId="36">
     <w:abstractNumId w:val="10"/>
     <w:lvlOverride w:ilvl="0">
       <w:startOverride w:val="1"/>
@@ -43495,10 +42473,10 @@
       <w:startOverride w:val="1"/>
     </w:lvlOverride>
   </w:num>
-  <w:num w:numId="37" w16cid:durableId="564678824">
+  <w:num w:numId="37">
     <w:abstractNumId w:val="23"/>
   </w:num>
-  <w:num w:numId="38" w16cid:durableId="1940523467">
+  <w:num w:numId="38">
     <w:abstractNumId w:val="10"/>
     <w:lvlOverride w:ilvl="0">
       <w:startOverride w:val="1"/>
@@ -43528,7 +42506,7 @@
       <w:startOverride w:val="1"/>
     </w:lvlOverride>
   </w:num>
-  <w:num w:numId="39" w16cid:durableId="641884422">
+  <w:num w:numId="39">
     <w:abstractNumId w:val="10"/>
     <w:lvlOverride w:ilvl="0">
       <w:startOverride w:val="1"/>
@@ -43558,10 +42536,10 @@
       <w:startOverride w:val="1"/>
     </w:lvlOverride>
   </w:num>
-  <w:num w:numId="40" w16cid:durableId="1059938072">
+  <w:num w:numId="40">
     <w:abstractNumId w:val="11"/>
   </w:num>
-  <w:num w:numId="41" w16cid:durableId="1561405414">
+  <w:num w:numId="41">
     <w:abstractNumId w:val="10"/>
     <w:lvlOverride w:ilvl="0">
       <w:startOverride w:val="1"/>
@@ -43591,7 +42569,7 @@
       <w:startOverride w:val="1"/>
     </w:lvlOverride>
   </w:num>
-  <w:num w:numId="42" w16cid:durableId="89397942">
+  <w:num w:numId="42">
     <w:abstractNumId w:val="10"/>
     <w:lvlOverride w:ilvl="0">
       <w:startOverride w:val="1"/>
@@ -43621,7 +42599,7 @@
       <w:startOverride w:val="1"/>
     </w:lvlOverride>
   </w:num>
-  <w:num w:numId="43" w16cid:durableId="1076167791">
+  <w:num w:numId="43">
     <w:abstractNumId w:val="10"/>
     <w:lvlOverride w:ilvl="0">
       <w:startOverride w:val="1"/>
@@ -43651,7 +42629,7 @@
       <w:startOverride w:val="1"/>
     </w:lvlOverride>
   </w:num>
-  <w:num w:numId="44" w16cid:durableId="570699606">
+  <w:num w:numId="44">
     <w:abstractNumId w:val="10"/>
     <w:lvlOverride w:ilvl="0">
       <w:startOverride w:val="1"/>
@@ -43681,7 +42659,7 @@
       <w:startOverride w:val="1"/>
     </w:lvlOverride>
   </w:num>
-  <w:num w:numId="45" w16cid:durableId="963849688">
+  <w:num w:numId="45">
     <w:abstractNumId w:val="10"/>
     <w:lvlOverride w:ilvl="0">
       <w:startOverride w:val="1"/>
@@ -43711,13 +42689,13 @@
       <w:startOverride w:val="1"/>
     </w:lvlOverride>
   </w:num>
-  <w:num w:numId="46" w16cid:durableId="1088312591">
+  <w:num w:numId="46">
     <w:abstractNumId w:val="10"/>
   </w:num>
-  <w:num w:numId="47" w16cid:durableId="909315584">
+  <w:num w:numId="47">
     <w:abstractNumId w:val="28"/>
   </w:num>
-  <w:num w:numId="48" w16cid:durableId="1524515401">
+  <w:num w:numId="48">
     <w:abstractNumId w:val="10"/>
     <w:lvlOverride w:ilvl="0">
       <w:startOverride w:val="1"/>
@@ -43747,10 +42725,10 @@
       <w:startOverride w:val="1"/>
     </w:lvlOverride>
   </w:num>
-  <w:num w:numId="49" w16cid:durableId="45032963">
+  <w:num w:numId="49">
     <w:abstractNumId w:val="16"/>
   </w:num>
-  <w:num w:numId="50" w16cid:durableId="614866786">
+  <w:num w:numId="50">
     <w:abstractNumId w:val="31"/>
   </w:num>
   <w:numIdMacAtCleanup w:val="12"/>
@@ -43758,7 +42736,7 @@
 </file>
 
 <file path=word/people.xml><?xml version="1.0" encoding="utf-8"?>
-<w15:people xmlns:wpc="http://schemas.microsoft.com/office/word/2010/wordprocessingCanvas" xmlns:cx="http://schemas.microsoft.com/office/drawing/2014/chartex" xmlns:cx1="http://schemas.microsoft.com/office/drawing/2015/9/8/chartex" xmlns:cx2="http://schemas.microsoft.com/office/drawing/2015/10/21/chartex" xmlns:cx3="http://schemas.microsoft.com/office/drawing/2016/5/9/chartex" xmlns:cx4="http://schemas.microsoft.com/office/drawing/2016/5/10/chartex" xmlns:cx5="http://schemas.microsoft.com/office/drawing/2016/5/11/chartex" xmlns:cx6="http://schemas.microsoft.com/office/drawing/2016/5/12/chartex" xmlns:cx7="http://schemas.microsoft.com/office/drawing/2016/5/13/chartex" xmlns:cx8="http://schemas.microsoft.com/office/drawing/2016/5/14/chartex" xmlns:mc="http://schemas.openxmlformats.org/markup-compatibility/2006" xmlns:aink="http://schemas.microsoft.com/office/drawing/2016/ink" xmlns:am3d="http://schemas.microsoft.com/office/drawing/2017/model3d" xmlns:o="urn:schemas-microsoft-com:office:office" xmlns:oel="http://schemas.microsoft.com/office/2019/extlst" xmlns:r="http://schemas.openxmlformats.org/officeDocument/2006/relationships" xmlns:m="http://schemas.openxmlformats.org/officeDocument/2006/math" xmlns:v="urn:schemas-microsoft-com:vml" xmlns:wp14="http://schemas.microsoft.com/office/word/2010/wordprocessingDrawing" xmlns:wp="http://schemas.openxmlformats.org/drawingml/2006/wordprocessingDrawing" xmlns:w10="urn:schemas-microsoft-com:office:word" xmlns:w="http://schemas.openxmlformats.org/wordprocessingml/2006/main" xmlns:w14="http://schemas.microsoft.com/office/word/2010/wordml" xmlns:w15="http://schemas.microsoft.com/office/word/2012/wordml" xmlns:w16cex="http://schemas.microsoft.com/office/word/2018/wordml/cex" xmlns:w16cid="http://schemas.microsoft.com/office/word/2016/wordml/cid" xmlns:w16="http://schemas.microsoft.com/office/word/2018/wordml" xmlns:w16sdtdh="http://schemas.microsoft.com/office/word/2020/wordml/sdtdatahash" xmlns:w16se="http://schemas.microsoft.com/office/word/2015/wordml/symex" xmlns:wpg="http://schemas.microsoft.com/office/word/2010/wordprocessingGroup" xmlns:wpi="http://schemas.microsoft.com/office/word/2010/wordprocessingInk" xmlns:wne="http://schemas.microsoft.com/office/word/2006/wordml" xmlns:wps="http://schemas.microsoft.com/office/word/2010/wordprocessingShape" mc:Ignorable="w14 w15 w16se w16cid w16 w16cex w16sdtdh wp14">
+<w15:people xmlns:wpc="http://schemas.microsoft.com/office/word/2010/wordprocessingCanvas" xmlns:cx="http://schemas.microsoft.com/office/drawing/2014/chartex" xmlns:cx1="http://schemas.microsoft.com/office/drawing/2015/9/8/chartex" xmlns:cx2="http://schemas.microsoft.com/office/drawing/2015/10/21/chartex" xmlns:cx3="http://schemas.microsoft.com/office/drawing/2016/5/9/chartex" xmlns:cx4="http://schemas.microsoft.com/office/drawing/2016/5/10/chartex" xmlns:cx5="http://schemas.microsoft.com/office/drawing/2016/5/11/chartex" xmlns:cx6="http://schemas.microsoft.com/office/drawing/2016/5/12/chartex" xmlns:cx7="http://schemas.microsoft.com/office/drawing/2016/5/13/chartex" xmlns:cx8="http://schemas.microsoft.com/office/drawing/2016/5/14/chartex" xmlns:mc="http://schemas.openxmlformats.org/markup-compatibility/2006" xmlns:aink="http://schemas.microsoft.com/office/drawing/2016/ink" xmlns:am3d="http://schemas.microsoft.com/office/drawing/2017/model3d" xmlns:o="urn:schemas-microsoft-com:office:office" xmlns:r="http://schemas.openxmlformats.org/officeDocument/2006/relationships" xmlns:m="http://schemas.openxmlformats.org/officeDocument/2006/math" xmlns:v="urn:schemas-microsoft-com:vml" xmlns:wp14="http://schemas.microsoft.com/office/word/2010/wordprocessingDrawing" xmlns:wp="http://schemas.openxmlformats.org/drawingml/2006/wordprocessingDrawing" xmlns:w10="urn:schemas-microsoft-com:office:word" xmlns:w="http://schemas.openxmlformats.org/wordprocessingml/2006/main" xmlns:w14="http://schemas.microsoft.com/office/word/2010/wordml" xmlns:w15="http://schemas.microsoft.com/office/word/2012/wordml" xmlns:w16cid="http://schemas.microsoft.com/office/word/2016/wordml/cid" xmlns:w16se="http://schemas.microsoft.com/office/word/2015/wordml/symex" xmlns:wpg="http://schemas.microsoft.com/office/word/2010/wordprocessingGroup" xmlns:wpi="http://schemas.microsoft.com/office/word/2010/wordprocessingInk" xmlns:wne="http://schemas.microsoft.com/office/word/2006/wordml" xmlns:wps="http://schemas.microsoft.com/office/word/2010/wordprocessingShape" mc:Ignorable="w14 w15 w16se w16cid wp14">
   <w15:person w15:author="Игорь Трусов">
     <w15:presenceInfo w15:providerId="None" w15:userId="Игорь Трусов"/>
   </w15:person>
@@ -43769,7 +42747,7 @@
 </file>
 
 <file path=word/styles.xml><?xml version="1.0" encoding="utf-8"?>
-<w:styles xmlns:mc="http://schemas.openxmlformats.org/markup-compatibility/2006" xmlns:r="http://schemas.openxmlformats.org/officeDocument/2006/relationships" xmlns:w="http://schemas.openxmlformats.org/wordprocessingml/2006/main" xmlns:w14="http://schemas.microsoft.com/office/word/2010/wordml" xmlns:w15="http://schemas.microsoft.com/office/word/2012/wordml" xmlns:w16cex="http://schemas.microsoft.com/office/word/2018/wordml/cex" xmlns:w16cid="http://schemas.microsoft.com/office/word/2016/wordml/cid" xmlns:w16="http://schemas.microsoft.com/office/word/2018/wordml" xmlns:w16sdtdh="http://schemas.microsoft.com/office/word/2020/wordml/sdtdatahash" xmlns:w16se="http://schemas.microsoft.com/office/word/2015/wordml/symex" mc:Ignorable="w14 w15 w16se w16cid w16 w16cex w16sdtdh">
+<w:styles xmlns:mc="http://schemas.openxmlformats.org/markup-compatibility/2006" xmlns:r="http://schemas.openxmlformats.org/officeDocument/2006/relationships" xmlns:w="http://schemas.openxmlformats.org/wordprocessingml/2006/main" xmlns:w14="http://schemas.microsoft.com/office/word/2010/wordml" xmlns:w15="http://schemas.microsoft.com/office/word/2012/wordml" xmlns:w16cid="http://schemas.microsoft.com/office/word/2016/wordml/cid" xmlns:w16se="http://schemas.microsoft.com/office/word/2015/wordml/symex" mc:Ignorable="w14 w15 w16se w16cid">
   <w:docDefaults>
     <w:rPrDefault>
       <w:rPr>
@@ -43785,7 +42763,7 @@
       </w:pPr>
     </w:pPrDefault>
   </w:docDefaults>
-  <w:latentStyles w:defLockedState="0" w:defUIPriority="99" w:defSemiHidden="0" w:defUnhideWhenUsed="0" w:defQFormat="0" w:count="376">
+  <w:latentStyles w:defLockedState="0" w:defUIPriority="99" w:defSemiHidden="0" w:defUnhideWhenUsed="0" w:defQFormat="0" w:count="375">
     <w:lsdException w:name="Normal" w:uiPriority="0" w:qFormat="1"/>
     <w:lsdException w:name="heading 1" w:uiPriority="11" w:qFormat="1"/>
     <w:lsdException w:name="heading 2" w:semiHidden="1" w:uiPriority="11" w:unhideWhenUsed="1" w:qFormat="1"/>
@@ -44161,7 +43139,6 @@
     <w:lsdException w:name="Smart Hyperlink" w:semiHidden="1" w:unhideWhenUsed="1"/>
     <w:lsdException w:name="Hashtag" w:semiHidden="1" w:unhideWhenUsed="1"/>
     <w:lsdException w:name="Unresolved Mention" w:semiHidden="1" w:unhideWhenUsed="1"/>
-    <w:lsdException w:name="Smart Link" w:semiHidden="1" w:unhideWhenUsed="1"/>
   </w:latentStyles>
   <w:style w:type="paragraph" w:default="1" w:styleId="a2">
     <w:name w:val="Normal"/>
@@ -46015,7 +44992,7 @@
 </file>
 
 <file path=customXml/itemProps1.xml><?xml version="1.0" encoding="utf-8"?>
-<ds:datastoreItem xmlns:ds="http://schemas.openxmlformats.org/officeDocument/2006/customXml" ds:itemID="{1FEFB057-C2F5-4FE1-A3B0-3FE5DCFB24CC}">
+<ds:datastoreItem xmlns:ds="http://schemas.openxmlformats.org/officeDocument/2006/customXml" ds:itemID="{10323BF7-35C6-4C7F-905F-D3D4424D43AF}">
   <ds:schemaRefs>
     <ds:schemaRef ds:uri="http://schemas.openxmlformats.org/officeDocument/2006/bibliography"/>
   </ds:schemaRefs>

</xml_diff>

<commit_message>
Update БТ_Диспетчеризация_ACTUAL.docx by [ @raz0reater_666 ](https://t.me/raz0reater_666)
</commit_message>
<xml_diff>
--- a/docs/БТ_Диспетчеризация_ACTUAL.docx
+++ b/docs/БТ_Диспетчеризация_ACTUAL.docx
@@ -196,11 +196,19 @@
               <w:rPr>
                 <w:b/>
                 <w:sz w:val="40"/>
-              </w:rPr>
-              <w:t>ааааааааааааа</w:t>
+                <w:lang w:val="en-US"/>
+              </w:rPr>
+              <w:t>3333333333333333</w:t>
             </w:r>
             <w:bookmarkStart w:id="3" w:name="_GoBack"/>
             <w:bookmarkEnd w:id="3"/>
+            <w:r>
+              <w:rPr>
+                <w:b/>
+                <w:sz w:val="40"/>
+              </w:rPr>
+              <w:t>а</w:t>
+            </w:r>
           </w:p>
         </w:tc>
       </w:tr>
@@ -7897,18 +7905,10 @@
       </w:r>
     </w:p>
     <w:p>
-      <w:pPr>
-        <w:rPr>
-          <w:lang w:val="en-US"/>
-        </w:rPr>
-      </w:pPr>
       <w:r>
         <w:t>Условно</w:t>
       </w:r>
       <w:r>
-        <w:rPr>
-          <w:lang w:val="en-US"/>
-        </w:rPr>
         <w:t>:</w:t>
       </w:r>
     </w:p>
@@ -7933,9 +7933,6 @@
         <w:adjustRightInd w:val="0"/>
       </w:pPr>
       <w:r>
-        <w:rPr>
-          <w:lang w:val="en-US"/>
-        </w:rPr>
         <w:tab/>
       </w:r>
       <w:r>
@@ -10571,11 +10568,7 @@
               <w:jc w:val="center"/>
             </w:pPr>
             <w:r>
-              <w:t xml:space="preserve">Это другой справочник, пользователь может выбрать при создании протокола доступный из него список </w:t>
-            </w:r>
-            <w:r>
-              <w:lastRenderedPageBreak/>
-              <w:t>на экране администрирования карточки</w:t>
+              <w:t>Это другой справочник, пользователь может выбрать при создании протокола доступный из него список на экране администрирования карточки</w:t>
             </w:r>
           </w:p>
         </w:tc>
@@ -10597,7 +10590,6 @@
                 <w:sz w:val="20"/>
                 <w:szCs w:val="20"/>
               </w:rPr>
-              <w:lastRenderedPageBreak/>
               <w:t>Тип действия</w:t>
             </w:r>
           </w:p>
@@ -10912,7 +10904,6 @@
           <w:rFonts w:eastAsia="Times New Roman"/>
           <w:highlight w:val="darkGray"/>
         </w:rPr>
-        <w:lastRenderedPageBreak/>
         <w:t>Шаблон шагов протокола</w:t>
       </w:r>
     </w:p>
@@ -11454,7 +11445,6 @@
         <w:pStyle w:val="22"/>
       </w:pPr>
       <w:r>
-        <w:lastRenderedPageBreak/>
         <w:t xml:space="preserve">Статусная модель </w:t>
       </w:r>
       <w:r>
@@ -14666,7 +14656,6 @@
           <w:bCs/>
           <w:szCs w:val="22"/>
         </w:rPr>
-        <w:lastRenderedPageBreak/>
         <w:t xml:space="preserve">Описание </w:t>
       </w:r>
       <w:r>
@@ -16713,7 +16702,6 @@
               <w:rPr>
                 <w:color w:val="000000"/>
               </w:rPr>
-              <w:lastRenderedPageBreak/>
               <w:t>Выполнить действие</w:t>
             </w:r>
           </w:p>
@@ -17986,7 +17974,6 @@
         <w:rPr>
           <w:rFonts w:eastAsia="Times New Roman"/>
         </w:rPr>
-        <w:lastRenderedPageBreak/>
         <w:t xml:space="preserve">Шаблон </w:t>
       </w:r>
       <w:r>
@@ -18729,7 +18716,6 @@
       </w:pPr>
       <w:bookmarkStart w:id="17" w:name="_Ref214876729"/>
       <w:r>
-        <w:lastRenderedPageBreak/>
         <w:t>Эскиз экрана</w:t>
       </w:r>
       <w:r>
@@ -19230,11 +19216,7 @@
               <w:jc w:val="center"/>
             </w:pPr>
             <w:r>
-              <w:t xml:space="preserve">Справочник объектов по уровню, сервисная таблица, сделает </w:t>
-            </w:r>
-            <w:r>
-              <w:lastRenderedPageBreak/>
-              <w:t xml:space="preserve">Алексей Булычев после того, как утвердим функциональную структуру объектов метро   </w:t>
+              <w:t xml:space="preserve">Справочник объектов по уровню, сервисная таблица, сделает Алексей Булычев после того, как утвердим функциональную структуру объектов метро   </w:t>
             </w:r>
           </w:p>
         </w:tc>
@@ -19256,7 +19238,6 @@
                 <w:sz w:val="20"/>
                 <w:szCs w:val="20"/>
               </w:rPr>
-              <w:lastRenderedPageBreak/>
               <w:t>Тип ННР</w:t>
             </w:r>
           </w:p>
@@ -20142,7 +20123,6 @@
         <w:rPr>
           <w:highlight w:val="darkGray"/>
         </w:rPr>
-        <w:lastRenderedPageBreak/>
         <w:t>Справочник типов ННР</w:t>
       </w:r>
       <w:bookmarkEnd w:id="19"/>
@@ -23249,7 +23229,6 @@
                 <w:sz w:val="20"/>
                 <w:szCs w:val="20"/>
               </w:rPr>
-              <w:lastRenderedPageBreak/>
               <w:t>47</w:t>
             </w:r>
           </w:p>
@@ -26435,7 +26414,6 @@
                 <w:sz w:val="20"/>
                 <w:szCs w:val="20"/>
               </w:rPr>
-              <w:lastRenderedPageBreak/>
               <w:t>100.22</w:t>
             </w:r>
           </w:p>
@@ -28745,7 +28723,6 @@
         <w:pStyle w:val="1"/>
       </w:pPr>
       <w:r>
-        <w:lastRenderedPageBreak/>
         <w:t xml:space="preserve">Организационная структура </w:t>
       </w:r>
       <w:r>
@@ -29943,7 +29920,6 @@
         </w:rPr>
       </w:pPr>
       <w:r>
-        <w:lastRenderedPageBreak/>
         <w:t>│</w:t>
       </w:r>
       <w:r>
@@ -30354,7 +30330,6 @@
         <w:pStyle w:val="30"/>
       </w:pPr>
       <w:r>
-        <w:lastRenderedPageBreak/>
         <w:t>Эскиз экрана</w:t>
       </w:r>
       <w:r>
@@ -30533,7 +30508,6 @@
         <w:rPr>
           <w:highlight w:val="darkGray"/>
         </w:rPr>
-        <w:lastRenderedPageBreak/>
         <w:t>Атрибуты карточки домена (организации 1-го уровня) блока администрирования организационной структуры функционального подчинения</w:t>
       </w:r>
     </w:p>
@@ -31395,7 +31369,6 @@
         <w:rPr>
           <w:highlight w:val="darkGray"/>
         </w:rPr>
-        <w:lastRenderedPageBreak/>
         <w:t>Справочник «ОПФ»</w:t>
       </w:r>
       <w:bookmarkEnd w:id="22"/>
@@ -32014,11 +31987,7 @@
               <w:spacing w:before="120" w:after="120"/>
             </w:pPr>
             <w:r>
-              <w:t xml:space="preserve">Участники несут солидарную ответственность </w:t>
-            </w:r>
-            <w:r>
-              <w:lastRenderedPageBreak/>
-              <w:t>всем имуществом.</w:t>
+              <w:t>Участники несут солидарную ответственность всем имуществом.</w:t>
             </w:r>
           </w:p>
         </w:tc>
@@ -32042,7 +32011,6 @@
               <w:spacing w:before="120" w:after="120"/>
             </w:pPr>
             <w:r>
-              <w:lastRenderedPageBreak/>
               <w:t>1 20 00</w:t>
             </w:r>
           </w:p>
@@ -32463,11 +32431,7 @@
               <w:spacing w:before="120" w:after="120"/>
             </w:pPr>
             <w:r>
-              <w:t>Уставный капитал разделён на акции; акционеры не отвечают по обязател</w:t>
-            </w:r>
-            <w:r>
-              <w:lastRenderedPageBreak/>
-              <w:t>ьствам общества.</w:t>
+              <w:t>Уставный капитал разделён на акции; акционеры не отвечают по обязательствам общества.</w:t>
             </w:r>
           </w:p>
         </w:tc>
@@ -32491,7 +32455,6 @@
               <w:spacing w:before="120" w:after="120"/>
             </w:pPr>
             <w:r>
-              <w:lastRenderedPageBreak/>
               <w:t>1 50 00</w:t>
             </w:r>
           </w:p>
@@ -32940,7 +32903,6 @@
                 <w:b/>
                 <w:bCs/>
               </w:rPr>
-              <w:lastRenderedPageBreak/>
               <w:t>2 00 00</w:t>
             </w:r>
           </w:p>
@@ -33385,7 +33347,6 @@
               <w:spacing w:before="120" w:after="120"/>
             </w:pPr>
             <w:r>
-              <w:lastRenderedPageBreak/>
               <w:t>2 30 00</w:t>
             </w:r>
           </w:p>
@@ -33982,7 +33943,6 @@
                 <w:b/>
                 <w:bCs/>
               </w:rPr>
-              <w:lastRenderedPageBreak/>
               <w:t>3 00 00</w:t>
             </w:r>
           </w:p>
@@ -34551,11 +34511,7 @@
               <w:spacing w:before="120" w:after="120"/>
             </w:pPr>
             <w:r>
-              <w:t xml:space="preserve">Договорное объединение для совместной деятельности без </w:t>
-            </w:r>
-            <w:r>
-              <w:lastRenderedPageBreak/>
-              <w:t>создания юрлица.</w:t>
+              <w:t>Договорное объединение для совместной деятельности без создания юрлица.</w:t>
             </w:r>
           </w:p>
         </w:tc>
@@ -34583,7 +34539,6 @@
                 <w:b/>
                 <w:bCs/>
               </w:rPr>
-              <w:lastRenderedPageBreak/>
               <w:t>4 00 00</w:t>
             </w:r>
           </w:p>
@@ -35180,7 +35135,6 @@
               <w:spacing w:before="120" w:after="120"/>
             </w:pPr>
             <w:r>
-              <w:lastRenderedPageBreak/>
               <w:t>5 10 00</w:t>
             </w:r>
           </w:p>
@@ -35777,7 +35731,6 @@
                 <w:b/>
                 <w:bCs/>
               </w:rPr>
-              <w:lastRenderedPageBreak/>
               <w:t>6 00 00</w:t>
             </w:r>
           </w:p>
@@ -36374,7 +36327,6 @@
               <w:spacing w:before="120" w:after="120"/>
             </w:pPr>
             <w:r>
-              <w:lastRenderedPageBreak/>
               <w:t>7 10 00</w:t>
             </w:r>
           </w:p>
@@ -36943,11 +36895,7 @@
               <w:spacing w:before="120" w:after="120"/>
             </w:pPr>
             <w:r>
-              <w:t>Создана для совместного исповедания и распрост</w:t>
-            </w:r>
-            <w:r>
-              <w:lastRenderedPageBreak/>
-              <w:t>ранения веры.</w:t>
+              <w:t>Создана для совместного исповедания и распространения веры.</w:t>
             </w:r>
           </w:p>
         </w:tc>
@@ -36971,7 +36919,6 @@
               <w:spacing w:before="120" w:after="120"/>
             </w:pPr>
             <w:r>
-              <w:lastRenderedPageBreak/>
               <w:t>7 50 00</w:t>
             </w:r>
           </w:p>
@@ -37621,7 +37568,6 @@
         <w:rPr>
           <w:highlight w:val="yellow"/>
         </w:rPr>
-        <w:lastRenderedPageBreak/>
         <w:t xml:space="preserve">Роль реагирования </w:t>
       </w:r>
     </w:p>
@@ -45007,7 +44953,7 @@
 </file>
 
 <file path=customXml/itemProps1.xml><?xml version="1.0" encoding="utf-8"?>
-<ds:datastoreItem xmlns:ds="http://schemas.openxmlformats.org/officeDocument/2006/customXml" ds:itemID="{8D6C4ACE-4640-4E93-A380-6E19629EE624}">
+<ds:datastoreItem xmlns:ds="http://schemas.openxmlformats.org/officeDocument/2006/customXml" ds:itemID="{AC3F8A3C-D545-49E4-BBD5-88AF6C760F12}">
   <ds:schemaRefs>
     <ds:schemaRef ds:uri="http://schemas.openxmlformats.org/officeDocument/2006/bibliography"/>
   </ds:schemaRefs>

</xml_diff>